<commit_message>
Update BRD to v4.0 and TDD to v2.0 — Playwright + Claude Vision architecture
- BRD v4.0: reflects browser automation approach, hard column rules (RULE-01–05), column F as read-only user input
- TDD v2.0: complete redesign documenting lark_writer hard allowlist, vision_extract, browser_reader, processor, run.py pipeline

Co-Authored-By: Claude Sonnet 4.6 <noreply@anthropic.com>
</commit_message>
<xml_diff>
--- a/BRD_Auto_Count_Social_Media_Reach.docx
+++ b/BRD_Auto_Count_Social_Media_Reach.docx
@@ -96,7 +96,7 @@
               <w:rPr>
                 <w:sz w:val="20"/>
               </w:rPr>
-              <w:t>3.0</w:t>
+              <w:t>4.0</w:t>
             </w:r>
           </w:p>
         </w:tc>
@@ -140,7 +140,7 @@
               <w:rPr>
                 <w:sz w:val="20"/>
               </w:rPr>
-              <w:t>09 May 2026</w:t>
+              <w:t>11 May 2026</w:t>
             </w:r>
           </w:p>
         </w:tc>
@@ -184,7 +184,7 @@
               <w:rPr>
                 <w:sz w:val="20"/>
               </w:rPr>
-              <w:t>Draft</w:t>
+              <w:t>Final</w:t>
             </w:r>
           </w:p>
         </w:tc>
@@ -652,6 +652,92 @@
           </w:p>
         </w:tc>
       </w:tr>
+      <w:tr>
+        <w:tc>
+          <w:tcPr>
+            <w:tcW w:type="dxa" w:w="2340"/>
+            <w:tcW w:w="1007" w:type="dxa"/>
+            <w:shd w:val="clear" w:color="auto" w:fill="F0F4FF"/>
+            <w:tcBorders>
+              <w:top w:val="single" w:sz="4" w:space="0" w:color="CCCCCC"/>
+              <w:left w:val="single" w:sz="4" w:space="0" w:color="CCCCCC"/>
+              <w:bottom w:val="single" w:sz="4" w:space="0" w:color="CCCCCC"/>
+              <w:right w:val="single" w:sz="4" w:space="0" w:color="CCCCCC"/>
+            </w:tcBorders>
+          </w:tcPr>
+          <w:p>
+            <w:r>
+              <w:rPr>
+                <w:sz w:val="20"/>
+              </w:rPr>
+              <w:t>4.0</w:t>
+            </w:r>
+          </w:p>
+        </w:tc>
+        <w:tc>
+          <w:tcPr>
+            <w:tcW w:type="dxa" w:w="2340"/>
+            <w:tcW w:w="2160" w:type="dxa"/>
+            <w:shd w:val="clear" w:color="auto" w:fill="F0F4FF"/>
+            <w:tcBorders>
+              <w:top w:val="single" w:sz="4" w:space="0" w:color="CCCCCC"/>
+              <w:left w:val="single" w:sz="4" w:space="0" w:color="CCCCCC"/>
+              <w:bottom w:val="single" w:sz="4" w:space="0" w:color="CCCCCC"/>
+              <w:right w:val="single" w:sz="4" w:space="0" w:color="CCCCCC"/>
+            </w:tcBorders>
+          </w:tcPr>
+          <w:p>
+            <w:r>
+              <w:rPr>
+                <w:sz w:val="20"/>
+              </w:rPr>
+              <w:t>11 May 2026</w:t>
+            </w:r>
+          </w:p>
+        </w:tc>
+        <w:tc>
+          <w:tcPr>
+            <w:tcW w:type="dxa" w:w="2340"/>
+            <w:tcW w:w="2160" w:type="dxa"/>
+            <w:shd w:val="clear" w:color="auto" w:fill="F0F4FF"/>
+            <w:tcBorders>
+              <w:top w:val="single" w:sz="4" w:space="0" w:color="CCCCCC"/>
+              <w:left w:val="single" w:sz="4" w:space="0" w:color="CCCCCC"/>
+              <w:bottom w:val="single" w:sz="4" w:space="0" w:color="CCCCCC"/>
+              <w:right w:val="single" w:sz="4" w:space="0" w:color="CCCCCC"/>
+            </w:tcBorders>
+          </w:tcPr>
+          <w:p>
+            <w:r>
+              <w:rPr>
+                <w:sz w:val="20"/>
+              </w:rPr>
+              <w:t>jingyi-rere</w:t>
+            </w:r>
+          </w:p>
+        </w:tc>
+        <w:tc>
+          <w:tcPr>
+            <w:tcW w:type="dxa" w:w="2340"/>
+            <w:tcW w:w="5472" w:type="dxa"/>
+            <w:shd w:val="clear" w:color="auto" w:fill="F0F4FF"/>
+            <w:tcBorders>
+              <w:top w:val="single" w:sz="4" w:space="0" w:color="CCCCCC"/>
+              <w:left w:val="single" w:sz="4" w:space="0" w:color="CCCCCC"/>
+              <w:bottom w:val="single" w:sz="4" w:space="0" w:color="CCCCCC"/>
+              <w:right w:val="single" w:sz="4" w:space="0" w:color="CCCCCC"/>
+            </w:tcBorders>
+          </w:tcPr>
+          <w:p>
+            <w:r>
+              <w:rPr>
+                <w:sz w:val="20"/>
+              </w:rPr>
+              <w:t>Updated: Playwright + Claude Vision approach (no platform APIs), hard column rules, run.py trigger, write to A/D/E/G only</w:t>
+            </w:r>
+          </w:p>
+        </w:tc>
+      </w:tr>
     </w:tbl>
     <w:p/>
     <w:p>
@@ -675,7 +761,7 @@
           <w:i w:val="0"/>
           <w:sz w:val="22"/>
         </w:rPr>
-        <w:t>This document defines the business requirements for an AI-assisted Social Media Video Metrics Automation system. The system is designed for a single video content creator who manages video content across 7 social media platforms. Instead of manually visiting each platform and recording numbers, the user simply pastes video links into the system. The system automatically extracts key video performance metrics and writes them directly into the correct columns of the user's existing Lark Sheet. The system also generates AI-powered performance analysis and content recommendations for the next posting cycle.</w:t>
+        <w:t>This document defines the business requirements for an AI-assisted Social Media Video Metrics Automation system. The system is for a single video content creator managing video content across 7 social media platforms. The user pastes video URLs directly into their Lark Sheet (Column F). The system then automatically reads those URLs, opens each video in a real browser using Playwright, takes a screenshot, and uses Claude AI Vision to extract the posted date, video caption, and view count. The extracted data is written into the correct Lark Sheet columns automatically. The system runs via a single command: python run.py. No UI is required.</w:t>
       </w:r>
     </w:p>
     <w:p>
@@ -683,7 +769,318 @@
         <w:pStyle w:val="Heading1"/>
       </w:pPr>
       <w:r>
-        <w:t>2. Problem Statement</w:t>
+        <w:t>2. Hard Rules (NEVER Violate)</w:t>
+      </w:r>
+    </w:p>
+    <w:p>
+      <w:pPr/>
+      <w:r>
+        <w:rPr>
+          <w:b/>
+          <w:i w:val="0"/>
+          <w:color w:val="C00000"/>
+          <w:sz w:val="22"/>
+        </w:rPr>
+        <w:t>These rules are enforced in code and must never be broken under any circumstance:</w:t>
+      </w:r>
+    </w:p>
+    <w:p/>
+    <w:tbl>
+      <w:tblPr>
+        <w:tblW w:type="auto" w:w="0"/>
+        <w:jc w:val="left"/>
+        <w:tblLook w:firstColumn="1" w:firstRow="1" w:lastColumn="0" w:lastRow="0" w:noHBand="0" w:noVBand="1" w:val="04A0"/>
+      </w:tblPr>
+      <w:tblGrid>
+        <w:gridCol w:w="4680"/>
+        <w:gridCol w:w="4680"/>
+      </w:tblGrid>
+      <w:tr>
+        <w:tc>
+          <w:tcPr>
+            <w:tcW w:type="dxa" w:w="4680"/>
+            <w:tcW w:w="1728" w:type="dxa"/>
+            <w:shd w:val="clear" w:color="auto" w:fill="1F497D"/>
+            <w:tcBorders>
+              <w:top w:val="single" w:sz="4" w:space="0" w:color="1F497D"/>
+              <w:left w:val="single" w:sz="4" w:space="0" w:color="1F497D"/>
+              <w:bottom w:val="single" w:sz="4" w:space="0" w:color="1F497D"/>
+              <w:right w:val="single" w:sz="4" w:space="0" w:color="1F497D"/>
+            </w:tcBorders>
+          </w:tcPr>
+          <w:p>
+            <w:r>
+              <w:rPr>
+                <w:b/>
+                <w:color w:val="FFFFFF"/>
+                <w:sz w:val="20"/>
+              </w:rPr>
+              <w:t>Rule</w:t>
+            </w:r>
+          </w:p>
+        </w:tc>
+        <w:tc>
+          <w:tcPr>
+            <w:tcW w:type="dxa" w:w="4680"/>
+            <w:tcW w:w="9072" w:type="dxa"/>
+            <w:shd w:val="clear" w:color="auto" w:fill="1F497D"/>
+            <w:tcBorders>
+              <w:top w:val="single" w:sz="4" w:space="0" w:color="1F497D"/>
+              <w:left w:val="single" w:sz="4" w:space="0" w:color="1F497D"/>
+              <w:bottom w:val="single" w:sz="4" w:space="0" w:color="1F497D"/>
+              <w:right w:val="single" w:sz="4" w:space="0" w:color="1F497D"/>
+            </w:tcBorders>
+          </w:tcPr>
+          <w:p>
+            <w:r>
+              <w:rPr>
+                <w:b/>
+                <w:color w:val="FFFFFF"/>
+                <w:sz w:val="20"/>
+              </w:rPr>
+              <w:t>Description</w:t>
+            </w:r>
+          </w:p>
+        </w:tc>
+      </w:tr>
+      <w:tr>
+        <w:tc>
+          <w:tcPr>
+            <w:tcW w:type="dxa" w:w="4680"/>
+            <w:tcW w:w="1728" w:type="dxa"/>
+            <w:shd w:val="clear" w:color="auto" w:fill="FFFFFF"/>
+            <w:tcBorders>
+              <w:top w:val="single" w:sz="4" w:space="0" w:color="CCCCCC"/>
+              <w:left w:val="single" w:sz="4" w:space="0" w:color="CCCCCC"/>
+              <w:bottom w:val="single" w:sz="4" w:space="0" w:color="CCCCCC"/>
+              <w:right w:val="single" w:sz="4" w:space="0" w:color="CCCCCC"/>
+            </w:tcBorders>
+          </w:tcPr>
+          <w:p>
+            <w:r>
+              <w:rPr>
+                <w:b/>
+                <w:color w:val="C00000"/>
+                <w:sz w:val="20"/>
+              </w:rPr>
+              <w:t>RULE-01</w:t>
+            </w:r>
+          </w:p>
+        </w:tc>
+        <w:tc>
+          <w:tcPr>
+            <w:tcW w:type="dxa" w:w="4680"/>
+            <w:tcW w:w="9072" w:type="dxa"/>
+            <w:shd w:val="clear" w:color="auto" w:fill="FFFFFF"/>
+            <w:tcBorders>
+              <w:top w:val="single" w:sz="4" w:space="0" w:color="CCCCCC"/>
+              <w:left w:val="single" w:sz="4" w:space="0" w:color="CCCCCC"/>
+              <w:bottom w:val="single" w:sz="4" w:space="0" w:color="CCCCCC"/>
+              <w:right w:val="single" w:sz="4" w:space="0" w:color="CCCCCC"/>
+            </w:tcBorders>
+          </w:tcPr>
+          <w:p>
+            <w:r>
+              <w:rPr>
+                <w:sz w:val="20"/>
+              </w:rPr>
+              <w:t>Only write to Lark columns A, D, E, G. Writing to B, C, F, or H must raise an exception immediately.</w:t>
+            </w:r>
+          </w:p>
+        </w:tc>
+      </w:tr>
+      <w:tr>
+        <w:tc>
+          <w:tcPr>
+            <w:tcW w:type="dxa" w:w="4680"/>
+            <w:tcW w:w="1728" w:type="dxa"/>
+            <w:shd w:val="clear" w:color="auto" w:fill="F0F4FF"/>
+            <w:tcBorders>
+              <w:top w:val="single" w:sz="4" w:space="0" w:color="CCCCCC"/>
+              <w:left w:val="single" w:sz="4" w:space="0" w:color="CCCCCC"/>
+              <w:bottom w:val="single" w:sz="4" w:space="0" w:color="CCCCCC"/>
+              <w:right w:val="single" w:sz="4" w:space="0" w:color="CCCCCC"/>
+            </w:tcBorders>
+          </w:tcPr>
+          <w:p>
+            <w:r>
+              <w:rPr>
+                <w:b/>
+                <w:color w:val="C00000"/>
+                <w:sz w:val="20"/>
+              </w:rPr>
+              <w:t>RULE-02</w:t>
+            </w:r>
+          </w:p>
+        </w:tc>
+        <w:tc>
+          <w:tcPr>
+            <w:tcW w:type="dxa" w:w="4680"/>
+            <w:tcW w:w="9072" w:type="dxa"/>
+            <w:shd w:val="clear" w:color="auto" w:fill="F0F4FF"/>
+            <w:tcBorders>
+              <w:top w:val="single" w:sz="4" w:space="0" w:color="CCCCCC"/>
+              <w:left w:val="single" w:sz="4" w:space="0" w:color="CCCCCC"/>
+              <w:bottom w:val="single" w:sz="4" w:space="0" w:color="CCCCCC"/>
+              <w:right w:val="single" w:sz="4" w:space="0" w:color="CCCCCC"/>
+            </w:tcBorders>
+          </w:tcPr>
+          <w:p>
+            <w:r>
+              <w:rPr>
+                <w:sz w:val="20"/>
+              </w:rPr>
+              <w:t>Never overwrite Column F. The user pastes URLs into Column F manually — the system must never touch it.</w:t>
+            </w:r>
+          </w:p>
+        </w:tc>
+      </w:tr>
+      <w:tr>
+        <w:tc>
+          <w:tcPr>
+            <w:tcW w:type="dxa" w:w="4680"/>
+            <w:tcW w:w="1728" w:type="dxa"/>
+            <w:shd w:val="clear" w:color="auto" w:fill="FFFFFF"/>
+            <w:tcBorders>
+              <w:top w:val="single" w:sz="4" w:space="0" w:color="CCCCCC"/>
+              <w:left w:val="single" w:sz="4" w:space="0" w:color="CCCCCC"/>
+              <w:bottom w:val="single" w:sz="4" w:space="0" w:color="CCCCCC"/>
+              <w:right w:val="single" w:sz="4" w:space="0" w:color="CCCCCC"/>
+            </w:tcBorders>
+          </w:tcPr>
+          <w:p>
+            <w:r>
+              <w:rPr>
+                <w:b/>
+                <w:color w:val="C00000"/>
+                <w:sz w:val="20"/>
+              </w:rPr>
+              <w:t>RULE-03</w:t>
+            </w:r>
+          </w:p>
+        </w:tc>
+        <w:tc>
+          <w:tcPr>
+            <w:tcW w:type="dxa" w:w="4680"/>
+            <w:tcW w:w="9072" w:type="dxa"/>
+            <w:shd w:val="clear" w:color="auto" w:fill="FFFFFF"/>
+            <w:tcBorders>
+              <w:top w:val="single" w:sz="4" w:space="0" w:color="CCCCCC"/>
+              <w:left w:val="single" w:sz="4" w:space="0" w:color="CCCCCC"/>
+              <w:bottom w:val="single" w:sz="4" w:space="0" w:color="CCCCCC"/>
+              <w:right w:val="single" w:sz="4" w:space="0" w:color="CCCCCC"/>
+            </w:tcBorders>
+          </w:tcPr>
+          <w:p>
+            <w:r>
+              <w:rPr>
+                <w:sz w:val="20"/>
+              </w:rPr>
+              <w:t>Never append new rows. Always write into the existing row identified by the URL in Column F.</w:t>
+            </w:r>
+          </w:p>
+        </w:tc>
+      </w:tr>
+      <w:tr>
+        <w:tc>
+          <w:tcPr>
+            <w:tcW w:type="dxa" w:w="4680"/>
+            <w:tcW w:w="1728" w:type="dxa"/>
+            <w:shd w:val="clear" w:color="auto" w:fill="F0F4FF"/>
+            <w:tcBorders>
+              <w:top w:val="single" w:sz="4" w:space="0" w:color="CCCCCC"/>
+              <w:left w:val="single" w:sz="4" w:space="0" w:color="CCCCCC"/>
+              <w:bottom w:val="single" w:sz="4" w:space="0" w:color="CCCCCC"/>
+              <w:right w:val="single" w:sz="4" w:space="0" w:color="CCCCCC"/>
+            </w:tcBorders>
+          </w:tcPr>
+          <w:p>
+            <w:r>
+              <w:rPr>
+                <w:b/>
+                <w:color w:val="C00000"/>
+                <w:sz w:val="20"/>
+              </w:rPr>
+              <w:t>RULE-04</w:t>
+            </w:r>
+          </w:p>
+        </w:tc>
+        <w:tc>
+          <w:tcPr>
+            <w:tcW w:type="dxa" w:w="4680"/>
+            <w:tcW w:w="9072" w:type="dxa"/>
+            <w:shd w:val="clear" w:color="auto" w:fill="F0F4FF"/>
+            <w:tcBorders>
+              <w:top w:val="single" w:sz="4" w:space="0" w:color="CCCCCC"/>
+              <w:left w:val="single" w:sz="4" w:space="0" w:color="CCCCCC"/>
+              <w:bottom w:val="single" w:sz="4" w:space="0" w:color="CCCCCC"/>
+              <w:right w:val="single" w:sz="4" w:space="0" w:color="CCCCCC"/>
+            </w:tcBorders>
+          </w:tcPr>
+          <w:p>
+            <w:r>
+              <w:rPr>
+                <w:sz w:val="20"/>
+              </w:rPr>
+              <w:t>Strip ALL hashtags from caption (Unicode-aware) before writing to Column D. No hashtags may remain.</w:t>
+            </w:r>
+          </w:p>
+        </w:tc>
+      </w:tr>
+      <w:tr>
+        <w:tc>
+          <w:tcPr>
+            <w:tcW w:type="dxa" w:w="4680"/>
+            <w:tcW w:w="1728" w:type="dxa"/>
+            <w:shd w:val="clear" w:color="auto" w:fill="FFFFFF"/>
+            <w:tcBorders>
+              <w:top w:val="single" w:sz="4" w:space="0" w:color="CCCCCC"/>
+              <w:left w:val="single" w:sz="4" w:space="0" w:color="CCCCCC"/>
+              <w:bottom w:val="single" w:sz="4" w:space="0" w:color="CCCCCC"/>
+              <w:right w:val="single" w:sz="4" w:space="0" w:color="CCCCCC"/>
+            </w:tcBorders>
+          </w:tcPr>
+          <w:p>
+            <w:r>
+              <w:rPr>
+                <w:b/>
+                <w:color w:val="C00000"/>
+                <w:sz w:val="20"/>
+              </w:rPr>
+              <w:t>RULE-05</w:t>
+            </w:r>
+          </w:p>
+        </w:tc>
+        <w:tc>
+          <w:tcPr>
+            <w:tcW w:type="dxa" w:w="4680"/>
+            <w:tcW w:w="9072" w:type="dxa"/>
+            <w:shd w:val="clear" w:color="auto" w:fill="FFFFFF"/>
+            <w:tcBorders>
+              <w:top w:val="single" w:sz="4" w:space="0" w:color="CCCCCC"/>
+              <w:left w:val="single" w:sz="4" w:space="0" w:color="CCCCCC"/>
+              <w:bottom w:val="single" w:sz="4" w:space="0" w:color="CCCCCC"/>
+              <w:right w:val="single" w:sz="4" w:space="0" w:color="CCCCCC"/>
+            </w:tcBorders>
+          </w:tcPr>
+          <w:p>
+            <w:r>
+              <w:rPr>
+                <w:sz w:val="20"/>
+              </w:rPr>
+              <w:t>Column E must always be exactly "Content Casual" — hardcoded, no exceptions.</w:t>
+            </w:r>
+          </w:p>
+        </w:tc>
+      </w:tr>
+    </w:tbl>
+    <w:p/>
+    <w:p>
+      <w:pPr>
+        <w:pStyle w:val="Heading1"/>
+      </w:pPr>
+      <w:r>
+        <w:t>3. Problem Statement</w:t>
       </w:r>
     </w:p>
     <w:p>
@@ -691,7 +1088,7 @@
         <w:pStyle w:val="Heading2"/>
       </w:pPr>
       <w:r>
-        <w:t>2.1 As-Is Process (Current — Manual)</w:t>
+        <w:t>3.1 As-Is Process (Current — Manual)</w:t>
       </w:r>
     </w:p>
     <w:p>
@@ -847,7 +1244,7 @@
               <w:rPr>
                 <w:sz w:val="20"/>
               </w:rPr>
-              <w:t>Find each Reel, record view count, copy caption, note posted date</w:t>
+              <w:t>Open each Reel, note posted date, copy caption, record view count</w:t>
             </w:r>
           </w:p>
         </w:tc>
@@ -912,7 +1309,7 @@
               <w:rPr>
                 <w:sz w:val="20"/>
               </w:rPr>
-              <w:t>Find each video, record view count, copy caption, note posted date</w:t>
+              <w:t>Open each video, note posted date, copy caption, record view count</w:t>
             </w:r>
           </w:p>
         </w:tc>
@@ -977,7 +1374,7 @@
               <w:rPr>
                 <w:sz w:val="20"/>
               </w:rPr>
-              <w:t>Find each video, record view count, copy caption, note posted date</w:t>
+              <w:t>Open each video, note posted date, copy caption, record view count</w:t>
             </w:r>
           </w:p>
         </w:tc>
@@ -1042,7 +1439,7 @@
               <w:rPr>
                 <w:sz w:val="20"/>
               </w:rPr>
-              <w:t>Find each video, record view count, copy title, note posted date</w:t>
+              <w:t>Open each video, note posted date, copy title, record view count</w:t>
             </w:r>
           </w:p>
         </w:tc>
@@ -1107,7 +1504,7 @@
               <w:rPr>
                 <w:sz w:val="20"/>
               </w:rPr>
-              <w:t>Find each video, record view count, copy caption, note posted date</w:t>
+              <w:t>Open each post, note posted date, copy caption, record view count</w:t>
             </w:r>
           </w:p>
         </w:tc>
@@ -1172,7 +1569,7 @@
               <w:rPr>
                 <w:sz w:val="20"/>
               </w:rPr>
-              <w:t>Find each video, record view count, copy caption, note posted date</w:t>
+              <w:t>Open each video, note posted date, copy caption, record view count</w:t>
             </w:r>
           </w:p>
         </w:tc>
@@ -1237,7 +1634,7 @@
               <w:rPr>
                 <w:sz w:val="20"/>
               </w:rPr>
-              <w:t>Find each video, record view count, copy caption, note posted date</w:t>
+              <w:t>Open each post, note posted date, copy caption, record view count</w:t>
             </w:r>
           </w:p>
         </w:tc>
@@ -1302,7 +1699,7 @@
               <w:rPr>
                 <w:sz w:val="20"/>
               </w:rPr>
-              <w:t>Type all data into correct columns A, D, E, F, G manually</w:t>
+              <w:t>Manually type all data into columns A, D, E, G — very error prone</w:t>
             </w:r>
           </w:p>
         </w:tc>
@@ -1314,7 +1711,7 @@
         <w:pStyle w:val="Heading2"/>
       </w:pPr>
       <w:r>
-        <w:t>2.2 To-Be Process (Future — Automated)</w:t>
+        <w:t>3.2 To-Be Process (Future — Automated)</w:t>
       </w:r>
     </w:p>
     <w:p>
@@ -1325,7 +1722,7 @@
           <w:i w:val="0"/>
           <w:sz w:val="22"/>
         </w:rPr>
-        <w:t>With the new system, the user only needs to do ONE thing:</w:t>
+        <w:t>With the new system, the user only does TWO things:</w:t>
       </w:r>
     </w:p>
     <w:tbl>
@@ -1449,7 +1846,7 @@
               <w:rPr>
                 <w:sz w:val="20"/>
               </w:rPr>
-              <w:t>Paste video links into the system</w:t>
+              <w:t>Paste video URLs into Column F of the Lark Sheet</w:t>
             </w:r>
           </w:p>
         </w:tc>
@@ -1470,7 +1867,7 @@
               <w:rPr>
                 <w:sz w:val="20"/>
               </w:rPr>
-              <w:t>Validates each link and identifies the platform</w:t>
+              <w:t>Nothing yet — waits for user to finish</w:t>
             </w:r>
           </w:p>
         </w:tc>
@@ -1514,7 +1911,7 @@
               <w:rPr>
                 <w:sz w:val="20"/>
               </w:rPr>
-              <w:t>Wait</w:t>
+              <w:t>Run: python run.py</w:t>
             </w:r>
           </w:p>
         </w:tc>
@@ -1535,72 +1932,7 @@
               <w:rPr>
                 <w:sz w:val="20"/>
               </w:rPr>
-              <w:t>Extracts: posted date, caption (no hashtags), view count from all 7 platforms</w:t>
-            </w:r>
-          </w:p>
-        </w:tc>
-      </w:tr>
-      <w:tr>
-        <w:tc>
-          <w:tcPr>
-            <w:tcW w:type="dxa" w:w="3120"/>
-            <w:tcW w:w="720" w:type="dxa"/>
-            <w:shd w:val="clear" w:color="auto" w:fill="FFFFFF"/>
-            <w:tcBorders>
-              <w:top w:val="single" w:sz="4" w:space="0" w:color="CCCCCC"/>
-              <w:left w:val="single" w:sz="4" w:space="0" w:color="CCCCCC"/>
-              <w:bottom w:val="single" w:sz="4" w:space="0" w:color="CCCCCC"/>
-              <w:right w:val="single" w:sz="4" w:space="0" w:color="CCCCCC"/>
-            </w:tcBorders>
-          </w:tcPr>
-          <w:p>
-            <w:r>
-              <w:rPr>
-                <w:sz w:val="20"/>
-              </w:rPr>
-              <w:t>3</w:t>
-            </w:r>
-          </w:p>
-        </w:tc>
-        <w:tc>
-          <w:tcPr>
-            <w:tcW w:type="dxa" w:w="3120"/>
-            <w:tcW w:w="4031" w:type="dxa"/>
-            <w:shd w:val="clear" w:color="auto" w:fill="FFFFFF"/>
-            <w:tcBorders>
-              <w:top w:val="single" w:sz="4" w:space="0" w:color="CCCCCC"/>
-              <w:left w:val="single" w:sz="4" w:space="0" w:color="CCCCCC"/>
-              <w:bottom w:val="single" w:sz="4" w:space="0" w:color="CCCCCC"/>
-              <w:right w:val="single" w:sz="4" w:space="0" w:color="CCCCCC"/>
-            </w:tcBorders>
-          </w:tcPr>
-          <w:p>
-            <w:r>
-              <w:rPr>
-                <w:sz w:val="20"/>
-              </w:rPr>
-              <w:t>Done!</w:t>
-            </w:r>
-          </w:p>
-        </w:tc>
-        <w:tc>
-          <w:tcPr>
-            <w:tcW w:type="dxa" w:w="3120"/>
-            <w:tcW w:w="6048" w:type="dxa"/>
-            <w:shd w:val="clear" w:color="auto" w:fill="FFFFFF"/>
-            <w:tcBorders>
-              <w:top w:val="single" w:sz="4" w:space="0" w:color="CCCCCC"/>
-              <w:left w:val="single" w:sz="4" w:space="0" w:color="CCCCCC"/>
-              <w:bottom w:val="single" w:sz="4" w:space="0" w:color="CCCCCC"/>
-              <w:right w:val="single" w:sz="4" w:space="0" w:color="CCCCCC"/>
-            </w:tcBorders>
-          </w:tcPr>
-          <w:p>
-            <w:r>
-              <w:rPr>
-                <w:sz w:val="20"/>
-              </w:rPr>
-              <w:t>Writes data into correct Lark Sheet columns A, D, E, F, G automatically</w:t>
+              <w:t>Reads URLs from Column F, opens each in browser, takes screenshot, uses Claude Vision to extract data, writes to columns A/D/E/G</w:t>
             </w:r>
           </w:p>
         </w:tc>
@@ -1612,7 +1944,7 @@
         <w:pStyle w:val="Heading2"/>
       </w:pPr>
       <w:r>
-        <w:t>2.3 Pain Points</w:t>
+        <w:t>3.3 Pain Points</w:t>
       </w:r>
     </w:p>
     <w:tbl>
@@ -1736,7 +2068,7 @@
               <w:rPr>
                 <w:sz w:val="20"/>
               </w:rPr>
-              <w:t>Opens 7 platforms manually every cycle</w:t>
+              <w:t>Opens 7 platforms manually every reporting cycle</w:t>
             </w:r>
           </w:p>
         </w:tc>
@@ -1801,7 +2133,7 @@
               <w:rPr>
                 <w:sz w:val="20"/>
               </w:rPr>
-              <w:t>Types data into wrong Lark column accidentally</w:t>
+              <w:t>Manually types data into wrong Lark column accidentally</w:t>
             </w:r>
           </w:p>
         </w:tc>
@@ -1822,7 +2154,7 @@
               <w:rPr>
                 <w:sz w:val="20"/>
               </w:rPr>
-              <w:t>Data errors that are hard to spot</w:t>
+              <w:t>Data errors hard to spot</w:t>
             </w:r>
           </w:p>
         </w:tc>
@@ -1931,7 +2263,7 @@
               <w:rPr>
                 <w:sz w:val="20"/>
               </w:rPr>
-              <w:t>No automated performance analysis</w:t>
+              <w:t>No performance analysis</w:t>
             </w:r>
           </w:p>
         </w:tc>
@@ -2029,7 +2361,7 @@
         <w:pStyle w:val="Heading1"/>
       </w:pPr>
       <w:r>
-        <w:t>3. Business Objectives</w:t>
+        <w:t>4. Business Objectives</w:t>
       </w:r>
     </w:p>
     <w:p>
@@ -2051,7 +2383,7 @@
         <w:rPr>
           <w:sz w:val="22"/>
         </w:rPr>
-        <w:t>Automatically fill the correct Lark Sheet columns with accurate data.</w:t>
+        <w:t>User pastes URLs into Column F — system fills A, D, E, G automatically.</w:t>
       </w:r>
     </w:p>
     <w:p>
@@ -2062,7 +2394,7 @@
         <w:rPr>
           <w:sz w:val="22"/>
         </w:rPr>
-        <w:t>Extract video captions and remove all hashtags automatically.</w:t>
+        <w:t>Extract video captions and remove all hashtags (Unicode-aware) automatically.</w:t>
       </w:r>
     </w:p>
     <w:p>
@@ -2073,7 +2405,7 @@
         <w:rPr>
           <w:sz w:val="22"/>
         </w:rPr>
-        <w:t>Default Content Type to "Content Casual" without manual selection.</w:t>
+        <w:t>Default Content Type to "Content Casual" in Column E — always.</w:t>
       </w:r>
     </w:p>
     <w:p>
@@ -2084,7 +2416,7 @@
         <w:rPr>
           <w:sz w:val="22"/>
         </w:rPr>
-        <w:t>Generate AI-powered video performance summary and recommendations.</w:t>
+        <w:t>Generate AI-powered video performance analysis and content recommendations.</w:t>
       </w:r>
     </w:p>
     <w:p>
@@ -2095,7 +2427,18 @@
         <w:rPr>
           <w:sz w:val="22"/>
         </w:rPr>
-        <w:t>Support all 7 platforms the user posts video content on.</w:t>
+        <w:t>Support all 7 platforms using Playwright browser automation + Claude Vision.</w:t>
+      </w:r>
+    </w:p>
+    <w:p>
+      <w:pPr>
+        <w:pStyle w:val="ListBullet"/>
+      </w:pPr>
+      <w:r>
+        <w:rPr>
+          <w:sz w:val="22"/>
+        </w:rPr>
+        <w:t>Run with a single command: python run.py. No UI, no manual steps.</w:t>
       </w:r>
     </w:p>
     <w:p>
@@ -2103,7 +2446,7 @@
         <w:pStyle w:val="Heading1"/>
       </w:pPr>
       <w:r>
-        <w:t>4. User Stories</w:t>
+        <w:t>5. User Stories</w:t>
       </w:r>
     </w:p>
     <w:tbl>
@@ -2203,7 +2546,7 @@
               <w:rPr>
                 <w:sz w:val="20"/>
               </w:rPr>
-              <w:t>As a video content creator, I want to paste video links so the system fills my Lark Sheet automatically without me typing anything.</w:t>
+              <w:t>As a video content creator, I want to paste video URLs into Column F of my Lark Sheet and run python run.py so the system fills columns A, D, E, G automatically.</w:t>
             </w:r>
           </w:p>
         </w:tc>
@@ -2247,7 +2590,7 @@
               <w:rPr>
                 <w:sz w:val="20"/>
               </w:rPr>
-              <w:t>As a user, I want the video posted date auto-filled in Column A so I do not have to look it up manually.</w:t>
+              <w:t>As a user, I want Column A filled with the original video posted date so I do not have to look it up.</w:t>
             </w:r>
           </w:p>
         </w:tc>
@@ -2291,7 +2634,7 @@
               <w:rPr>
                 <w:sz w:val="20"/>
               </w:rPr>
-              <w:t>As a user, I want the video caption (without hashtags) filled in Column D automatically.</w:t>
+              <w:t>As a user, I want Column D filled with the video caption with all hashtags removed so my sheet stays clean.</w:t>
             </w:r>
           </w:p>
         </w:tc>
@@ -2335,7 +2678,7 @@
               <w:rPr>
                 <w:sz w:val="20"/>
               </w:rPr>
-              <w:t>As a user, I want Column E (Content Type) to default to "Content Casual" so I do not have to select it every time.</w:t>
+              <w:t>As a user, I want Column E always set to "Content Casual" automatically without me selecting it.</w:t>
             </w:r>
           </w:p>
         </w:tc>
@@ -2379,7 +2722,7 @@
               <w:rPr>
                 <w:sz w:val="20"/>
               </w:rPr>
-              <w:t>As a user, I want the video URL filled in Column F automatically.</w:t>
+              <w:t>As a user, I want Column F (my URL) to never be touched or overwritten by the system.</w:t>
             </w:r>
           </w:p>
         </w:tc>
@@ -2423,7 +2766,7 @@
               <w:rPr>
                 <w:sz w:val="20"/>
               </w:rPr>
-              <w:t>As a user, I want the view count filled in Column G (Reach) so I can track performance easily.</w:t>
+              <w:t>As a user, I want Column G filled with the video view count automatically.</w:t>
             </w:r>
           </w:p>
         </w:tc>
@@ -2467,7 +2810,7 @@
               <w:rPr>
                 <w:sz w:val="20"/>
               </w:rPr>
-              <w:t>As a user, I want the system to leave Columns B, C, and H completely untouched.</w:t>
+              <w:t>As a user, I want the system to leave Columns B, C, and H completely untouched always.</w:t>
             </w:r>
           </w:p>
         </w:tc>
@@ -2511,7 +2854,51 @@
               <w:rPr>
                 <w:sz w:val="20"/>
               </w:rPr>
-              <w:t>As a user, I want AI recommendations so I know what type of videos to create next cycle.</w:t>
+              <w:t>As a user, I want AI recommendations so I know what type of videos to make next cycle.</w:t>
+            </w:r>
+          </w:p>
+        </w:tc>
+      </w:tr>
+      <w:tr>
+        <w:tc>
+          <w:tcPr>
+            <w:tcW w:type="dxa" w:w="4680"/>
+            <w:tcW w:w="1152" w:type="dxa"/>
+            <w:shd w:val="clear" w:color="auto" w:fill="FFFFFF"/>
+            <w:tcBorders>
+              <w:top w:val="single" w:sz="4" w:space="0" w:color="CCCCCC"/>
+              <w:left w:val="single" w:sz="4" w:space="0" w:color="CCCCCC"/>
+              <w:bottom w:val="single" w:sz="4" w:space="0" w:color="CCCCCC"/>
+              <w:right w:val="single" w:sz="4" w:space="0" w:color="CCCCCC"/>
+            </w:tcBorders>
+          </w:tcPr>
+          <w:p>
+            <w:r>
+              <w:rPr>
+                <w:sz w:val="20"/>
+              </w:rPr>
+              <w:t>US-09</w:t>
+            </w:r>
+          </w:p>
+        </w:tc>
+        <w:tc>
+          <w:tcPr>
+            <w:tcW w:type="dxa" w:w="4680"/>
+            <w:tcW w:w="9648" w:type="dxa"/>
+            <w:shd w:val="clear" w:color="auto" w:fill="FFFFFF"/>
+            <w:tcBorders>
+              <w:top w:val="single" w:sz="4" w:space="0" w:color="CCCCCC"/>
+              <w:left w:val="single" w:sz="4" w:space="0" w:color="CCCCCC"/>
+              <w:bottom w:val="single" w:sz="4" w:space="0" w:color="CCCCCC"/>
+              <w:right w:val="single" w:sz="4" w:space="0" w:color="CCCCCC"/>
+            </w:tcBorders>
+          </w:tcPr>
+          <w:p>
+            <w:r>
+              <w:rPr>
+                <w:sz w:val="20"/>
+              </w:rPr>
+              <w:t>As a user, I want a clear run summary after python run.py so I know what succeeded and what failed.</w:t>
             </w:r>
           </w:p>
         </w:tc>
@@ -2523,18 +2910,19 @@
         <w:pStyle w:val="Heading1"/>
       </w:pPr>
       <w:r>
-        <w:t>5. Lark Sheet Column Mapping</w:t>
+        <w:t>6. Lark Sheet Column Mapping</w:t>
       </w:r>
     </w:p>
     <w:p>
       <w:pPr/>
       <w:r>
         <w:rPr>
-          <w:b w:val="0"/>
+          <w:b/>
           <w:i w:val="0"/>
+          <w:color w:val="C00000"/>
           <w:sz w:val="22"/>
         </w:rPr>
-        <w:t>The system must write data into the existing Lark Sheet with these exact rules:</w:t>
+        <w:t>CRITICAL: The system uses a hard allowlist. Only columns A, D, E, G are writable. Any attempt to write to B, C, F, or H raises an exception.</w:t>
       </w:r>
     </w:p>
     <w:p/>
@@ -2600,7 +2988,7 @@
         <w:tc>
           <w:tcPr>
             <w:tcW w:type="dxa" w:w="2340"/>
-            <w:tcW w:w="3888" w:type="dxa"/>
+            <w:tcW w:w="3600" w:type="dxa"/>
             <w:shd w:val="clear" w:color="auto" w:fill="1F497D"/>
             <w:tcBorders>
               <w:top w:val="single" w:sz="4" w:space="0" w:color="1F497D"/>
@@ -2616,14 +3004,14 @@
                 <w:color w:val="FFFFFF"/>
                 <w:sz w:val="20"/>
               </w:rPr>
-              <w:t>System Action</w:t>
+              <w:t>Who Fills It</w:t>
             </w:r>
           </w:p>
         </w:tc>
         <w:tc>
           <w:tcPr>
             <w:tcW w:type="dxa" w:w="2340"/>
-            <w:tcW w:w="4320" w:type="dxa"/>
+            <w:tcW w:w="4464" w:type="dxa"/>
             <w:shd w:val="clear" w:color="auto" w:fill="1F497D"/>
             <w:tcBorders>
               <w:top w:val="single" w:sz="4" w:space="0" w:color="1F497D"/>
@@ -2639,7 +3027,7 @@
                 <w:color w:val="FFFFFF"/>
                 <w:sz w:val="20"/>
               </w:rPr>
-              <w:t>Details</w:t>
+              <w:t>Rule / Detail</w:t>
             </w:r>
           </w:p>
         </w:tc>
@@ -2690,7 +3078,7 @@
         <w:tc>
           <w:tcPr>
             <w:tcW w:type="dxa" w:w="2340"/>
-            <w:tcW w:w="3888" w:type="dxa"/>
+            <w:tcW w:w="3600" w:type="dxa"/>
             <w:shd w:val="clear" w:color="auto" w:fill="FFFFFF"/>
             <w:tcBorders>
               <w:top w:val="single" w:sz="4" w:space="0" w:color="CCCCCC"/>
@@ -2706,14 +3094,14 @@
                 <w:color w:val="007000"/>
                 <w:sz w:val="20"/>
               </w:rPr>
-              <w:t>System fills automatically</w:t>
+              <w:t>System writes automatically</w:t>
             </w:r>
           </w:p>
         </w:tc>
         <w:tc>
           <w:tcPr>
             <w:tcW w:type="dxa" w:w="2340"/>
-            <w:tcW w:w="4320" w:type="dxa"/>
+            <w:tcW w:w="4464" w:type="dxa"/>
             <w:shd w:val="clear" w:color="auto" w:fill="FFFFFF"/>
             <w:tcBorders>
               <w:top w:val="single" w:sz="4" w:space="0" w:color="CCCCCC"/>
@@ -2727,7 +3115,7 @@
               <w:rPr>
                 <w:sz w:val="20"/>
               </w:rPr>
-              <w:t>Date the video was originally posted on the platform (not today's date)</w:t>
+              <w:t>Original video posted date extracted via Claude Vision. Format: DD/MM/YYYY</w:t>
             </w:r>
           </w:p>
         </w:tc>
@@ -2778,7 +3166,7 @@
         <w:tc>
           <w:tcPr>
             <w:tcW w:type="dxa" w:w="2340"/>
-            <w:tcW w:w="3888" w:type="dxa"/>
+            <w:tcW w:w="3600" w:type="dxa"/>
             <w:shd w:val="clear" w:color="auto" w:fill="F0F4FF"/>
             <w:tcBorders>
               <w:top w:val="single" w:sz="4" w:space="0" w:color="CCCCCC"/>
@@ -2791,17 +3179,17 @@
             <w:r>
               <w:rPr>
                 <w:b w:val="0"/>
-                <w:color w:val="C55A11"/>
-                <w:sz w:val="20"/>
-              </w:rPr>
-              <w:t>User fills manually — DO NOT TOUCH</w:t>
+                <w:color w:val="C00000"/>
+                <w:sz w:val="20"/>
+              </w:rPr>
+              <w:t>User fills manually — NEVER TOUCH</w:t>
             </w:r>
           </w:p>
         </w:tc>
         <w:tc>
           <w:tcPr>
             <w:tcW w:type="dxa" w:w="2340"/>
-            <w:tcW w:w="4320" w:type="dxa"/>
+            <w:tcW w:w="4464" w:type="dxa"/>
             <w:shd w:val="clear" w:color="auto" w:fill="F0F4FF"/>
             <w:tcBorders>
               <w:top w:val="single" w:sz="4" w:space="0" w:color="CCCCCC"/>
@@ -2815,7 +3203,7 @@
               <w:rPr>
                 <w:sz w:val="20"/>
               </w:rPr>
-              <w:t>User fills manually — system must NOT write anything here</w:t>
+              <w:t>User fills manually. System raises exception if it tries to write here.</w:t>
             </w:r>
           </w:p>
         </w:tc>
@@ -2866,7 +3254,7 @@
         <w:tc>
           <w:tcPr>
             <w:tcW w:type="dxa" w:w="2340"/>
-            <w:tcW w:w="3888" w:type="dxa"/>
+            <w:tcW w:w="3600" w:type="dxa"/>
             <w:shd w:val="clear" w:color="auto" w:fill="FFFFFF"/>
             <w:tcBorders>
               <w:top w:val="single" w:sz="4" w:space="0" w:color="CCCCCC"/>
@@ -2879,17 +3267,17 @@
             <w:r>
               <w:rPr>
                 <w:b w:val="0"/>
-                <w:color w:val="C55A11"/>
-                <w:sz w:val="20"/>
-              </w:rPr>
-              <w:t>User fills manually — DO NOT TOUCH</w:t>
+                <w:color w:val="C00000"/>
+                <w:sz w:val="20"/>
+              </w:rPr>
+              <w:t>User fills manually — NEVER TOUCH</w:t>
             </w:r>
           </w:p>
         </w:tc>
         <w:tc>
           <w:tcPr>
             <w:tcW w:type="dxa" w:w="2340"/>
-            <w:tcW w:w="4320" w:type="dxa"/>
+            <w:tcW w:w="4464" w:type="dxa"/>
             <w:shd w:val="clear" w:color="auto" w:fill="FFFFFF"/>
             <w:tcBorders>
               <w:top w:val="single" w:sz="4" w:space="0" w:color="CCCCCC"/>
@@ -2903,7 +3291,7 @@
               <w:rPr>
                 <w:sz w:val="20"/>
               </w:rPr>
-              <w:t>User fills manually — system must NOT write anything here</w:t>
+              <w:t>User fills manually. System raises exception if it tries to write here.</w:t>
             </w:r>
           </w:p>
         </w:tc>
@@ -2954,7 +3342,7 @@
         <w:tc>
           <w:tcPr>
             <w:tcW w:type="dxa" w:w="2340"/>
-            <w:tcW w:w="3888" w:type="dxa"/>
+            <w:tcW w:w="3600" w:type="dxa"/>
             <w:shd w:val="clear" w:color="auto" w:fill="F0F4FF"/>
             <w:tcBorders>
               <w:top w:val="single" w:sz="4" w:space="0" w:color="CCCCCC"/>
@@ -2970,14 +3358,14 @@
                 <w:color w:val="007000"/>
                 <w:sz w:val="20"/>
               </w:rPr>
-              <w:t>System fills automatically</w:t>
+              <w:t>System writes automatically</w:t>
             </w:r>
           </w:p>
         </w:tc>
         <w:tc>
           <w:tcPr>
             <w:tcW w:type="dxa" w:w="2340"/>
-            <w:tcW w:w="4320" w:type="dxa"/>
+            <w:tcW w:w="4464" w:type="dxa"/>
             <w:shd w:val="clear" w:color="auto" w:fill="F0F4FF"/>
             <w:tcBorders>
               <w:top w:val="single" w:sz="4" w:space="0" w:color="CCCCCC"/>
@@ -2991,7 +3379,7 @@
               <w:rPr>
                 <w:sz w:val="20"/>
               </w:rPr>
-              <w:t>Video caption extracted automatically. All hashtags removed. Write "No caption" if none found.</w:t>
+              <w:t>Video caption extracted via Claude Vision. ALL hashtags stripped (Unicode-aware). Write "No caption" if empty.</w:t>
             </w:r>
           </w:p>
         </w:tc>
@@ -3042,7 +3430,7 @@
         <w:tc>
           <w:tcPr>
             <w:tcW w:type="dxa" w:w="2340"/>
-            <w:tcW w:w="3888" w:type="dxa"/>
+            <w:tcW w:w="3600" w:type="dxa"/>
             <w:shd w:val="clear" w:color="auto" w:fill="FFFFFF"/>
             <w:tcBorders>
               <w:top w:val="single" w:sz="4" w:space="0" w:color="CCCCCC"/>
@@ -3058,14 +3446,14 @@
                 <w:color w:val="4472C4"/>
                 <w:sz w:val="20"/>
               </w:rPr>
-              <w:t>System fills with default value</w:t>
+              <w:t>System fills with hardcoded default</w:t>
             </w:r>
           </w:p>
         </w:tc>
         <w:tc>
           <w:tcPr>
             <w:tcW w:type="dxa" w:w="2340"/>
-            <w:tcW w:w="4320" w:type="dxa"/>
+            <w:tcW w:w="4464" w:type="dxa"/>
             <w:shd w:val="clear" w:color="auto" w:fill="FFFFFF"/>
             <w:tcBorders>
               <w:top w:val="single" w:sz="4" w:space="0" w:color="CCCCCC"/>
@@ -3079,7 +3467,7 @@
               <w:rPr>
                 <w:sz w:val="20"/>
               </w:rPr>
-              <w:t>Auto-filled as "Content Casual" by default for every row</w:t>
+              <w:t>Hardcoded as "Content Casual". Always. No exceptions.No overrides.</w:t>
             </w:r>
           </w:p>
         </w:tc>
@@ -3130,7 +3518,7 @@
         <w:tc>
           <w:tcPr>
             <w:tcW w:type="dxa" w:w="2340"/>
-            <w:tcW w:w="3888" w:type="dxa"/>
+            <w:tcW w:w="3600" w:type="dxa"/>
             <w:shd w:val="clear" w:color="auto" w:fill="F0F4FF"/>
             <w:tcBorders>
               <w:top w:val="single" w:sz="4" w:space="0" w:color="CCCCCC"/>
@@ -3143,17 +3531,17 @@
             <w:r>
               <w:rPr>
                 <w:b w:val="0"/>
-                <w:color w:val="007000"/>
-                <w:sz w:val="20"/>
-              </w:rPr>
-              <w:t>System fills automatically</w:t>
+                <w:color w:val="C00000"/>
+                <w:sz w:val="20"/>
+              </w:rPr>
+              <w:t>User fills manually — NEVER TOUCH</w:t>
             </w:r>
           </w:p>
         </w:tc>
         <w:tc>
           <w:tcPr>
             <w:tcW w:type="dxa" w:w="2340"/>
-            <w:tcW w:w="4320" w:type="dxa"/>
+            <w:tcW w:w="4464" w:type="dxa"/>
             <w:shd w:val="clear" w:color="auto" w:fill="F0F4FF"/>
             <w:tcBorders>
               <w:top w:val="single" w:sz="4" w:space="0" w:color="CCCCCC"/>
@@ -3167,7 +3555,7 @@
               <w:rPr>
                 <w:sz w:val="20"/>
               </w:rPr>
-              <w:t>The video URL as provided by the user</w:t>
+              <w:t>USER pastes URL here. System READS this column but NEVER writes to it. Exception raised if write attempted.</w:t>
             </w:r>
           </w:p>
         </w:tc>
@@ -3218,7 +3606,7 @@
         <w:tc>
           <w:tcPr>
             <w:tcW w:type="dxa" w:w="2340"/>
-            <w:tcW w:w="3888" w:type="dxa"/>
+            <w:tcW w:w="3600" w:type="dxa"/>
             <w:shd w:val="clear" w:color="auto" w:fill="FFFFFF"/>
             <w:tcBorders>
               <w:top w:val="single" w:sz="4" w:space="0" w:color="CCCCCC"/>
@@ -3234,14 +3622,14 @@
                 <w:color w:val="007000"/>
                 <w:sz w:val="20"/>
               </w:rPr>
-              <w:t>System fills automatically</w:t>
+              <w:t>System writes automatically</w:t>
             </w:r>
           </w:p>
         </w:tc>
         <w:tc>
           <w:tcPr>
             <w:tcW w:type="dxa" w:w="2340"/>
-            <w:tcW w:w="4320" w:type="dxa"/>
+            <w:tcW w:w="4464" w:type="dxa"/>
             <w:shd w:val="clear" w:color="auto" w:fill="FFFFFF"/>
             <w:tcBorders>
               <w:top w:val="single" w:sz="4" w:space="0" w:color="CCCCCC"/>
@@ -3255,7 +3643,7 @@
               <w:rPr>
                 <w:sz w:val="20"/>
               </w:rPr>
-              <w:t>View count only (e.g. Reels view count shown on platform profile)</w:t>
+              <w:t>Video view count extracted via Claude Vision.</w:t>
             </w:r>
           </w:p>
         </w:tc>
@@ -3306,7 +3694,7 @@
         <w:tc>
           <w:tcPr>
             <w:tcW w:type="dxa" w:w="2340"/>
-            <w:tcW w:w="3888" w:type="dxa"/>
+            <w:tcW w:w="3600" w:type="dxa"/>
             <w:shd w:val="clear" w:color="auto" w:fill="F0F4FF"/>
             <w:tcBorders>
               <w:top w:val="single" w:sz="4" w:space="0" w:color="CCCCCC"/>
@@ -3319,17 +3707,17 @@
             <w:r>
               <w:rPr>
                 <w:b w:val="0"/>
-                <w:color w:val="C55A11"/>
-                <w:sz w:val="20"/>
-              </w:rPr>
-              <w:t>User fills manually — DO NOT TOUCH</w:t>
+                <w:color w:val="C00000"/>
+                <w:sz w:val="20"/>
+              </w:rPr>
+              <w:t>User fills manually — NEVER TOUCH</w:t>
             </w:r>
           </w:p>
         </w:tc>
         <w:tc>
           <w:tcPr>
             <w:tcW w:type="dxa" w:w="2340"/>
-            <w:tcW w:w="4320" w:type="dxa"/>
+            <w:tcW w:w="4464" w:type="dxa"/>
             <w:shd w:val="clear" w:color="auto" w:fill="F0F4FF"/>
             <w:tcBorders>
               <w:top w:val="single" w:sz="4" w:space="0" w:color="CCCCCC"/>
@@ -3343,7 +3731,7 @@
               <w:rPr>
                 <w:sz w:val="20"/>
               </w:rPr>
-              <w:t>User fills manually — system must NOT write anything here</w:t>
+              <w:t>User fills manually. System raises exception if it tries to write here.</w:t>
             </w:r>
           </w:p>
         </w:tc>
@@ -3355,7 +3743,697 @@
         <w:pStyle w:val="Heading1"/>
       </w:pPr>
       <w:r>
-        <w:t>6. Supported Platforms</w:t>
+        <w:t>7. How the System Works</w:t>
+      </w:r>
+    </w:p>
+    <w:p>
+      <w:pPr/>
+      <w:r>
+        <w:rPr>
+          <w:b w:val="0"/>
+          <w:i/>
+          <w:color w:val="595959"/>
+          <w:sz w:val="22"/>
+        </w:rPr>
+        <w:t>The system uses NO platform APIs. Instead it uses a real browser + AI vision:</w:t>
+      </w:r>
+    </w:p>
+    <w:p/>
+    <w:tbl>
+      <w:tblPr>
+        <w:tblW w:type="auto" w:w="0"/>
+        <w:jc w:val="left"/>
+        <w:tblLook w:firstColumn="1" w:firstRow="1" w:lastColumn="0" w:lastRow="0" w:noHBand="0" w:noVBand="1" w:val="04A0"/>
+      </w:tblPr>
+      <w:tblGrid>
+        <w:gridCol w:w="3120"/>
+        <w:gridCol w:w="3120"/>
+        <w:gridCol w:w="3120"/>
+      </w:tblGrid>
+      <w:tr>
+        <w:tc>
+          <w:tcPr>
+            <w:tcW w:type="dxa" w:w="3120"/>
+            <w:tcW w:w="720" w:type="dxa"/>
+            <w:shd w:val="clear" w:color="auto" w:fill="1F497D"/>
+            <w:tcBorders>
+              <w:top w:val="single" w:sz="4" w:space="0" w:color="1F497D"/>
+              <w:left w:val="single" w:sz="4" w:space="0" w:color="1F497D"/>
+              <w:bottom w:val="single" w:sz="4" w:space="0" w:color="1F497D"/>
+              <w:right w:val="single" w:sz="4" w:space="0" w:color="1F497D"/>
+            </w:tcBorders>
+          </w:tcPr>
+          <w:p>
+            <w:r>
+              <w:rPr>
+                <w:b/>
+                <w:color w:val="FFFFFF"/>
+                <w:sz w:val="20"/>
+              </w:rPr>
+              <w:t>Step</w:t>
+            </w:r>
+          </w:p>
+        </w:tc>
+        <w:tc>
+          <w:tcPr>
+            <w:tcW w:type="dxa" w:w="3120"/>
+            <w:tcW w:w="5040" w:type="dxa"/>
+            <w:shd w:val="clear" w:color="auto" w:fill="1F497D"/>
+            <w:tcBorders>
+              <w:top w:val="single" w:sz="4" w:space="0" w:color="1F497D"/>
+              <w:left w:val="single" w:sz="4" w:space="0" w:color="1F497D"/>
+              <w:bottom w:val="single" w:sz="4" w:space="0" w:color="1F497D"/>
+              <w:right w:val="single" w:sz="4" w:space="0" w:color="1F497D"/>
+            </w:tcBorders>
+          </w:tcPr>
+          <w:p>
+            <w:r>
+              <w:rPr>
+                <w:b/>
+                <w:color w:val="FFFFFF"/>
+                <w:sz w:val="20"/>
+              </w:rPr>
+              <w:t>What Happens</w:t>
+            </w:r>
+          </w:p>
+        </w:tc>
+        <w:tc>
+          <w:tcPr>
+            <w:tcW w:type="dxa" w:w="3120"/>
+            <w:tcW w:w="5040" w:type="dxa"/>
+            <w:shd w:val="clear" w:color="auto" w:fill="1F497D"/>
+            <w:tcBorders>
+              <w:top w:val="single" w:sz="4" w:space="0" w:color="1F497D"/>
+              <w:left w:val="single" w:sz="4" w:space="0" w:color="1F497D"/>
+              <w:bottom w:val="single" w:sz="4" w:space="0" w:color="1F497D"/>
+              <w:right w:val="single" w:sz="4" w:space="0" w:color="1F497D"/>
+            </w:tcBorders>
+          </w:tcPr>
+          <w:p>
+            <w:r>
+              <w:rPr>
+                <w:b/>
+                <w:color w:val="FFFFFF"/>
+                <w:sz w:val="20"/>
+              </w:rPr>
+              <w:t>Technology Used</w:t>
+            </w:r>
+          </w:p>
+        </w:tc>
+      </w:tr>
+      <w:tr>
+        <w:tc>
+          <w:tcPr>
+            <w:tcW w:type="dxa" w:w="3120"/>
+            <w:tcW w:w="720" w:type="dxa"/>
+            <w:shd w:val="clear" w:color="auto" w:fill="FFFFFF"/>
+            <w:tcBorders>
+              <w:top w:val="single" w:sz="4" w:space="0" w:color="CCCCCC"/>
+              <w:left w:val="single" w:sz="4" w:space="0" w:color="CCCCCC"/>
+              <w:bottom w:val="single" w:sz="4" w:space="0" w:color="CCCCCC"/>
+              <w:right w:val="single" w:sz="4" w:space="0" w:color="CCCCCC"/>
+            </w:tcBorders>
+          </w:tcPr>
+          <w:p>
+            <w:r>
+              <w:rPr>
+                <w:sz w:val="20"/>
+              </w:rPr>
+              <w:t>1</w:t>
+            </w:r>
+          </w:p>
+        </w:tc>
+        <w:tc>
+          <w:tcPr>
+            <w:tcW w:type="dxa" w:w="3120"/>
+            <w:tcW w:w="5040" w:type="dxa"/>
+            <w:shd w:val="clear" w:color="auto" w:fill="FFFFFF"/>
+            <w:tcBorders>
+              <w:top w:val="single" w:sz="4" w:space="0" w:color="CCCCCC"/>
+              <w:left w:val="single" w:sz="4" w:space="0" w:color="CCCCCC"/>
+              <w:bottom w:val="single" w:sz="4" w:space="0" w:color="CCCCCC"/>
+              <w:right w:val="single" w:sz="4" w:space="0" w:color="CCCCCC"/>
+            </w:tcBorders>
+          </w:tcPr>
+          <w:p>
+            <w:r>
+              <w:rPr>
+                <w:sz w:val="20"/>
+              </w:rPr>
+              <w:t>User pastes video URLs into Column F of Lark Sheet</w:t>
+            </w:r>
+          </w:p>
+        </w:tc>
+        <w:tc>
+          <w:tcPr>
+            <w:tcW w:type="dxa" w:w="3120"/>
+            <w:tcW w:w="5040" w:type="dxa"/>
+            <w:shd w:val="clear" w:color="auto" w:fill="FFFFFF"/>
+            <w:tcBorders>
+              <w:top w:val="single" w:sz="4" w:space="0" w:color="CCCCCC"/>
+              <w:left w:val="single" w:sz="4" w:space="0" w:color="CCCCCC"/>
+              <w:bottom w:val="single" w:sz="4" w:space="0" w:color="CCCCCC"/>
+              <w:right w:val="single" w:sz="4" w:space="0" w:color="CCCCCC"/>
+            </w:tcBorders>
+          </w:tcPr>
+          <w:p>
+            <w:r>
+              <w:rPr>
+                <w:sz w:val="20"/>
+              </w:rPr>
+              <w:t>User action</w:t>
+            </w:r>
+          </w:p>
+        </w:tc>
+      </w:tr>
+      <w:tr>
+        <w:tc>
+          <w:tcPr>
+            <w:tcW w:type="dxa" w:w="3120"/>
+            <w:tcW w:w="720" w:type="dxa"/>
+            <w:shd w:val="clear" w:color="auto" w:fill="F0F4FF"/>
+            <w:tcBorders>
+              <w:top w:val="single" w:sz="4" w:space="0" w:color="CCCCCC"/>
+              <w:left w:val="single" w:sz="4" w:space="0" w:color="CCCCCC"/>
+              <w:bottom w:val="single" w:sz="4" w:space="0" w:color="CCCCCC"/>
+              <w:right w:val="single" w:sz="4" w:space="0" w:color="CCCCCC"/>
+            </w:tcBorders>
+          </w:tcPr>
+          <w:p>
+            <w:r>
+              <w:rPr>
+                <w:sz w:val="20"/>
+              </w:rPr>
+              <w:t>2</w:t>
+            </w:r>
+          </w:p>
+        </w:tc>
+        <w:tc>
+          <w:tcPr>
+            <w:tcW w:type="dxa" w:w="3120"/>
+            <w:tcW w:w="5040" w:type="dxa"/>
+            <w:shd w:val="clear" w:color="auto" w:fill="F0F4FF"/>
+            <w:tcBorders>
+              <w:top w:val="single" w:sz="4" w:space="0" w:color="CCCCCC"/>
+              <w:left w:val="single" w:sz="4" w:space="0" w:color="CCCCCC"/>
+              <w:bottom w:val="single" w:sz="4" w:space="0" w:color="CCCCCC"/>
+              <w:right w:val="single" w:sz="4" w:space="0" w:color="CCCCCC"/>
+            </w:tcBorders>
+          </w:tcPr>
+          <w:p>
+            <w:r>
+              <w:rPr>
+                <w:sz w:val="20"/>
+              </w:rPr>
+              <w:t>User runs: python run.py</w:t>
+            </w:r>
+          </w:p>
+        </w:tc>
+        <w:tc>
+          <w:tcPr>
+            <w:tcW w:type="dxa" w:w="3120"/>
+            <w:tcW w:w="5040" w:type="dxa"/>
+            <w:shd w:val="clear" w:color="auto" w:fill="F0F4FF"/>
+            <w:tcBorders>
+              <w:top w:val="single" w:sz="4" w:space="0" w:color="CCCCCC"/>
+              <w:left w:val="single" w:sz="4" w:space="0" w:color="CCCCCC"/>
+              <w:bottom w:val="single" w:sz="4" w:space="0" w:color="CCCCCC"/>
+              <w:right w:val="single" w:sz="4" w:space="0" w:color="CCCCCC"/>
+            </w:tcBorders>
+          </w:tcPr>
+          <w:p>
+            <w:r>
+              <w:rPr>
+                <w:sz w:val="20"/>
+              </w:rPr>
+              <w:t>Terminal command</w:t>
+            </w:r>
+          </w:p>
+        </w:tc>
+      </w:tr>
+      <w:tr>
+        <w:tc>
+          <w:tcPr>
+            <w:tcW w:type="dxa" w:w="3120"/>
+            <w:tcW w:w="720" w:type="dxa"/>
+            <w:shd w:val="clear" w:color="auto" w:fill="FFFFFF"/>
+            <w:tcBorders>
+              <w:top w:val="single" w:sz="4" w:space="0" w:color="CCCCCC"/>
+              <w:left w:val="single" w:sz="4" w:space="0" w:color="CCCCCC"/>
+              <w:bottom w:val="single" w:sz="4" w:space="0" w:color="CCCCCC"/>
+              <w:right w:val="single" w:sz="4" w:space="0" w:color="CCCCCC"/>
+            </w:tcBorders>
+          </w:tcPr>
+          <w:p>
+            <w:r>
+              <w:rPr>
+                <w:sz w:val="20"/>
+              </w:rPr>
+              <w:t>3</w:t>
+            </w:r>
+          </w:p>
+        </w:tc>
+        <w:tc>
+          <w:tcPr>
+            <w:tcW w:type="dxa" w:w="3120"/>
+            <w:tcW w:w="5040" w:type="dxa"/>
+            <w:shd w:val="clear" w:color="auto" w:fill="FFFFFF"/>
+            <w:tcBorders>
+              <w:top w:val="single" w:sz="4" w:space="0" w:color="CCCCCC"/>
+              <w:left w:val="single" w:sz="4" w:space="0" w:color="CCCCCC"/>
+              <w:bottom w:val="single" w:sz="4" w:space="0" w:color="CCCCCC"/>
+              <w:right w:val="single" w:sz="4" w:space="0" w:color="CCCCCC"/>
+            </w:tcBorders>
+          </w:tcPr>
+          <w:p>
+            <w:r>
+              <w:rPr>
+                <w:sz w:val="20"/>
+              </w:rPr>
+              <w:t>System reads Lark Sheet — finds rows where Column F has a URL but A/D/E/G are empty</w:t>
+            </w:r>
+          </w:p>
+        </w:tc>
+        <w:tc>
+          <w:tcPr>
+            <w:tcW w:type="dxa" w:w="3120"/>
+            <w:tcW w:w="5040" w:type="dxa"/>
+            <w:shd w:val="clear" w:color="auto" w:fill="FFFFFF"/>
+            <w:tcBorders>
+              <w:top w:val="single" w:sz="4" w:space="0" w:color="CCCCCC"/>
+              <w:left w:val="single" w:sz="4" w:space="0" w:color="CCCCCC"/>
+              <w:bottom w:val="single" w:sz="4" w:space="0" w:color="CCCCCC"/>
+              <w:right w:val="single" w:sz="4" w:space="0" w:color="CCCCCC"/>
+            </w:tcBorders>
+          </w:tcPr>
+          <w:p>
+            <w:r>
+              <w:rPr>
+                <w:sz w:val="20"/>
+              </w:rPr>
+              <w:t>lark_reader.py + Lark API</w:t>
+            </w:r>
+          </w:p>
+        </w:tc>
+      </w:tr>
+      <w:tr>
+        <w:tc>
+          <w:tcPr>
+            <w:tcW w:type="dxa" w:w="3120"/>
+            <w:tcW w:w="720" w:type="dxa"/>
+            <w:shd w:val="clear" w:color="auto" w:fill="F0F4FF"/>
+            <w:tcBorders>
+              <w:top w:val="single" w:sz="4" w:space="0" w:color="CCCCCC"/>
+              <w:left w:val="single" w:sz="4" w:space="0" w:color="CCCCCC"/>
+              <w:bottom w:val="single" w:sz="4" w:space="0" w:color="CCCCCC"/>
+              <w:right w:val="single" w:sz="4" w:space="0" w:color="CCCCCC"/>
+            </w:tcBorders>
+          </w:tcPr>
+          <w:p>
+            <w:r>
+              <w:rPr>
+                <w:sz w:val="20"/>
+              </w:rPr>
+              <w:t>4</w:t>
+            </w:r>
+          </w:p>
+        </w:tc>
+        <w:tc>
+          <w:tcPr>
+            <w:tcW w:type="dxa" w:w="3120"/>
+            <w:tcW w:w="5040" w:type="dxa"/>
+            <w:shd w:val="clear" w:color="auto" w:fill="F0F4FF"/>
+            <w:tcBorders>
+              <w:top w:val="single" w:sz="4" w:space="0" w:color="CCCCCC"/>
+              <w:left w:val="single" w:sz="4" w:space="0" w:color="CCCCCC"/>
+              <w:bottom w:val="single" w:sz="4" w:space="0" w:color="CCCCCC"/>
+              <w:right w:val="single" w:sz="4" w:space="0" w:color="CCCCCC"/>
+            </w:tcBorders>
+          </w:tcPr>
+          <w:p>
+            <w:r>
+              <w:rPr>
+                <w:sz w:val="20"/>
+              </w:rPr>
+              <w:t>For each URL, system opens the video in a real Chrome browser</w:t>
+            </w:r>
+          </w:p>
+        </w:tc>
+        <w:tc>
+          <w:tcPr>
+            <w:tcW w:type="dxa" w:w="3120"/>
+            <w:tcW w:w="5040" w:type="dxa"/>
+            <w:shd w:val="clear" w:color="auto" w:fill="F0F4FF"/>
+            <w:tcBorders>
+              <w:top w:val="single" w:sz="4" w:space="0" w:color="CCCCCC"/>
+              <w:left w:val="single" w:sz="4" w:space="0" w:color="CCCCCC"/>
+              <w:bottom w:val="single" w:sz="4" w:space="0" w:color="CCCCCC"/>
+              <w:right w:val="single" w:sz="4" w:space="0" w:color="CCCCCC"/>
+            </w:tcBorders>
+          </w:tcPr>
+          <w:p>
+            <w:r>
+              <w:rPr>
+                <w:sz w:val="20"/>
+              </w:rPr>
+              <w:t>Playwright + persistent Chrome profile</w:t>
+            </w:r>
+          </w:p>
+        </w:tc>
+      </w:tr>
+      <w:tr>
+        <w:tc>
+          <w:tcPr>
+            <w:tcW w:type="dxa" w:w="3120"/>
+            <w:tcW w:w="720" w:type="dxa"/>
+            <w:shd w:val="clear" w:color="auto" w:fill="FFFFFF"/>
+            <w:tcBorders>
+              <w:top w:val="single" w:sz="4" w:space="0" w:color="CCCCCC"/>
+              <w:left w:val="single" w:sz="4" w:space="0" w:color="CCCCCC"/>
+              <w:bottom w:val="single" w:sz="4" w:space="0" w:color="CCCCCC"/>
+              <w:right w:val="single" w:sz="4" w:space="0" w:color="CCCCCC"/>
+            </w:tcBorders>
+          </w:tcPr>
+          <w:p>
+            <w:r>
+              <w:rPr>
+                <w:sz w:val="20"/>
+              </w:rPr>
+              <w:t>5</w:t>
+            </w:r>
+          </w:p>
+        </w:tc>
+        <w:tc>
+          <w:tcPr>
+            <w:tcW w:type="dxa" w:w="3120"/>
+            <w:tcW w:w="5040" w:type="dxa"/>
+            <w:shd w:val="clear" w:color="auto" w:fill="FFFFFF"/>
+            <w:tcBorders>
+              <w:top w:val="single" w:sz="4" w:space="0" w:color="CCCCCC"/>
+              <w:left w:val="single" w:sz="4" w:space="0" w:color="CCCCCC"/>
+              <w:bottom w:val="single" w:sz="4" w:space="0" w:color="CCCCCC"/>
+              <w:right w:val="single" w:sz="4" w:space="0" w:color="CCCCCC"/>
+            </w:tcBorders>
+          </w:tcPr>
+          <w:p>
+            <w:r>
+              <w:rPr>
+                <w:sz w:val="20"/>
+              </w:rPr>
+              <w:t>System takes a screenshot of the video page</w:t>
+            </w:r>
+          </w:p>
+        </w:tc>
+        <w:tc>
+          <w:tcPr>
+            <w:tcW w:type="dxa" w:w="3120"/>
+            <w:tcW w:w="5040" w:type="dxa"/>
+            <w:shd w:val="clear" w:color="auto" w:fill="FFFFFF"/>
+            <w:tcBorders>
+              <w:top w:val="single" w:sz="4" w:space="0" w:color="CCCCCC"/>
+              <w:left w:val="single" w:sz="4" w:space="0" w:color="CCCCCC"/>
+              <w:bottom w:val="single" w:sz="4" w:space="0" w:color="CCCCCC"/>
+              <w:right w:val="single" w:sz="4" w:space="0" w:color="CCCCCC"/>
+            </w:tcBorders>
+          </w:tcPr>
+          <w:p>
+            <w:r>
+              <w:rPr>
+                <w:sz w:val="20"/>
+              </w:rPr>
+              <w:t>Playwright screenshot</w:t>
+            </w:r>
+          </w:p>
+        </w:tc>
+      </w:tr>
+      <w:tr>
+        <w:tc>
+          <w:tcPr>
+            <w:tcW w:type="dxa" w:w="3120"/>
+            <w:tcW w:w="720" w:type="dxa"/>
+            <w:shd w:val="clear" w:color="auto" w:fill="F0F4FF"/>
+            <w:tcBorders>
+              <w:top w:val="single" w:sz="4" w:space="0" w:color="CCCCCC"/>
+              <w:left w:val="single" w:sz="4" w:space="0" w:color="CCCCCC"/>
+              <w:bottom w:val="single" w:sz="4" w:space="0" w:color="CCCCCC"/>
+              <w:right w:val="single" w:sz="4" w:space="0" w:color="CCCCCC"/>
+            </w:tcBorders>
+          </w:tcPr>
+          <w:p>
+            <w:r>
+              <w:rPr>
+                <w:sz w:val="20"/>
+              </w:rPr>
+              <w:t>6</w:t>
+            </w:r>
+          </w:p>
+        </w:tc>
+        <w:tc>
+          <w:tcPr>
+            <w:tcW w:type="dxa" w:w="3120"/>
+            <w:tcW w:w="5040" w:type="dxa"/>
+            <w:shd w:val="clear" w:color="auto" w:fill="F0F4FF"/>
+            <w:tcBorders>
+              <w:top w:val="single" w:sz="4" w:space="0" w:color="CCCCCC"/>
+              <w:left w:val="single" w:sz="4" w:space="0" w:color="CCCCCC"/>
+              <w:bottom w:val="single" w:sz="4" w:space="0" w:color="CCCCCC"/>
+              <w:right w:val="single" w:sz="4" w:space="0" w:color="CCCCCC"/>
+            </w:tcBorders>
+          </w:tcPr>
+          <w:p>
+            <w:r>
+              <w:rPr>
+                <w:sz w:val="20"/>
+              </w:rPr>
+              <w:t>Claude AI Vision analyses the screenshot and extracts: posted date, caption, view count</w:t>
+            </w:r>
+          </w:p>
+        </w:tc>
+        <w:tc>
+          <w:tcPr>
+            <w:tcW w:type="dxa" w:w="3120"/>
+            <w:tcW w:w="5040" w:type="dxa"/>
+            <w:shd w:val="clear" w:color="auto" w:fill="F0F4FF"/>
+            <w:tcBorders>
+              <w:top w:val="single" w:sz="4" w:space="0" w:color="CCCCCC"/>
+              <w:left w:val="single" w:sz="4" w:space="0" w:color="CCCCCC"/>
+              <w:bottom w:val="single" w:sz="4" w:space="0" w:color="CCCCCC"/>
+              <w:right w:val="single" w:sz="4" w:space="0" w:color="CCCCCC"/>
+            </w:tcBorders>
+          </w:tcPr>
+          <w:p>
+            <w:r>
+              <w:rPr>
+                <w:sz w:val="20"/>
+              </w:rPr>
+              <w:t>claude-haiku-4-5 vision model</w:t>
+            </w:r>
+          </w:p>
+        </w:tc>
+      </w:tr>
+      <w:tr>
+        <w:tc>
+          <w:tcPr>
+            <w:tcW w:type="dxa" w:w="3120"/>
+            <w:tcW w:w="720" w:type="dxa"/>
+            <w:shd w:val="clear" w:color="auto" w:fill="FFFFFF"/>
+            <w:tcBorders>
+              <w:top w:val="single" w:sz="4" w:space="0" w:color="CCCCCC"/>
+              <w:left w:val="single" w:sz="4" w:space="0" w:color="CCCCCC"/>
+              <w:bottom w:val="single" w:sz="4" w:space="0" w:color="CCCCCC"/>
+              <w:right w:val="single" w:sz="4" w:space="0" w:color="CCCCCC"/>
+            </w:tcBorders>
+          </w:tcPr>
+          <w:p>
+            <w:r>
+              <w:rPr>
+                <w:sz w:val="20"/>
+              </w:rPr>
+              <w:t>7</w:t>
+            </w:r>
+          </w:p>
+        </w:tc>
+        <w:tc>
+          <w:tcPr>
+            <w:tcW w:type="dxa" w:w="3120"/>
+            <w:tcW w:w="5040" w:type="dxa"/>
+            <w:shd w:val="clear" w:color="auto" w:fill="FFFFFF"/>
+            <w:tcBorders>
+              <w:top w:val="single" w:sz="4" w:space="0" w:color="CCCCCC"/>
+              <w:left w:val="single" w:sz="4" w:space="0" w:color="CCCCCC"/>
+              <w:bottom w:val="single" w:sz="4" w:space="0" w:color="CCCCCC"/>
+              <w:right w:val="single" w:sz="4" w:space="0" w:color="CCCCCC"/>
+            </w:tcBorders>
+          </w:tcPr>
+          <w:p>
+            <w:r>
+              <w:rPr>
+                <w:sz w:val="20"/>
+              </w:rPr>
+              <w:t>System cleans the caption (removes all hashtags)</w:t>
+            </w:r>
+          </w:p>
+        </w:tc>
+        <w:tc>
+          <w:tcPr>
+            <w:tcW w:type="dxa" w:w="3120"/>
+            <w:tcW w:w="5040" w:type="dxa"/>
+            <w:shd w:val="clear" w:color="auto" w:fill="FFFFFF"/>
+            <w:tcBorders>
+              <w:top w:val="single" w:sz="4" w:space="0" w:color="CCCCCC"/>
+              <w:left w:val="single" w:sz="4" w:space="0" w:color="CCCCCC"/>
+              <w:bottom w:val="single" w:sz="4" w:space="0" w:color="CCCCCC"/>
+              <w:right w:val="single" w:sz="4" w:space="0" w:color="CCCCCC"/>
+            </w:tcBorders>
+          </w:tcPr>
+          <w:p>
+            <w:r>
+              <w:rPr>
+                <w:sz w:val="20"/>
+              </w:rPr>
+              <w:t>processor.py with Unicode regex</w:t>
+            </w:r>
+          </w:p>
+        </w:tc>
+      </w:tr>
+      <w:tr>
+        <w:tc>
+          <w:tcPr>
+            <w:tcW w:type="dxa" w:w="3120"/>
+            <w:tcW w:w="720" w:type="dxa"/>
+            <w:shd w:val="clear" w:color="auto" w:fill="F0F4FF"/>
+            <w:tcBorders>
+              <w:top w:val="single" w:sz="4" w:space="0" w:color="CCCCCC"/>
+              <w:left w:val="single" w:sz="4" w:space="0" w:color="CCCCCC"/>
+              <w:bottom w:val="single" w:sz="4" w:space="0" w:color="CCCCCC"/>
+              <w:right w:val="single" w:sz="4" w:space="0" w:color="CCCCCC"/>
+            </w:tcBorders>
+          </w:tcPr>
+          <w:p>
+            <w:r>
+              <w:rPr>
+                <w:sz w:val="20"/>
+              </w:rPr>
+              <w:t>8</w:t>
+            </w:r>
+          </w:p>
+        </w:tc>
+        <w:tc>
+          <w:tcPr>
+            <w:tcW w:type="dxa" w:w="3120"/>
+            <w:tcW w:w="5040" w:type="dxa"/>
+            <w:shd w:val="clear" w:color="auto" w:fill="F0F4FF"/>
+            <w:tcBorders>
+              <w:top w:val="single" w:sz="4" w:space="0" w:color="CCCCCC"/>
+              <w:left w:val="single" w:sz="4" w:space="0" w:color="CCCCCC"/>
+              <w:bottom w:val="single" w:sz="4" w:space="0" w:color="CCCCCC"/>
+              <w:right w:val="single" w:sz="4" w:space="0" w:color="CCCCCC"/>
+            </w:tcBorders>
+          </w:tcPr>
+          <w:p>
+            <w:r>
+              <w:rPr>
+                <w:sz w:val="20"/>
+              </w:rPr>
+              <w:t>System writes data to columns A, D, E, G only</w:t>
+            </w:r>
+          </w:p>
+        </w:tc>
+        <w:tc>
+          <w:tcPr>
+            <w:tcW w:type="dxa" w:w="3120"/>
+            <w:tcW w:w="5040" w:type="dxa"/>
+            <w:shd w:val="clear" w:color="auto" w:fill="F0F4FF"/>
+            <w:tcBorders>
+              <w:top w:val="single" w:sz="4" w:space="0" w:color="CCCCCC"/>
+              <w:left w:val="single" w:sz="4" w:space="0" w:color="CCCCCC"/>
+              <w:bottom w:val="single" w:sz="4" w:space="0" w:color="CCCCCC"/>
+              <w:right w:val="single" w:sz="4" w:space="0" w:color="CCCCCC"/>
+            </w:tcBorders>
+          </w:tcPr>
+          <w:p>
+            <w:r>
+              <w:rPr>
+                <w:sz w:val="20"/>
+              </w:rPr>
+              <w:t>lark_writer.py with hard allowlist</w:t>
+            </w:r>
+          </w:p>
+        </w:tc>
+      </w:tr>
+      <w:tr>
+        <w:tc>
+          <w:tcPr>
+            <w:tcW w:type="dxa" w:w="3120"/>
+            <w:tcW w:w="720" w:type="dxa"/>
+            <w:shd w:val="clear" w:color="auto" w:fill="FFFFFF"/>
+            <w:tcBorders>
+              <w:top w:val="single" w:sz="4" w:space="0" w:color="CCCCCC"/>
+              <w:left w:val="single" w:sz="4" w:space="0" w:color="CCCCCC"/>
+              <w:bottom w:val="single" w:sz="4" w:space="0" w:color="CCCCCC"/>
+              <w:right w:val="single" w:sz="4" w:space="0" w:color="CCCCCC"/>
+            </w:tcBorders>
+          </w:tcPr>
+          <w:p>
+            <w:r>
+              <w:rPr>
+                <w:sz w:val="20"/>
+              </w:rPr>
+              <w:t>9</w:t>
+            </w:r>
+          </w:p>
+        </w:tc>
+        <w:tc>
+          <w:tcPr>
+            <w:tcW w:type="dxa" w:w="3120"/>
+            <w:tcW w:w="5040" w:type="dxa"/>
+            <w:shd w:val="clear" w:color="auto" w:fill="FFFFFF"/>
+            <w:tcBorders>
+              <w:top w:val="single" w:sz="4" w:space="0" w:color="CCCCCC"/>
+              <w:left w:val="single" w:sz="4" w:space="0" w:color="CCCCCC"/>
+              <w:bottom w:val="single" w:sz="4" w:space="0" w:color="CCCCCC"/>
+              <w:right w:val="single" w:sz="4" w:space="0" w:color="CCCCCC"/>
+            </w:tcBorders>
+          </w:tcPr>
+          <w:p>
+            <w:r>
+              <w:rPr>
+                <w:sz w:val="20"/>
+              </w:rPr>
+              <w:t>System prints a run summary showing success/failure for each URL</w:t>
+            </w:r>
+          </w:p>
+        </w:tc>
+        <w:tc>
+          <w:tcPr>
+            <w:tcW w:type="dxa" w:w="3120"/>
+            <w:tcW w:w="5040" w:type="dxa"/>
+            <w:shd w:val="clear" w:color="auto" w:fill="FFFFFF"/>
+            <w:tcBorders>
+              <w:top w:val="single" w:sz="4" w:space="0" w:color="CCCCCC"/>
+              <w:left w:val="single" w:sz="4" w:space="0" w:color="CCCCCC"/>
+              <w:bottom w:val="single" w:sz="4" w:space="0" w:color="CCCCCC"/>
+              <w:right w:val="single" w:sz="4" w:space="0" w:color="CCCCCC"/>
+            </w:tcBorders>
+          </w:tcPr>
+          <w:p>
+            <w:r>
+              <w:rPr>
+                <w:sz w:val="20"/>
+              </w:rPr>
+              <w:t>reporter.py</w:t>
+            </w:r>
+          </w:p>
+        </w:tc>
+      </w:tr>
+    </w:tbl>
+    <w:p/>
+    <w:p>
+      <w:pPr>
+        <w:pStyle w:val="Heading1"/>
+      </w:pPr>
+      <w:r>
+        <w:t>8. Supported Platforms</w:t>
       </w:r>
     </w:p>
     <w:tbl>
@@ -3365,16 +4443,17 @@
         <w:tblLook w:firstColumn="1" w:firstRow="1" w:lastColumn="0" w:lastRow="0" w:noHBand="0" w:noVBand="1" w:val="04A0"/>
       </w:tblPr>
       <w:tblGrid>
-        <w:gridCol w:w="2340"/>
-        <w:gridCol w:w="2340"/>
-        <w:gridCol w:w="2340"/>
-        <w:gridCol w:w="2340"/>
+        <w:gridCol w:w="1872"/>
+        <w:gridCol w:w="1872"/>
+        <w:gridCol w:w="1872"/>
+        <w:gridCol w:w="1872"/>
+        <w:gridCol w:w="1872"/>
       </w:tblGrid>
       <w:tr>
         <w:tc>
           <w:tcPr>
-            <w:tcW w:type="dxa" w:w="2340"/>
-            <w:tcW w:w="1728" w:type="dxa"/>
+            <w:tcW w:type="dxa" w:w="1872"/>
+            <w:tcW w:w="1584" w:type="dxa"/>
             <w:shd w:val="clear" w:color="auto" w:fill="1F497D"/>
             <w:tcBorders>
               <w:top w:val="single" w:sz="4" w:space="0" w:color="1F497D"/>
@@ -3396,8 +4475,8 @@
         </w:tc>
         <w:tc>
           <w:tcPr>
-            <w:tcW w:type="dxa" w:w="2340"/>
-            <w:tcW w:w="1728" w:type="dxa"/>
+            <w:tcW w:type="dxa" w:w="1872"/>
+            <w:tcW w:w="1584" w:type="dxa"/>
             <w:shd w:val="clear" w:color="auto" w:fill="1F497D"/>
             <w:tcBorders>
               <w:top w:val="single" w:sz="4" w:space="0" w:color="1F497D"/>
@@ -3419,8 +4498,8 @@
         </w:tc>
         <w:tc>
           <w:tcPr>
-            <w:tcW w:type="dxa" w:w="2340"/>
-            <w:tcW w:w="3456" w:type="dxa"/>
+            <w:tcW w:type="dxa" w:w="1872"/>
+            <w:tcW w:w="1872" w:type="dxa"/>
             <w:shd w:val="clear" w:color="auto" w:fill="1F497D"/>
             <w:tcBorders>
               <w:top w:val="single" w:sz="4" w:space="0" w:color="1F497D"/>
@@ -3436,14 +4515,14 @@
                 <w:color w:val="FFFFFF"/>
                 <w:sz w:val="20"/>
               </w:rPr>
-              <w:t>Column G — View Count Source</w:t>
-            </w:r>
-          </w:p>
-        </w:tc>
-        <w:tc>
-          <w:tcPr>
-            <w:tcW w:type="dxa" w:w="2340"/>
-            <w:tcW w:w="3888" w:type="dxa"/>
+              <w:t>Column G (Views)</w:t>
+            </w:r>
+          </w:p>
+        </w:tc>
+        <w:tc>
+          <w:tcPr>
+            <w:tcW w:type="dxa" w:w="1872"/>
+            <w:tcW w:w="3024" w:type="dxa"/>
             <w:shd w:val="clear" w:color="auto" w:fill="1F497D"/>
             <w:tcBorders>
               <w:top w:val="single" w:sz="4" w:space="0" w:color="1F497D"/>
@@ -3459,7 +4538,30 @@
                 <w:color w:val="FFFFFF"/>
                 <w:sz w:val="20"/>
               </w:rPr>
-              <w:t>Column D — Caption Source</w:t>
+              <w:t>Column D (Caption)</w:t>
+            </w:r>
+          </w:p>
+        </w:tc>
+        <w:tc>
+          <w:tcPr>
+            <w:tcW w:type="dxa" w:w="1872"/>
+            <w:tcW w:w="2736" w:type="dxa"/>
+            <w:shd w:val="clear" w:color="auto" w:fill="1F497D"/>
+            <w:tcBorders>
+              <w:top w:val="single" w:sz="4" w:space="0" w:color="1F497D"/>
+              <w:left w:val="single" w:sz="4" w:space="0" w:color="1F497D"/>
+              <w:bottom w:val="single" w:sz="4" w:space="0" w:color="1F497D"/>
+              <w:right w:val="single" w:sz="4" w:space="0" w:color="1F497D"/>
+            </w:tcBorders>
+          </w:tcPr>
+          <w:p>
+            <w:r>
+              <w:rPr>
+                <w:b/>
+                <w:color w:val="FFFFFF"/>
+                <w:sz w:val="20"/>
+              </w:rPr>
+              <w:t>Data Source</w:t>
             </w:r>
           </w:p>
         </w:tc>
@@ -3467,8 +4569,8 @@
       <w:tr>
         <w:tc>
           <w:tcPr>
-            <w:tcW w:type="dxa" w:w="2340"/>
-            <w:tcW w:w="1728" w:type="dxa"/>
+            <w:tcW w:type="dxa" w:w="1872"/>
+            <w:tcW w:w="1584" w:type="dxa"/>
             <w:shd w:val="clear" w:color="auto" w:fill="FFFFFF"/>
             <w:tcBorders>
               <w:top w:val="single" w:sz="4" w:space="0" w:color="CCCCCC"/>
@@ -3488,8 +4590,8 @@
         </w:tc>
         <w:tc>
           <w:tcPr>
-            <w:tcW w:type="dxa" w:w="2340"/>
-            <w:tcW w:w="1728" w:type="dxa"/>
+            <w:tcW w:type="dxa" w:w="1872"/>
+            <w:tcW w:w="1584" w:type="dxa"/>
             <w:shd w:val="clear" w:color="auto" w:fill="FFFFFF"/>
             <w:tcBorders>
               <w:top w:val="single" w:sz="4" w:space="0" w:color="CCCCCC"/>
@@ -3509,8 +4611,8 @@
         </w:tc>
         <w:tc>
           <w:tcPr>
-            <w:tcW w:type="dxa" w:w="2340"/>
-            <w:tcW w:w="3456" w:type="dxa"/>
+            <w:tcW w:type="dxa" w:w="1872"/>
+            <w:tcW w:w="1872" w:type="dxa"/>
             <w:shd w:val="clear" w:color="auto" w:fill="FFFFFF"/>
             <w:tcBorders>
               <w:top w:val="single" w:sz="4" w:space="0" w:color="CCCCCC"/>
@@ -3524,14 +4626,14 @@
               <w:rPr>
                 <w:sz w:val="20"/>
               </w:rPr>
-              <w:t>Reels view count on profile</w:t>
-            </w:r>
-          </w:p>
-        </w:tc>
-        <w:tc>
-          <w:tcPr>
-            <w:tcW w:type="dxa" w:w="2340"/>
-            <w:tcW w:w="3888" w:type="dxa"/>
+              <w:t>Reels view count</w:t>
+            </w:r>
+          </w:p>
+        </w:tc>
+        <w:tc>
+          <w:tcPr>
+            <w:tcW w:type="dxa" w:w="1872"/>
+            <w:tcW w:w="3024" w:type="dxa"/>
             <w:shd w:val="clear" w:color="auto" w:fill="FFFFFF"/>
             <w:tcBorders>
               <w:top w:val="single" w:sz="4" w:space="0" w:color="CCCCCC"/>
@@ -3546,6 +4648,27 @@
                 <w:sz w:val="20"/>
               </w:rPr>
               <w:t>Post caption — hashtags removed</w:t>
+            </w:r>
+          </w:p>
+        </w:tc>
+        <w:tc>
+          <w:tcPr>
+            <w:tcW w:type="dxa" w:w="1872"/>
+            <w:tcW w:w="2736" w:type="dxa"/>
+            <w:shd w:val="clear" w:color="auto" w:fill="FFFFFF"/>
+            <w:tcBorders>
+              <w:top w:val="single" w:sz="4" w:space="0" w:color="CCCCCC"/>
+              <w:left w:val="single" w:sz="4" w:space="0" w:color="CCCCCC"/>
+              <w:bottom w:val="single" w:sz="4" w:space="0" w:color="CCCCCC"/>
+              <w:right w:val="single" w:sz="4" w:space="0" w:color="CCCCCC"/>
+            </w:tcBorders>
+          </w:tcPr>
+          <w:p>
+            <w:r>
+              <w:rPr>
+                <w:sz w:val="20"/>
+              </w:rPr>
+              <w:t>Playwright + Claude Vision</w:t>
             </w:r>
           </w:p>
         </w:tc>
@@ -3553,8 +4676,8 @@
       <w:tr>
         <w:tc>
           <w:tcPr>
-            <w:tcW w:type="dxa" w:w="2340"/>
-            <w:tcW w:w="1728" w:type="dxa"/>
+            <w:tcW w:type="dxa" w:w="1872"/>
+            <w:tcW w:w="1584" w:type="dxa"/>
             <w:shd w:val="clear" w:color="auto" w:fill="F0F4FF"/>
             <w:tcBorders>
               <w:top w:val="single" w:sz="4" w:space="0" w:color="CCCCCC"/>
@@ -3574,8 +4697,8 @@
         </w:tc>
         <w:tc>
           <w:tcPr>
-            <w:tcW w:type="dxa" w:w="2340"/>
-            <w:tcW w:w="1728" w:type="dxa"/>
+            <w:tcW w:type="dxa" w:w="1872"/>
+            <w:tcW w:w="1584" w:type="dxa"/>
             <w:shd w:val="clear" w:color="auto" w:fill="F0F4FF"/>
             <w:tcBorders>
               <w:top w:val="single" w:sz="4" w:space="0" w:color="CCCCCC"/>
@@ -3595,8 +4718,8 @@
         </w:tc>
         <w:tc>
           <w:tcPr>
-            <w:tcW w:type="dxa" w:w="2340"/>
-            <w:tcW w:w="3456" w:type="dxa"/>
+            <w:tcW w:type="dxa" w:w="1872"/>
+            <w:tcW w:w="1872" w:type="dxa"/>
             <w:shd w:val="clear" w:color="auto" w:fill="F0F4FF"/>
             <w:tcBorders>
               <w:top w:val="single" w:sz="4" w:space="0" w:color="CCCCCC"/>
@@ -3616,8 +4739,8 @@
         </w:tc>
         <w:tc>
           <w:tcPr>
-            <w:tcW w:type="dxa" w:w="2340"/>
-            <w:tcW w:w="3888" w:type="dxa"/>
+            <w:tcW w:type="dxa" w:w="1872"/>
+            <w:tcW w:w="3024" w:type="dxa"/>
             <w:shd w:val="clear" w:color="auto" w:fill="F0F4FF"/>
             <w:tcBorders>
               <w:top w:val="single" w:sz="4" w:space="0" w:color="CCCCCC"/>
@@ -3632,6 +4755,27 @@
                 <w:sz w:val="20"/>
               </w:rPr>
               <w:t>Video description — hashtags removed</w:t>
+            </w:r>
+          </w:p>
+        </w:tc>
+        <w:tc>
+          <w:tcPr>
+            <w:tcW w:type="dxa" w:w="1872"/>
+            <w:tcW w:w="2736" w:type="dxa"/>
+            <w:shd w:val="clear" w:color="auto" w:fill="F0F4FF"/>
+            <w:tcBorders>
+              <w:top w:val="single" w:sz="4" w:space="0" w:color="CCCCCC"/>
+              <w:left w:val="single" w:sz="4" w:space="0" w:color="CCCCCC"/>
+              <w:bottom w:val="single" w:sz="4" w:space="0" w:color="CCCCCC"/>
+              <w:right w:val="single" w:sz="4" w:space="0" w:color="CCCCCC"/>
+            </w:tcBorders>
+          </w:tcPr>
+          <w:p>
+            <w:r>
+              <w:rPr>
+                <w:sz w:val="20"/>
+              </w:rPr>
+              <w:t>Playwright + Claude Vision</w:t>
             </w:r>
           </w:p>
         </w:tc>
@@ -3639,8 +4783,8 @@
       <w:tr>
         <w:tc>
           <w:tcPr>
-            <w:tcW w:type="dxa" w:w="2340"/>
-            <w:tcW w:w="1728" w:type="dxa"/>
+            <w:tcW w:type="dxa" w:w="1872"/>
+            <w:tcW w:w="1584" w:type="dxa"/>
             <w:shd w:val="clear" w:color="auto" w:fill="FFFFFF"/>
             <w:tcBorders>
               <w:top w:val="single" w:sz="4" w:space="0" w:color="CCCCCC"/>
@@ -3660,8 +4804,8 @@
         </w:tc>
         <w:tc>
           <w:tcPr>
-            <w:tcW w:type="dxa" w:w="2340"/>
-            <w:tcW w:w="1728" w:type="dxa"/>
+            <w:tcW w:type="dxa" w:w="1872"/>
+            <w:tcW w:w="1584" w:type="dxa"/>
             <w:shd w:val="clear" w:color="auto" w:fill="FFFFFF"/>
             <w:tcBorders>
               <w:top w:val="single" w:sz="4" w:space="0" w:color="CCCCCC"/>
@@ -3681,8 +4825,8 @@
         </w:tc>
         <w:tc>
           <w:tcPr>
-            <w:tcW w:type="dxa" w:w="2340"/>
-            <w:tcW w:w="3456" w:type="dxa"/>
+            <w:tcW w:type="dxa" w:w="1872"/>
+            <w:tcW w:w="1872" w:type="dxa"/>
             <w:shd w:val="clear" w:color="auto" w:fill="FFFFFF"/>
             <w:tcBorders>
               <w:top w:val="single" w:sz="4" w:space="0" w:color="CCCCCC"/>
@@ -3702,8 +4846,8 @@
         </w:tc>
         <w:tc>
           <w:tcPr>
-            <w:tcW w:type="dxa" w:w="2340"/>
-            <w:tcW w:w="3888" w:type="dxa"/>
+            <w:tcW w:type="dxa" w:w="1872"/>
+            <w:tcW w:w="3024" w:type="dxa"/>
             <w:shd w:val="clear" w:color="auto" w:fill="FFFFFF"/>
             <w:tcBorders>
               <w:top w:val="single" w:sz="4" w:space="0" w:color="CCCCCC"/>
@@ -3718,6 +4862,27 @@
                 <w:sz w:val="20"/>
               </w:rPr>
               <w:t>Post caption — hashtags removed</w:t>
+            </w:r>
+          </w:p>
+        </w:tc>
+        <w:tc>
+          <w:tcPr>
+            <w:tcW w:type="dxa" w:w="1872"/>
+            <w:tcW w:w="2736" w:type="dxa"/>
+            <w:shd w:val="clear" w:color="auto" w:fill="FFFFFF"/>
+            <w:tcBorders>
+              <w:top w:val="single" w:sz="4" w:space="0" w:color="CCCCCC"/>
+              <w:left w:val="single" w:sz="4" w:space="0" w:color="CCCCCC"/>
+              <w:bottom w:val="single" w:sz="4" w:space="0" w:color="CCCCCC"/>
+              <w:right w:val="single" w:sz="4" w:space="0" w:color="CCCCCC"/>
+            </w:tcBorders>
+          </w:tcPr>
+          <w:p>
+            <w:r>
+              <w:rPr>
+                <w:sz w:val="20"/>
+              </w:rPr>
+              <w:t>Playwright + Claude Vision</w:t>
             </w:r>
           </w:p>
         </w:tc>
@@ -3725,8 +4890,8 @@
       <w:tr>
         <w:tc>
           <w:tcPr>
-            <w:tcW w:type="dxa" w:w="2340"/>
-            <w:tcW w:w="1728" w:type="dxa"/>
+            <w:tcW w:type="dxa" w:w="1872"/>
+            <w:tcW w:w="1584" w:type="dxa"/>
             <w:shd w:val="clear" w:color="auto" w:fill="F0F4FF"/>
             <w:tcBorders>
               <w:top w:val="single" w:sz="4" w:space="0" w:color="CCCCCC"/>
@@ -3746,8 +4911,8 @@
         </w:tc>
         <w:tc>
           <w:tcPr>
-            <w:tcW w:type="dxa" w:w="2340"/>
-            <w:tcW w:w="1728" w:type="dxa"/>
+            <w:tcW w:type="dxa" w:w="1872"/>
+            <w:tcW w:w="1584" w:type="dxa"/>
             <w:shd w:val="clear" w:color="auto" w:fill="F0F4FF"/>
             <w:tcBorders>
               <w:top w:val="single" w:sz="4" w:space="0" w:color="CCCCCC"/>
@@ -3767,8 +4932,8 @@
         </w:tc>
         <w:tc>
           <w:tcPr>
-            <w:tcW w:type="dxa" w:w="2340"/>
-            <w:tcW w:w="3456" w:type="dxa"/>
+            <w:tcW w:type="dxa" w:w="1872"/>
+            <w:tcW w:w="1872" w:type="dxa"/>
             <w:shd w:val="clear" w:color="auto" w:fill="F0F4FF"/>
             <w:tcBorders>
               <w:top w:val="single" w:sz="4" w:space="0" w:color="CCCCCC"/>
@@ -3788,8 +4953,8 @@
         </w:tc>
         <w:tc>
           <w:tcPr>
-            <w:tcW w:type="dxa" w:w="2340"/>
-            <w:tcW w:w="3888" w:type="dxa"/>
+            <w:tcW w:type="dxa" w:w="1872"/>
+            <w:tcW w:w="3024" w:type="dxa"/>
             <w:shd w:val="clear" w:color="auto" w:fill="F0F4FF"/>
             <w:tcBorders>
               <w:top w:val="single" w:sz="4" w:space="0" w:color="CCCCCC"/>
@@ -3804,6 +4969,27 @@
                 <w:sz w:val="20"/>
               </w:rPr>
               <w:t>Video title</w:t>
+            </w:r>
+          </w:p>
+        </w:tc>
+        <w:tc>
+          <w:tcPr>
+            <w:tcW w:type="dxa" w:w="1872"/>
+            <w:tcW w:w="2736" w:type="dxa"/>
+            <w:shd w:val="clear" w:color="auto" w:fill="F0F4FF"/>
+            <w:tcBorders>
+              <w:top w:val="single" w:sz="4" w:space="0" w:color="CCCCCC"/>
+              <w:left w:val="single" w:sz="4" w:space="0" w:color="CCCCCC"/>
+              <w:bottom w:val="single" w:sz="4" w:space="0" w:color="CCCCCC"/>
+              <w:right w:val="single" w:sz="4" w:space="0" w:color="CCCCCC"/>
+            </w:tcBorders>
+          </w:tcPr>
+          <w:p>
+            <w:r>
+              <w:rPr>
+                <w:sz w:val="20"/>
+              </w:rPr>
+              <w:t>Playwright + Claude Vision</w:t>
             </w:r>
           </w:p>
         </w:tc>
@@ -3811,8 +4997,8 @@
       <w:tr>
         <w:tc>
           <w:tcPr>
-            <w:tcW w:type="dxa" w:w="2340"/>
-            <w:tcW w:w="1728" w:type="dxa"/>
+            <w:tcW w:type="dxa" w:w="1872"/>
+            <w:tcW w:w="1584" w:type="dxa"/>
             <w:shd w:val="clear" w:color="auto" w:fill="FFFFFF"/>
             <w:tcBorders>
               <w:top w:val="single" w:sz="4" w:space="0" w:color="CCCCCC"/>
@@ -3832,8 +5018,8 @@
         </w:tc>
         <w:tc>
           <w:tcPr>
-            <w:tcW w:type="dxa" w:w="2340"/>
-            <w:tcW w:w="1728" w:type="dxa"/>
+            <w:tcW w:type="dxa" w:w="1872"/>
+            <w:tcW w:w="1584" w:type="dxa"/>
             <w:shd w:val="clear" w:color="auto" w:fill="FFFFFF"/>
             <w:tcBorders>
               <w:top w:val="single" w:sz="4" w:space="0" w:color="CCCCCC"/>
@@ -3853,8 +5039,8 @@
         </w:tc>
         <w:tc>
           <w:tcPr>
-            <w:tcW w:type="dxa" w:w="2340"/>
-            <w:tcW w:w="3456" w:type="dxa"/>
+            <w:tcW w:type="dxa" w:w="1872"/>
+            <w:tcW w:w="1872" w:type="dxa"/>
             <w:shd w:val="clear" w:color="auto" w:fill="FFFFFF"/>
             <w:tcBorders>
               <w:top w:val="single" w:sz="4" w:space="0" w:color="CCCCCC"/>
@@ -3868,14 +5054,14 @@
               <w:rPr>
                 <w:sz w:val="20"/>
               </w:rPr>
-              <w:t>Video views / impressions</w:t>
-            </w:r>
-          </w:p>
-        </w:tc>
-        <w:tc>
-          <w:tcPr>
-            <w:tcW w:type="dxa" w:w="2340"/>
-            <w:tcW w:w="3888" w:type="dxa"/>
+              <w:t>Video views</w:t>
+            </w:r>
+          </w:p>
+        </w:tc>
+        <w:tc>
+          <w:tcPr>
+            <w:tcW w:type="dxa" w:w="1872"/>
+            <w:tcW w:w="3024" w:type="dxa"/>
             <w:shd w:val="clear" w:color="auto" w:fill="FFFFFF"/>
             <w:tcBorders>
               <w:top w:val="single" w:sz="4" w:space="0" w:color="CCCCCC"/>
@@ -3890,6 +5076,27 @@
                 <w:sz w:val="20"/>
               </w:rPr>
               <w:t>Tweet text — hashtags removed</w:t>
+            </w:r>
+          </w:p>
+        </w:tc>
+        <w:tc>
+          <w:tcPr>
+            <w:tcW w:type="dxa" w:w="1872"/>
+            <w:tcW w:w="2736" w:type="dxa"/>
+            <w:shd w:val="clear" w:color="auto" w:fill="FFFFFF"/>
+            <w:tcBorders>
+              <w:top w:val="single" w:sz="4" w:space="0" w:color="CCCCCC"/>
+              <w:left w:val="single" w:sz="4" w:space="0" w:color="CCCCCC"/>
+              <w:bottom w:val="single" w:sz="4" w:space="0" w:color="CCCCCC"/>
+              <w:right w:val="single" w:sz="4" w:space="0" w:color="CCCCCC"/>
+            </w:tcBorders>
+          </w:tcPr>
+          <w:p>
+            <w:r>
+              <w:rPr>
+                <w:sz w:val="20"/>
+              </w:rPr>
+              <w:t>Playwright + Claude Vision</w:t>
             </w:r>
           </w:p>
         </w:tc>
@@ -3897,8 +5104,8 @@
       <w:tr>
         <w:tc>
           <w:tcPr>
-            <w:tcW w:type="dxa" w:w="2340"/>
-            <w:tcW w:w="1728" w:type="dxa"/>
+            <w:tcW w:type="dxa" w:w="1872"/>
+            <w:tcW w:w="1584" w:type="dxa"/>
             <w:shd w:val="clear" w:color="auto" w:fill="F0F4FF"/>
             <w:tcBorders>
               <w:top w:val="single" w:sz="4" w:space="0" w:color="CCCCCC"/>
@@ -3918,8 +5125,8 @@
         </w:tc>
         <w:tc>
           <w:tcPr>
-            <w:tcW w:type="dxa" w:w="2340"/>
-            <w:tcW w:w="1728" w:type="dxa"/>
+            <w:tcW w:type="dxa" w:w="1872"/>
+            <w:tcW w:w="1584" w:type="dxa"/>
             <w:shd w:val="clear" w:color="auto" w:fill="F0F4FF"/>
             <w:tcBorders>
               <w:top w:val="single" w:sz="4" w:space="0" w:color="CCCCCC"/>
@@ -3939,8 +5146,8 @@
         </w:tc>
         <w:tc>
           <w:tcPr>
-            <w:tcW w:type="dxa" w:w="2340"/>
-            <w:tcW w:w="3456" w:type="dxa"/>
+            <w:tcW w:type="dxa" w:w="1872"/>
+            <w:tcW w:w="1872" w:type="dxa"/>
             <w:shd w:val="clear" w:color="auto" w:fill="F0F4FF"/>
             <w:tcBorders>
               <w:top w:val="single" w:sz="4" w:space="0" w:color="CCCCCC"/>
@@ -3960,8 +5167,8 @@
         </w:tc>
         <w:tc>
           <w:tcPr>
-            <w:tcW w:type="dxa" w:w="2340"/>
-            <w:tcW w:w="3888" w:type="dxa"/>
+            <w:tcW w:type="dxa" w:w="1872"/>
+            <w:tcW w:w="3024" w:type="dxa"/>
             <w:shd w:val="clear" w:color="auto" w:fill="F0F4FF"/>
             <w:tcBorders>
               <w:top w:val="single" w:sz="4" w:space="0" w:color="CCCCCC"/>
@@ -3976,6 +5183,27 @@
                 <w:sz w:val="20"/>
               </w:rPr>
               <w:t>Post caption — hashtags removed</w:t>
+            </w:r>
+          </w:p>
+        </w:tc>
+        <w:tc>
+          <w:tcPr>
+            <w:tcW w:type="dxa" w:w="1872"/>
+            <w:tcW w:w="2736" w:type="dxa"/>
+            <w:shd w:val="clear" w:color="auto" w:fill="F0F4FF"/>
+            <w:tcBorders>
+              <w:top w:val="single" w:sz="4" w:space="0" w:color="CCCCCC"/>
+              <w:left w:val="single" w:sz="4" w:space="0" w:color="CCCCCC"/>
+              <w:bottom w:val="single" w:sz="4" w:space="0" w:color="CCCCCC"/>
+              <w:right w:val="single" w:sz="4" w:space="0" w:color="CCCCCC"/>
+            </w:tcBorders>
+          </w:tcPr>
+          <w:p>
+            <w:r>
+              <w:rPr>
+                <w:sz w:val="20"/>
+              </w:rPr>
+              <w:t>Playwright + Claude Vision</w:t>
             </w:r>
           </w:p>
         </w:tc>
@@ -3983,8 +5211,8 @@
       <w:tr>
         <w:tc>
           <w:tcPr>
-            <w:tcW w:type="dxa" w:w="2340"/>
-            <w:tcW w:w="1728" w:type="dxa"/>
+            <w:tcW w:type="dxa" w:w="1872"/>
+            <w:tcW w:w="1584" w:type="dxa"/>
             <w:shd w:val="clear" w:color="auto" w:fill="FFFFFF"/>
             <w:tcBorders>
               <w:top w:val="single" w:sz="4" w:space="0" w:color="CCCCCC"/>
@@ -4004,8 +5232,8 @@
         </w:tc>
         <w:tc>
           <w:tcPr>
-            <w:tcW w:type="dxa" w:w="2340"/>
-            <w:tcW w:w="1728" w:type="dxa"/>
+            <w:tcW w:type="dxa" w:w="1872"/>
+            <w:tcW w:w="1584" w:type="dxa"/>
             <w:shd w:val="clear" w:color="auto" w:fill="FFFFFF"/>
             <w:tcBorders>
               <w:top w:val="single" w:sz="4" w:space="0" w:color="CCCCCC"/>
@@ -4025,8 +5253,8 @@
         </w:tc>
         <w:tc>
           <w:tcPr>
-            <w:tcW w:type="dxa" w:w="2340"/>
-            <w:tcW w:w="3456" w:type="dxa"/>
+            <w:tcW w:type="dxa" w:w="1872"/>
+            <w:tcW w:w="1872" w:type="dxa"/>
             <w:shd w:val="clear" w:color="auto" w:fill="FFFFFF"/>
             <w:tcBorders>
               <w:top w:val="single" w:sz="4" w:space="0" w:color="CCCCCC"/>
@@ -4046,8 +5274,8 @@
         </w:tc>
         <w:tc>
           <w:tcPr>
-            <w:tcW w:type="dxa" w:w="2340"/>
-            <w:tcW w:w="3888" w:type="dxa"/>
+            <w:tcW w:type="dxa" w:w="1872"/>
+            <w:tcW w:w="3024" w:type="dxa"/>
             <w:shd w:val="clear" w:color="auto" w:fill="FFFFFF"/>
             <w:tcBorders>
               <w:top w:val="single" w:sz="4" w:space="0" w:color="CCCCCC"/>
@@ -4062,6 +5290,27 @@
                 <w:sz w:val="20"/>
               </w:rPr>
               <w:t>Post caption — hashtags removed</w:t>
+            </w:r>
+          </w:p>
+        </w:tc>
+        <w:tc>
+          <w:tcPr>
+            <w:tcW w:type="dxa" w:w="1872"/>
+            <w:tcW w:w="2736" w:type="dxa"/>
+            <w:shd w:val="clear" w:color="auto" w:fill="FFFFFF"/>
+            <w:tcBorders>
+              <w:top w:val="single" w:sz="4" w:space="0" w:color="CCCCCC"/>
+              <w:left w:val="single" w:sz="4" w:space="0" w:color="CCCCCC"/>
+              <w:bottom w:val="single" w:sz="4" w:space="0" w:color="CCCCCC"/>
+              <w:right w:val="single" w:sz="4" w:space="0" w:color="CCCCCC"/>
+            </w:tcBorders>
+          </w:tcPr>
+          <w:p>
+            <w:r>
+              <w:rPr>
+                <w:sz w:val="20"/>
+              </w:rPr>
+              <w:t>Playwright + Claude Vision</w:t>
             </w:r>
           </w:p>
         </w:tc>
@@ -4073,7 +5322,7 @@
         <w:pStyle w:val="Heading1"/>
       </w:pPr>
       <w:r>
-        <w:t>7. Functional Requirements</w:t>
+        <w:t>9. Functional Requirements</w:t>
       </w:r>
     </w:p>
     <w:p>
@@ -4233,7 +5482,7 @@
               <w:rPr>
                 <w:sz w:val="20"/>
               </w:rPr>
-              <w:t>Accept one or more video URLs as input from the user.</w:t>
+              <w:t>System reads Lark Sheet to find rows where Column F has a URL and columns A/D/E/G are empty.</w:t>
             </w:r>
           </w:p>
         </w:tc>
@@ -4300,7 +5549,7 @@
               <w:rPr>
                 <w:sz w:val="20"/>
               </w:rPr>
-              <w:t>Identify which of the 7 platforms each URL belongs to.</w:t>
+              <w:t>System opens each video URL in a real Chrome browser using Playwright with a persistent profile.</w:t>
             </w:r>
           </w:p>
         </w:tc>
@@ -4367,7 +5616,7 @@
               <w:rPr>
                 <w:sz w:val="20"/>
               </w:rPr>
-              <w:t>Extract the original posted date of the video (Column A).</w:t>
+              <w:t>System takes a screenshot of the video page.</w:t>
             </w:r>
           </w:p>
         </w:tc>
@@ -4434,7 +5683,7 @@
               <w:rPr>
                 <w:sz w:val="20"/>
               </w:rPr>
-              <w:t>Extract the video caption and strip all hashtags (Column D). Write "No caption" if none found.</w:t>
+              <w:t>System sends screenshot to Claude Haiku Vision model to extract posted date, caption, and view count.</w:t>
             </w:r>
           </w:p>
         </w:tc>
@@ -4501,7 +5750,7 @@
               <w:rPr>
                 <w:sz w:val="20"/>
               </w:rPr>
-              <w:t>Auto-fill "Content Casual" as the default value for Column E.</w:t>
+              <w:t>System strips ALL hashtags from caption using Unicode-aware regex before writing to Column D.</w:t>
             </w:r>
           </w:p>
         </w:tc>
@@ -4568,7 +5817,7 @@
               <w:rPr>
                 <w:sz w:val="20"/>
               </w:rPr>
-              <w:t>Write the video URL into Column F.</w:t>
+              <w:t>System writes posted date to Column A only.</w:t>
             </w:r>
           </w:p>
         </w:tc>
@@ -4635,7 +5884,7 @@
               <w:rPr>
                 <w:sz w:val="20"/>
               </w:rPr>
-              <w:t>Extract the video view count and write into Column G (Reach).</w:t>
+              <w:t>System writes cleaned caption to Column D only. Writes "No caption" if empty.</w:t>
             </w:r>
           </w:p>
         </w:tc>
@@ -4702,7 +5951,7 @@
               <w:rPr>
                 <w:sz w:val="20"/>
               </w:rPr>
-              <w:t>Never write to Columns B, C, or H under any circumstance.</w:t>
+              <w:t>System writes "Content Casual" to Column E only. Hardcoded always.</w:t>
             </w:r>
           </w:p>
         </w:tc>
@@ -4769,7 +6018,7 @@
               <w:rPr>
                 <w:sz w:val="20"/>
               </w:rPr>
-              <w:t>Write all data into the correct new row in the existing Lark Sheet without overwriting other data.</w:t>
+              <w:t>System writes view count to Column G only.</w:t>
             </w:r>
           </w:p>
         </w:tc>
@@ -4836,7 +6085,7 @@
               <w:rPr>
                 <w:sz w:val="20"/>
               </w:rPr>
-              <w:t>Support all 7 platforms: Instagram, TikTok, Facebook, YouTube, X, RedNote, Threads.</w:t>
+              <w:t>System NEVER writes to Columns B, C, F, or H. Any attempt raises an exception immediately.</w:t>
             </w:r>
           </w:p>
         </w:tc>
@@ -4879,10 +6128,10 @@
             <w:r>
               <w:rPr>
                 <w:b w:val="0"/>
-                <w:color w:val="4472C4"/>
-                <w:sz w:val="20"/>
-              </w:rPr>
-              <w:t>S</w:t>
+                <w:color w:val="007000"/>
+                <w:sz w:val="20"/>
+              </w:rPr>
+              <w:t>M</w:t>
             </w:r>
           </w:p>
         </w:tc>
@@ -4903,7 +6152,7 @@
               <w:rPr>
                 <w:sz w:val="20"/>
               </w:rPr>
-              <w:t>Generate an AI performance summary showing best and worst performing videos.</w:t>
+              <w:t>System writes into existing rows only — never appends new rows.</w:t>
             </w:r>
           </w:p>
         </w:tc>
@@ -4946,10 +6195,10 @@
             <w:r>
               <w:rPr>
                 <w:b w:val="0"/>
-                <w:color w:val="4472C4"/>
-                <w:sz w:val="20"/>
-              </w:rPr>
-              <w:t>S</w:t>
+                <w:color w:val="007000"/>
+                <w:sz w:val="20"/>
+              </w:rPr>
+              <w:t>M</w:t>
             </w:r>
           </w:p>
         </w:tc>
@@ -4970,7 +6219,7 @@
               <w:rPr>
                 <w:sz w:val="20"/>
               </w:rPr>
-              <w:t>Generate AI content recommendations for the next posting cycle.</w:t>
+              <w:t>System triggers via python run.py only. No UI required.</w:t>
             </w:r>
           </w:p>
         </w:tc>
@@ -5013,10 +6262,10 @@
             <w:r>
               <w:rPr>
                 <w:b w:val="0"/>
-                <w:color w:val="4472C4"/>
-                <w:sz w:val="20"/>
-              </w:rPr>
-              <w:t>S</w:t>
+                <w:color w:val="007000"/>
+                <w:sz w:val="20"/>
+              </w:rPr>
+              <w:t>M</w:t>
             </w:r>
           </w:p>
         </w:tc>
@@ -5037,7 +6286,7 @@
               <w:rPr>
                 <w:sz w:val="20"/>
               </w:rPr>
-              <w:t>If a link fails, notify the user with a clear error message and continue with remaining links.</w:t>
+              <w:t>System supports all 7 platforms: Instagram, TikTok, Facebook, YouTube, X, RedNote, Threads.</w:t>
             </w:r>
           </w:p>
         </w:tc>
@@ -5080,10 +6329,10 @@
             <w:r>
               <w:rPr>
                 <w:b w:val="0"/>
-                <w:color w:val="C55A11"/>
-                <w:sz w:val="20"/>
-              </w:rPr>
-              <w:t>C</w:t>
+                <w:color w:val="4472C4"/>
+                <w:sz w:val="20"/>
+              </w:rPr>
+              <w:t>S</w:t>
             </w:r>
           </w:p>
         </w:tc>
@@ -5104,7 +6353,7 @@
               <w:rPr>
                 <w:sz w:val="20"/>
               </w:rPr>
-              <w:t>Support batch input of multiple video links at once.</w:t>
+              <w:t>System prints a run summary showing success/failure status for each URL processed.</w:t>
             </w:r>
           </w:p>
         </w:tc>
@@ -5147,10 +6396,10 @@
             <w:r>
               <w:rPr>
                 <w:b w:val="0"/>
-                <w:color w:val="C55A11"/>
-                <w:sz w:val="20"/>
-              </w:rPr>
-              <w:t>C</w:t>
+                <w:color w:val="4472C4"/>
+                <w:sz w:val="20"/>
+              </w:rPr>
+              <w:t>S</w:t>
             </w:r>
           </w:p>
         </w:tc>
@@ -5171,7 +6420,141 @@
               <w:rPr>
                 <w:sz w:val="20"/>
               </w:rPr>
-              <w:t>Compare current cycle performance against the previous cycle.</w:t>
+              <w:t>System generates AI performance analysis and content recommendations after processing.</w:t>
+            </w:r>
+          </w:p>
+        </w:tc>
+      </w:tr>
+      <w:tr>
+        <w:tc>
+          <w:tcPr>
+            <w:tcW w:type="dxa" w:w="3120"/>
+            <w:tcW w:w="1152" w:type="dxa"/>
+            <w:shd w:val="clear" w:color="auto" w:fill="F0F4FF"/>
+            <w:tcBorders>
+              <w:top w:val="single" w:sz="4" w:space="0" w:color="CCCCCC"/>
+              <w:left w:val="single" w:sz="4" w:space="0" w:color="CCCCCC"/>
+              <w:bottom w:val="single" w:sz="4" w:space="0" w:color="CCCCCC"/>
+              <w:right w:val="single" w:sz="4" w:space="0" w:color="CCCCCC"/>
+            </w:tcBorders>
+          </w:tcPr>
+          <w:p>
+            <w:r>
+              <w:rPr>
+                <w:sz w:val="20"/>
+              </w:rPr>
+              <w:t>FR-16</w:t>
+            </w:r>
+          </w:p>
+        </w:tc>
+        <w:tc>
+          <w:tcPr>
+            <w:tcW w:type="dxa" w:w="3120"/>
+            <w:tcW w:w="1152" w:type="dxa"/>
+            <w:shd w:val="clear" w:color="auto" w:fill="F0F4FF"/>
+            <w:tcBorders>
+              <w:top w:val="single" w:sz="4" w:space="0" w:color="CCCCCC"/>
+              <w:left w:val="single" w:sz="4" w:space="0" w:color="CCCCCC"/>
+              <w:bottom w:val="single" w:sz="4" w:space="0" w:color="CCCCCC"/>
+              <w:right w:val="single" w:sz="4" w:space="0" w:color="CCCCCC"/>
+            </w:tcBorders>
+          </w:tcPr>
+          <w:p>
+            <w:r>
+              <w:rPr>
+                <w:b w:val="0"/>
+                <w:color w:val="4472C4"/>
+                <w:sz w:val="20"/>
+              </w:rPr>
+              <w:t>S</w:t>
+            </w:r>
+          </w:p>
+        </w:tc>
+        <w:tc>
+          <w:tcPr>
+            <w:tcW w:type="dxa" w:w="3120"/>
+            <w:tcW w:w="8496" w:type="dxa"/>
+            <w:shd w:val="clear" w:color="auto" w:fill="F0F4FF"/>
+            <w:tcBorders>
+              <w:top w:val="single" w:sz="4" w:space="0" w:color="CCCCCC"/>
+              <w:left w:val="single" w:sz="4" w:space="0" w:color="CCCCCC"/>
+              <w:bottom w:val="single" w:sz="4" w:space="0" w:color="CCCCCC"/>
+              <w:right w:val="single" w:sz="4" w:space="0" w:color="CCCCCC"/>
+            </w:tcBorders>
+          </w:tcPr>
+          <w:p>
+            <w:r>
+              <w:rPr>
+                <w:sz w:val="20"/>
+              </w:rPr>
+              <w:t>If a URL fails, system logs the error and continues processing remaining URLs.</w:t>
+            </w:r>
+          </w:p>
+        </w:tc>
+      </w:tr>
+      <w:tr>
+        <w:tc>
+          <w:tcPr>
+            <w:tcW w:type="dxa" w:w="3120"/>
+            <w:tcW w:w="1152" w:type="dxa"/>
+            <w:shd w:val="clear" w:color="auto" w:fill="FFFFFF"/>
+            <w:tcBorders>
+              <w:top w:val="single" w:sz="4" w:space="0" w:color="CCCCCC"/>
+              <w:left w:val="single" w:sz="4" w:space="0" w:color="CCCCCC"/>
+              <w:bottom w:val="single" w:sz="4" w:space="0" w:color="CCCCCC"/>
+              <w:right w:val="single" w:sz="4" w:space="0" w:color="CCCCCC"/>
+            </w:tcBorders>
+          </w:tcPr>
+          <w:p>
+            <w:r>
+              <w:rPr>
+                <w:sz w:val="20"/>
+              </w:rPr>
+              <w:t>FR-17</w:t>
+            </w:r>
+          </w:p>
+        </w:tc>
+        <w:tc>
+          <w:tcPr>
+            <w:tcW w:type="dxa" w:w="3120"/>
+            <w:tcW w:w="1152" w:type="dxa"/>
+            <w:shd w:val="clear" w:color="auto" w:fill="FFFFFF"/>
+            <w:tcBorders>
+              <w:top w:val="single" w:sz="4" w:space="0" w:color="CCCCCC"/>
+              <w:left w:val="single" w:sz="4" w:space="0" w:color="CCCCCC"/>
+              <w:bottom w:val="single" w:sz="4" w:space="0" w:color="CCCCCC"/>
+              <w:right w:val="single" w:sz="4" w:space="0" w:color="CCCCCC"/>
+            </w:tcBorders>
+          </w:tcPr>
+          <w:p>
+            <w:r>
+              <w:rPr>
+                <w:b w:val="0"/>
+                <w:color w:val="C55A11"/>
+                <w:sz w:val="20"/>
+              </w:rPr>
+              <w:t>C</w:t>
+            </w:r>
+          </w:p>
+        </w:tc>
+        <w:tc>
+          <w:tcPr>
+            <w:tcW w:type="dxa" w:w="3120"/>
+            <w:tcW w:w="8496" w:type="dxa"/>
+            <w:shd w:val="clear" w:color="auto" w:fill="FFFFFF"/>
+            <w:tcBorders>
+              <w:top w:val="single" w:sz="4" w:space="0" w:color="CCCCCC"/>
+              <w:left w:val="single" w:sz="4" w:space="0" w:color="CCCCCC"/>
+              <w:bottom w:val="single" w:sz="4" w:space="0" w:color="CCCCCC"/>
+              <w:right w:val="single" w:sz="4" w:space="0" w:color="CCCCCC"/>
+            </w:tcBorders>
+          </w:tcPr>
+          <w:p>
+            <w:r>
+              <w:rPr>
+                <w:sz w:val="20"/>
+              </w:rPr>
+              <w:t>System compares current cycle performance against previous cycle.</w:t>
             </w:r>
           </w:p>
         </w:tc>
@@ -5183,7 +6566,7 @@
         <w:pStyle w:val="Heading1"/>
       </w:pPr>
       <w:r>
-        <w:t>8. Non-Functional Requirements</w:t>
+        <w:t>10. Non-Functional Requirements</w:t>
       </w:r>
     </w:p>
     <w:tbl>
@@ -5328,7 +6711,7 @@
               <w:rPr>
                 <w:sz w:val="20"/>
               </w:rPr>
-              <w:t>Extract and fill data for up to 20 videos within 2 minutes.</w:t>
+              <w:t>Process up to 20 video URLs within 5 minutes.</w:t>
             </w:r>
           </w:p>
         </w:tc>
@@ -5393,7 +6776,7 @@
               <w:rPr>
                 <w:sz w:val="20"/>
               </w:rPr>
-              <w:t>View counts must match platform figures with 99% accuracy.</w:t>
+              <w:t>View counts and captions must match what is shown on the video page with 99% accuracy.</w:t>
             </w:r>
           </w:p>
         </w:tc>
@@ -5458,7 +6841,7 @@
               <w:rPr>
                 <w:sz w:val="20"/>
               </w:rPr>
-              <w:t>System must never overwrite or delete data in Columns B, C, or H.</w:t>
+              <w:t>System must never write to Columns B, C, F, or H under any circumstance.</w:t>
             </w:r>
           </w:p>
         </w:tc>
@@ -5502,7 +6885,7 @@
               <w:rPr>
                 <w:sz w:val="20"/>
               </w:rPr>
-              <w:t>Usability</w:t>
+              <w:t>Data Integrity</w:t>
             </w:r>
           </w:p>
         </w:tc>
@@ -5523,7 +6906,7 @@
               <w:rPr>
                 <w:sz w:val="20"/>
               </w:rPr>
-              <w:t>User can complete a full reporting cycle in under 5 minutes with no training.</w:t>
+              <w:t>System must never overwrite existing data in columns A, D, E, G if already filled.</w:t>
             </w:r>
           </w:p>
         </w:tc>
@@ -5588,7 +6971,7 @@
               <w:rPr>
                 <w:sz w:val="20"/>
               </w:rPr>
-              <w:t>If one link fails, system continues processing all remaining links.</w:t>
+              <w:t>If one URL fails, system must continue processing all remaining URLs.</w:t>
             </w:r>
           </w:p>
         </w:tc>
@@ -5653,7 +7036,7 @@
               <w:rPr>
                 <w:sz w:val="20"/>
               </w:rPr>
-              <w:t>Lark API credentials must be stored securely and encrypted.</w:t>
+              <w:t>API keys stored in .env file only. Never logged or printed. .env excluded from git.</w:t>
             </w:r>
           </w:p>
         </w:tc>
@@ -5697,7 +7080,7 @@
               <w:rPr>
                 <w:sz w:val="20"/>
               </w:rPr>
-              <w:t>Compatibility</w:t>
+              <w:t>Testability</w:t>
             </w:r>
           </w:p>
         </w:tc>
@@ -5718,7 +7101,72 @@
               <w:rPr>
                 <w:sz w:val="20"/>
               </w:rPr>
-              <w:t>Must integrate with Lark Sheet API without breaking existing sheet structure or formatting.</w:t>
+              <w:t>lark_writer.py must have pytest tests proving B/C/F/H writes raise exceptions.</w:t>
+            </w:r>
+          </w:p>
+        </w:tc>
+      </w:tr>
+      <w:tr>
+        <w:tc>
+          <w:tcPr>
+            <w:tcW w:type="dxa" w:w="3120"/>
+            <w:tcW w:w="1296" w:type="dxa"/>
+            <w:shd w:val="clear" w:color="auto" w:fill="F0F4FF"/>
+            <w:tcBorders>
+              <w:top w:val="single" w:sz="4" w:space="0" w:color="CCCCCC"/>
+              <w:left w:val="single" w:sz="4" w:space="0" w:color="CCCCCC"/>
+              <w:bottom w:val="single" w:sz="4" w:space="0" w:color="CCCCCC"/>
+              <w:right w:val="single" w:sz="4" w:space="0" w:color="CCCCCC"/>
+            </w:tcBorders>
+          </w:tcPr>
+          <w:p>
+            <w:r>
+              <w:rPr>
+                <w:sz w:val="20"/>
+              </w:rPr>
+              <w:t>NFR-08</w:t>
+            </w:r>
+          </w:p>
+        </w:tc>
+        <w:tc>
+          <w:tcPr>
+            <w:tcW w:type="dxa" w:w="3120"/>
+            <w:tcW w:w="2304" w:type="dxa"/>
+            <w:shd w:val="clear" w:color="auto" w:fill="F0F4FF"/>
+            <w:tcBorders>
+              <w:top w:val="single" w:sz="4" w:space="0" w:color="CCCCCC"/>
+              <w:left w:val="single" w:sz="4" w:space="0" w:color="CCCCCC"/>
+              <w:bottom w:val="single" w:sz="4" w:space="0" w:color="CCCCCC"/>
+              <w:right w:val="single" w:sz="4" w:space="0" w:color="CCCCCC"/>
+            </w:tcBorders>
+          </w:tcPr>
+          <w:p>
+            <w:r>
+              <w:rPr>
+                <w:sz w:val="20"/>
+              </w:rPr>
+              <w:t>Compatibility</w:t>
+            </w:r>
+          </w:p>
+        </w:tc>
+        <w:tc>
+          <w:tcPr>
+            <w:tcW w:type="dxa" w:w="3120"/>
+            <w:tcW w:w="7200" w:type="dxa"/>
+            <w:shd w:val="clear" w:color="auto" w:fill="F0F4FF"/>
+            <w:tcBorders>
+              <w:top w:val="single" w:sz="4" w:space="0" w:color="CCCCCC"/>
+              <w:left w:val="single" w:sz="4" w:space="0" w:color="CCCCCC"/>
+              <w:bottom w:val="single" w:sz="4" w:space="0" w:color="CCCCCC"/>
+              <w:right w:val="single" w:sz="4" w:space="0" w:color="CCCCCC"/>
+            </w:tcBorders>
+          </w:tcPr>
+          <w:p>
+            <w:r>
+              <w:rPr>
+                <w:sz w:val="20"/>
+              </w:rPr>
+              <w:t>System runs on Python 3.11+ on macOS.</w:t>
             </w:r>
           </w:p>
         </w:tc>
@@ -5730,7 +7178,7 @@
         <w:pStyle w:val="Heading1"/>
       </w:pPr>
       <w:r>
-        <w:t>9. Risk Register</w:t>
+        <w:t>11. Risk Register</w:t>
       </w:r>
     </w:p>
     <w:tbl>
@@ -5902,7 +7350,7 @@
               <w:rPr>
                 <w:sz w:val="20"/>
               </w:rPr>
-              <w:t>Platform blocks automated data access</w:t>
+              <w:t>Platform blocks Playwright browser (detects automation)</w:t>
             </w:r>
           </w:p>
         </w:tc>
@@ -5969,7 +7417,7 @@
               <w:rPr>
                 <w:sz w:val="20"/>
               </w:rPr>
-              <w:t>Use official APIs; have fallback scraping where permitted by ToS</w:t>
+              <w:t>Use persistent Chrome profile with real login session; use slow human-like interactions</w:t>
             </w:r>
           </w:p>
         </w:tc>
@@ -6013,7 +7461,7 @@
               <w:rPr>
                 <w:sz w:val="20"/>
               </w:rPr>
-              <w:t>Platform layout or API changes break extraction</w:t>
+              <w:t>Claude Vision extracts wrong data from screenshot</w:t>
             </w:r>
           </w:p>
         </w:tc>
@@ -6033,10 +7481,10 @@
             <w:r>
               <w:rPr>
                 <w:b w:val="0"/>
-                <w:color w:val="C55A11"/>
-                <w:sz w:val="20"/>
-              </w:rPr>
-              <w:t>Medium</w:t>
+                <w:color w:val="007000"/>
+                <w:sz w:val="20"/>
+              </w:rPr>
+              <w:t>Low</w:t>
             </w:r>
           </w:p>
         </w:tc>
@@ -6080,7 +7528,7 @@
               <w:rPr>
                 <w:sz w:val="20"/>
               </w:rPr>
-              <w:t>Modular connectors — fix one platform without affecting others</w:t>
+              <w:t>Validate extracted data format; flag outliers for manual review</w:t>
             </w:r>
           </w:p>
         </w:tc>
@@ -6191,7 +7639,7 @@
               <w:rPr>
                 <w:sz w:val="20"/>
               </w:rPr>
-              <w:t>Strict column mapping with automated validation tests before release</w:t>
+              <w:t>Hard allowlist in lark_writer.py raises exception immediately if wrong column attempted</w:t>
             </w:r>
           </w:p>
         </w:tc>
@@ -6235,7 +7683,7 @@
               <w:rPr>
                 <w:sz w:val="20"/>
               </w:rPr>
-              <w:t>Caption extraction leaves some hashtags behind</w:t>
+              <w:t>Hashtag regex misses Unicode hashtags (e.g. Chinese, Arabic)</w:t>
             </w:r>
           </w:p>
         </w:tc>
@@ -6255,10 +7703,10 @@
             <w:r>
               <w:rPr>
                 <w:b w:val="0"/>
-                <w:color w:val="007000"/>
-                <w:sz w:val="20"/>
-              </w:rPr>
-              <w:t>Low</w:t>
+                <w:color w:val="C55A11"/>
+                <w:sz w:val="20"/>
+              </w:rPr>
+              <w:t>Medium</w:t>
             </w:r>
           </w:p>
         </w:tc>
@@ -6302,7 +7750,7 @@
               <w:rPr>
                 <w:sz w:val="20"/>
               </w:rPr>
-              <w:t>Use robust regex pattern to strip all hashtags; tested across all platforms</w:t>
+              <w:t>Use Unicode-aware regex pattern covering all Unicode word characters</w:t>
             </w:r>
           </w:p>
         </w:tc>
@@ -6346,7 +7794,7 @@
               <w:rPr>
                 <w:sz w:val="20"/>
               </w:rPr>
-              <w:t>RedNote has very limited API access</w:t>
+              <w:t>RedNote requires login — Playwright session expires</w:t>
             </w:r>
           </w:p>
         </w:tc>
@@ -6413,7 +7861,118 @@
               <w:rPr>
                 <w:sz w:val="20"/>
               </w:rPr>
-              <w:t>Research alternative access; document limitation and propose workaround</w:t>
+              <w:t>Persistent Chrome profile retains login session; user re-logs if expired</w:t>
+            </w:r>
+          </w:p>
+        </w:tc>
+      </w:tr>
+      <w:tr>
+        <w:tc>
+          <w:tcPr>
+            <w:tcW w:type="dxa" w:w="1872"/>
+            <w:tcW w:w="864" w:type="dxa"/>
+            <w:shd w:val="clear" w:color="auto" w:fill="F0F4FF"/>
+            <w:tcBorders>
+              <w:top w:val="single" w:sz="4" w:space="0" w:color="CCCCCC"/>
+              <w:left w:val="single" w:sz="4" w:space="0" w:color="CCCCCC"/>
+              <w:bottom w:val="single" w:sz="4" w:space="0" w:color="CCCCCC"/>
+              <w:right w:val="single" w:sz="4" w:space="0" w:color="CCCCCC"/>
+            </w:tcBorders>
+          </w:tcPr>
+          <w:p>
+            <w:r>
+              <w:rPr>
+                <w:sz w:val="20"/>
+              </w:rPr>
+              <w:t>R-06</w:t>
+            </w:r>
+          </w:p>
+        </w:tc>
+        <w:tc>
+          <w:tcPr>
+            <w:tcW w:type="dxa" w:w="1872"/>
+            <w:tcW w:w="3311" w:type="dxa"/>
+            <w:shd w:val="clear" w:color="auto" w:fill="F0F4FF"/>
+            <w:tcBorders>
+              <w:top w:val="single" w:sz="4" w:space="0" w:color="CCCCCC"/>
+              <w:left w:val="single" w:sz="4" w:space="0" w:color="CCCCCC"/>
+              <w:bottom w:val="single" w:sz="4" w:space="0" w:color="CCCCCC"/>
+              <w:right w:val="single" w:sz="4" w:space="0" w:color="CCCCCC"/>
+            </w:tcBorders>
+          </w:tcPr>
+          <w:p>
+            <w:r>
+              <w:rPr>
+                <w:sz w:val="20"/>
+              </w:rPr>
+              <w:t>Lark Sheet API token expires during run</w:t>
+            </w:r>
+          </w:p>
+        </w:tc>
+        <w:tc>
+          <w:tcPr>
+            <w:tcW w:type="dxa" w:w="1872"/>
+            <w:tcW w:w="1440" w:type="dxa"/>
+            <w:shd w:val="clear" w:color="auto" w:fill="F0F4FF"/>
+            <w:tcBorders>
+              <w:top w:val="single" w:sz="4" w:space="0" w:color="CCCCCC"/>
+              <w:left w:val="single" w:sz="4" w:space="0" w:color="CCCCCC"/>
+              <w:bottom w:val="single" w:sz="4" w:space="0" w:color="CCCCCC"/>
+              <w:right w:val="single" w:sz="4" w:space="0" w:color="CCCCCC"/>
+            </w:tcBorders>
+          </w:tcPr>
+          <w:p>
+            <w:r>
+              <w:rPr>
+                <w:b w:val="0"/>
+                <w:color w:val="007000"/>
+                <w:sz w:val="20"/>
+              </w:rPr>
+              <w:t>Low</w:t>
+            </w:r>
+          </w:p>
+        </w:tc>
+        <w:tc>
+          <w:tcPr>
+            <w:tcW w:type="dxa" w:w="1872"/>
+            <w:tcW w:w="1152" w:type="dxa"/>
+            <w:shd w:val="clear" w:color="auto" w:fill="F0F4FF"/>
+            <w:tcBorders>
+              <w:top w:val="single" w:sz="4" w:space="0" w:color="CCCCCC"/>
+              <w:left w:val="single" w:sz="4" w:space="0" w:color="CCCCCC"/>
+              <w:bottom w:val="single" w:sz="4" w:space="0" w:color="CCCCCC"/>
+              <w:right w:val="single" w:sz="4" w:space="0" w:color="CCCCCC"/>
+            </w:tcBorders>
+          </w:tcPr>
+          <w:p>
+            <w:r>
+              <w:rPr>
+                <w:b w:val="0"/>
+                <w:color w:val="C55A11"/>
+                <w:sz w:val="20"/>
+              </w:rPr>
+              <w:t>Medium</w:t>
+            </w:r>
+          </w:p>
+        </w:tc>
+        <w:tc>
+          <w:tcPr>
+            <w:tcW w:type="dxa" w:w="1872"/>
+            <w:tcW w:w="4031" w:type="dxa"/>
+            <w:shd w:val="clear" w:color="auto" w:fill="F0F4FF"/>
+            <w:tcBorders>
+              <w:top w:val="single" w:sz="4" w:space="0" w:color="CCCCCC"/>
+              <w:left w:val="single" w:sz="4" w:space="0" w:color="CCCCCC"/>
+              <w:bottom w:val="single" w:sz="4" w:space="0" w:color="CCCCCC"/>
+              <w:right w:val="single" w:sz="4" w:space="0" w:color="CCCCCC"/>
+            </w:tcBorders>
+          </w:tcPr>
+          <w:p>
+            <w:r>
+              <w:rPr>
+                <w:sz w:val="20"/>
+              </w:rPr>
+              <w:t>Implement token refresh logic; retry on auth failure</w:t>
             </w:r>
           </w:p>
         </w:tc>
@@ -6425,7 +7984,7 @@
         <w:pStyle w:val="Heading1"/>
       </w:pPr>
       <w:r>
-        <w:t>10. Assumptions &amp; Constraints</w:t>
+        <w:t>12. Assumptions &amp; Constraints</w:t>
       </w:r>
     </w:p>
     <w:p>
@@ -6433,7 +7992,7 @@
         <w:pStyle w:val="Heading2"/>
       </w:pPr>
       <w:r>
-        <w:t>10.1 Assumptions</w:t>
+        <w:t>12.1 Assumptions</w:t>
       </w:r>
     </w:p>
     <w:p>
@@ -6444,7 +8003,7 @@
         <w:rPr>
           <w:sz w:val="22"/>
         </w:rPr>
-        <w:t>All video links provided belong to the user's own accounts.</w:t>
+        <w:t>The user pastes video URLs into Column F of the Lark Sheet before running the system.</w:t>
       </w:r>
     </w:p>
     <w:p>
@@ -6455,7 +8014,7 @@
         <w:rPr>
           <w:sz w:val="22"/>
         </w:rPr>
-        <w:t>The Lark Sheet already exists with exactly the 8 columns (A to H) as defined in Section 5.</w:t>
+        <w:t>The user is already logged into all 7 platforms in the persistent Chrome profile.</w:t>
       </w:r>
     </w:p>
     <w:p>
@@ -6466,7 +8025,7 @@
         <w:rPr>
           <w:sz w:val="22"/>
         </w:rPr>
-        <w:t>The user has a stable internet connection when running the system.</w:t>
+        <w:t>The Lark Sheet exists with exactly columns A to H as defined in Section 6.</w:t>
       </w:r>
     </w:p>
     <w:p>
@@ -6477,7 +8036,7 @@
         <w:rPr>
           <w:sz w:val="22"/>
         </w:rPr>
-        <w:t>Videos will always have a caption — "No caption" fallback is a safety measure only.</w:t>
+        <w:t>Videos will always be publicly visible when the browser opens the URL.</w:t>
       </w:r>
     </w:p>
     <w:p>
@@ -6488,15 +8047,7 @@
         <w:rPr>
           <w:sz w:val="22"/>
         </w:rPr>
-        <w:t>"Content Casual" is the appropriate default for the majority of the user's videos.</w:t>
-      </w:r>
-    </w:p>
-    <w:p>
-      <w:pPr>
-        <w:pStyle w:val="Heading2"/>
-      </w:pPr>
-      <w:r>
-        <w:t>10.2 Constraints</w:t>
+        <w:t>The user runs the system on macOS with Python 3.11+ installed.</w:t>
       </w:r>
     </w:p>
     <w:p>
@@ -6507,7 +8058,15 @@
         <w:rPr>
           <w:sz w:val="22"/>
         </w:rPr>
-        <w:t>System must NEVER write to Columns B (Week), C (PIC), or H (Final Reach).</w:t>
+        <w:t>"Content Casual" is the correct default for all videos in Phase 1.</w:t>
+      </w:r>
+    </w:p>
+    <w:p>
+      <w:pPr>
+        <w:pStyle w:val="Heading2"/>
+      </w:pPr>
+      <w:r>
+        <w:t>12.2 Constraints</w:t>
       </w:r>
     </w:p>
     <w:p>
@@ -6518,7 +8077,7 @@
         <w:rPr>
           <w:sz w:val="22"/>
         </w:rPr>
-        <w:t>Column A must reflect the original video posted date — not the date the system is run.</w:t>
+        <w:t>System MUST NEVER write to Columns B, C, F, or H — enforced with hard exception in code.</w:t>
       </w:r>
     </w:p>
     <w:p>
@@ -6529,7 +8088,7 @@
         <w:rPr>
           <w:sz w:val="22"/>
         </w:rPr>
-        <w:t>Each platform's Terms of Service must be respected for all data access methods.</w:t>
+        <w:t>Column F is owned by the user — the system only reads it, never writes to it.</w:t>
       </w:r>
     </w:p>
     <w:p>
@@ -6540,7 +8099,7 @@
         <w:rPr>
           <w:sz w:val="22"/>
         </w:rPr>
-        <w:t>RedNote may require a different technical approach due to limited API availability.</w:t>
+        <w:t>System writes into existing rows only — never creates new rows.</w:t>
       </w:r>
     </w:p>
     <w:p>
@@ -6551,7 +8110,29 @@
         <w:rPr>
           <w:sz w:val="22"/>
         </w:rPr>
-        <w:t>Single user only in Phase 1 — no multi-user or team features.</w:t>
+        <w:t>No platform APIs are used — all data is extracted via Playwright + Claude Vision.</w:t>
+      </w:r>
+    </w:p>
+    <w:p>
+      <w:pPr>
+        <w:pStyle w:val="ListBullet"/>
+      </w:pPr>
+      <w:r>
+        <w:rPr>
+          <w:sz w:val="22"/>
+        </w:rPr>
+        <w:t>Single user only in Phase 1.</w:t>
+      </w:r>
+    </w:p>
+    <w:p>
+      <w:pPr>
+        <w:pStyle w:val="ListBullet"/>
+      </w:pPr>
+      <w:r>
+        <w:rPr>
+          <w:sz w:val="22"/>
+        </w:rPr>
+        <w:t>System runs via python run.py only — no web UI, no mobile app.</w:t>
       </w:r>
     </w:p>
     <w:p>
@@ -6559,7 +8140,7 @@
         <w:pStyle w:val="Heading1"/>
       </w:pPr>
       <w:r>
-        <w:t>11. Implementation Roadmap</w:t>
+        <w:t>13. Implementation Roadmap</w:t>
       </w:r>
     </w:p>
     <w:tbl>
@@ -6569,16 +8150,15 @@
         <w:tblLook w:firstColumn="1" w:firstRow="1" w:lastColumn="0" w:lastRow="0" w:noHBand="0" w:noVBand="1" w:val="04A0"/>
       </w:tblPr>
       <w:tblGrid>
-        <w:gridCol w:w="2340"/>
-        <w:gridCol w:w="2340"/>
-        <w:gridCol w:w="2340"/>
-        <w:gridCol w:w="2340"/>
+        <w:gridCol w:w="3120"/>
+        <w:gridCol w:w="3120"/>
+        <w:gridCol w:w="3120"/>
       </w:tblGrid>
       <w:tr>
         <w:tc>
           <w:tcPr>
-            <w:tcW w:type="dxa" w:w="2340"/>
-            <w:tcW w:w="1440" w:type="dxa"/>
+            <w:tcW w:type="dxa" w:w="3120"/>
+            <w:tcW w:w="1728" w:type="dxa"/>
             <w:shd w:val="clear" w:color="auto" w:fill="1F497D"/>
             <w:tcBorders>
               <w:top w:val="single" w:sz="4" w:space="0" w:color="1F497D"/>
@@ -6600,8 +8180,8 @@
         </w:tc>
         <w:tc>
           <w:tcPr>
-            <w:tcW w:type="dxa" w:w="2340"/>
-            <w:tcW w:w="4752" w:type="dxa"/>
+            <w:tcW w:type="dxa" w:w="3120"/>
+            <w:tcW w:w="6192" w:type="dxa"/>
             <w:shd w:val="clear" w:color="auto" w:fill="1F497D"/>
             <w:tcBorders>
               <w:top w:val="single" w:sz="4" w:space="0" w:color="1F497D"/>
@@ -6623,8 +8203,8 @@
         </w:tc>
         <w:tc>
           <w:tcPr>
-            <w:tcW w:type="dxa" w:w="2340"/>
-            <w:tcW w:w="3168" w:type="dxa"/>
+            <w:tcW w:type="dxa" w:w="3120"/>
+            <w:tcW w:w="2880" w:type="dxa"/>
             <w:shd w:val="clear" w:color="auto" w:fill="1F497D"/>
             <w:tcBorders>
               <w:top w:val="single" w:sz="4" w:space="0" w:color="1F497D"/>
@@ -6640,30 +8220,7 @@
                 <w:color w:val="FFFFFF"/>
                 <w:sz w:val="20"/>
               </w:rPr>
-              <w:t>Platforms Covered</w:t>
-            </w:r>
-          </w:p>
-        </w:tc>
-        <w:tc>
-          <w:tcPr>
-            <w:tcW w:type="dxa" w:w="2340"/>
-            <w:tcW w:w="1440" w:type="dxa"/>
-            <w:shd w:val="clear" w:color="auto" w:fill="1F497D"/>
-            <w:tcBorders>
-              <w:top w:val="single" w:sz="4" w:space="0" w:color="1F497D"/>
-              <w:left w:val="single" w:sz="4" w:space="0" w:color="1F497D"/>
-              <w:bottom w:val="single" w:sz="4" w:space="0" w:color="1F497D"/>
-              <w:right w:val="single" w:sz="4" w:space="0" w:color="1F497D"/>
-            </w:tcBorders>
-          </w:tcPr>
-          <w:p>
-            <w:r>
-              <w:rPr>
-                <w:b/>
-                <w:color w:val="FFFFFF"/>
-                <w:sz w:val="20"/>
-              </w:rPr>
-              <w:t>Timeline</w:t>
+              <w:t>Key Output</w:t>
             </w:r>
           </w:p>
         </w:tc>
@@ -6671,8 +8228,8 @@
       <w:tr>
         <w:tc>
           <w:tcPr>
-            <w:tcW w:type="dxa" w:w="2340"/>
-            <w:tcW w:w="1440" w:type="dxa"/>
+            <w:tcW w:type="dxa" w:w="3120"/>
+            <w:tcW w:w="1728" w:type="dxa"/>
             <w:shd w:val="clear" w:color="auto" w:fill="FFFFFF"/>
             <w:tcBorders>
               <w:top w:val="single" w:sz="4" w:space="0" w:color="CCCCCC"/>
@@ -6688,14 +8245,14 @@
               </w:rPr>
               <w:t>Phase 1</w:t>
               <w:br/>
-              <w:t>(Core)</w:t>
-            </w:r>
-          </w:p>
-        </w:tc>
-        <w:tc>
-          <w:tcPr>
-            <w:tcW w:type="dxa" w:w="2340"/>
-            <w:tcW w:w="4752" w:type="dxa"/>
+              <w:t>Scaffold</w:t>
+            </w:r>
+          </w:p>
+        </w:tc>
+        <w:tc>
+          <w:tcPr>
+            <w:tcW w:type="dxa" w:w="3120"/>
+            <w:tcW w:w="6192" w:type="dxa"/>
             <w:shd w:val="clear" w:color="auto" w:fill="FFFFFF"/>
             <w:tcBorders>
               <w:top w:val="single" w:sz="4" w:space="0" w:color="CCCCCC"/>
@@ -6709,14 +8266,14 @@
               <w:rPr>
                 <w:sz w:val="20"/>
               </w:rPr>
-              <w:t>URL input, metric extraction, write to Lark Sheet columns A, D, E, F, G</w:t>
-            </w:r>
-          </w:p>
-        </w:tc>
-        <w:tc>
-          <w:tcPr>
-            <w:tcW w:type="dxa" w:w="2340"/>
-            <w:tcW w:w="3168" w:type="dxa"/>
+              <w:t>Project setup: requirements.txt, .gitignore, .env.template, virtualenv</w:t>
+            </w:r>
+          </w:p>
+        </w:tc>
+        <w:tc>
+          <w:tcPr>
+            <w:tcW w:type="dxa" w:w="3120"/>
+            <w:tcW w:w="2880" w:type="dxa"/>
             <w:shd w:val="clear" w:color="auto" w:fill="FFFFFF"/>
             <w:tcBorders>
               <w:top w:val="single" w:sz="4" w:space="0" w:color="CCCCCC"/>
@@ -6730,28 +8287,7 @@
               <w:rPr>
                 <w:sz w:val="20"/>
               </w:rPr>
-              <w:t>Instagram, TikTok, YouTube</w:t>
-            </w:r>
-          </w:p>
-        </w:tc>
-        <w:tc>
-          <w:tcPr>
-            <w:tcW w:type="dxa" w:w="2340"/>
-            <w:tcW w:w="1440" w:type="dxa"/>
-            <w:shd w:val="clear" w:color="auto" w:fill="FFFFFF"/>
-            <w:tcBorders>
-              <w:top w:val="single" w:sz="4" w:space="0" w:color="CCCCCC"/>
-              <w:left w:val="single" w:sz="4" w:space="0" w:color="CCCCCC"/>
-              <w:bottom w:val="single" w:sz="4" w:space="0" w:color="CCCCCC"/>
-              <w:right w:val="single" w:sz="4" w:space="0" w:color="CCCCCC"/>
-            </w:tcBorders>
-          </w:tcPr>
-          <w:p>
-            <w:r>
-              <w:rPr>
-                <w:sz w:val="20"/>
-              </w:rPr>
-              <w:t>Days 1-2</w:t>
+              <w:t>Clean project structure ready to build</w:t>
             </w:r>
           </w:p>
         </w:tc>
@@ -6759,8 +8295,8 @@
       <w:tr>
         <w:tc>
           <w:tcPr>
-            <w:tcW w:type="dxa" w:w="2340"/>
-            <w:tcW w:w="1440" w:type="dxa"/>
+            <w:tcW w:type="dxa" w:w="3120"/>
+            <w:tcW w:w="1728" w:type="dxa"/>
             <w:shd w:val="clear" w:color="auto" w:fill="F0F4FF"/>
             <w:tcBorders>
               <w:top w:val="single" w:sz="4" w:space="0" w:color="CCCCCC"/>
@@ -6775,13 +8311,15 @@
                 <w:sz w:val="20"/>
               </w:rPr>
               <w:t>Phase 2</w:t>
-            </w:r>
-          </w:p>
-        </w:tc>
-        <w:tc>
-          <w:tcPr>
-            <w:tcW w:type="dxa" w:w="2340"/>
-            <w:tcW w:w="4752" w:type="dxa"/>
+              <w:br/>
+              <w:t>Lark Writer</w:t>
+            </w:r>
+          </w:p>
+        </w:tc>
+        <w:tc>
+          <w:tcPr>
+            <w:tcW w:type="dxa" w:w="3120"/>
+            <w:tcW w:w="6192" w:type="dxa"/>
             <w:shd w:val="clear" w:color="auto" w:fill="F0F4FF"/>
             <w:tcBorders>
               <w:top w:val="single" w:sz="4" w:space="0" w:color="CCCCCC"/>
@@ -6795,14 +8333,14 @@
               <w:rPr>
                 <w:sz w:val="20"/>
               </w:rPr>
-              <w:t>Add remaining platforms + AI performance analysis and recommendations</w:t>
-            </w:r>
-          </w:p>
-        </w:tc>
-        <w:tc>
-          <w:tcPr>
-            <w:tcW w:type="dxa" w:w="2340"/>
-            <w:tcW w:w="3168" w:type="dxa"/>
+              <w:t>lark_writer.py with hard column allowlist + pytest tests proving B/C/F/H raise exceptions</w:t>
+            </w:r>
+          </w:p>
+        </w:tc>
+        <w:tc>
+          <w:tcPr>
+            <w:tcW w:type="dxa" w:w="3120"/>
+            <w:tcW w:w="2880" w:type="dxa"/>
             <w:shd w:val="clear" w:color="auto" w:fill="F0F4FF"/>
             <w:tcBorders>
               <w:top w:val="single" w:sz="4" w:space="0" w:color="CCCCCC"/>
@@ -6816,28 +8354,7 @@
               <w:rPr>
                 <w:sz w:val="20"/>
               </w:rPr>
-              <w:t>Facebook, X, RedNote, Threads</w:t>
-            </w:r>
-          </w:p>
-        </w:tc>
-        <w:tc>
-          <w:tcPr>
-            <w:tcW w:type="dxa" w:w="2340"/>
-            <w:tcW w:w="1440" w:type="dxa"/>
-            <w:shd w:val="clear" w:color="auto" w:fill="F0F4FF"/>
-            <w:tcBorders>
-              <w:top w:val="single" w:sz="4" w:space="0" w:color="CCCCCC"/>
-              <w:left w:val="single" w:sz="4" w:space="0" w:color="CCCCCC"/>
-              <w:bottom w:val="single" w:sz="4" w:space="0" w:color="CCCCCC"/>
-              <w:right w:val="single" w:sz="4" w:space="0" w:color="CCCCCC"/>
-            </w:tcBorders>
-          </w:tcPr>
-          <w:p>
-            <w:r>
-              <w:rPr>
-                <w:sz w:val="20"/>
-              </w:rPr>
-              <w:t>Days 3-4</w:t>
+              <w:t>Green pytest output — safety guaranteed</w:t>
             </w:r>
           </w:p>
         </w:tc>
@@ -6845,8 +8362,8 @@
       <w:tr>
         <w:tc>
           <w:tcPr>
-            <w:tcW w:type="dxa" w:w="2340"/>
-            <w:tcW w:w="1440" w:type="dxa"/>
+            <w:tcW w:type="dxa" w:w="3120"/>
+            <w:tcW w:w="1728" w:type="dxa"/>
             <w:shd w:val="clear" w:color="auto" w:fill="FFFFFF"/>
             <w:tcBorders>
               <w:top w:val="single" w:sz="4" w:space="0" w:color="CCCCCC"/>
@@ -6861,13 +8378,15 @@
                 <w:sz w:val="20"/>
               </w:rPr>
               <w:t>Phase 3</w:t>
-            </w:r>
-          </w:p>
-        </w:tc>
-        <w:tc>
-          <w:tcPr>
-            <w:tcW w:type="dxa" w:w="2340"/>
-            <w:tcW w:w="4752" w:type="dxa"/>
+              <w:br/>
+              <w:t>Lark Reader</w:t>
+            </w:r>
+          </w:p>
+        </w:tc>
+        <w:tc>
+          <w:tcPr>
+            <w:tcW w:type="dxa" w:w="3120"/>
+            <w:tcW w:w="6192" w:type="dxa"/>
             <w:shd w:val="clear" w:color="auto" w:fill="FFFFFF"/>
             <w:tcBorders>
               <w:top w:val="single" w:sz="4" w:space="0" w:color="CCCCCC"/>
@@ -6881,14 +8400,14 @@
               <w:rPr>
                 <w:sz w:val="20"/>
               </w:rPr>
-              <w:t>Batch input, error handling, performance comparison across cycles</w:t>
-            </w:r>
-          </w:p>
-        </w:tc>
-        <w:tc>
-          <w:tcPr>
-            <w:tcW w:type="dxa" w:w="2340"/>
-            <w:tcW w:w="3168" w:type="dxa"/>
+              <w:t>lark_reader.py — find rows where F has URL and A/D/E/G are empty</w:t>
+            </w:r>
+          </w:p>
+        </w:tc>
+        <w:tc>
+          <w:tcPr>
+            <w:tcW w:type="dxa" w:w="3120"/>
+            <w:tcW w:w="2880" w:type="dxa"/>
             <w:shd w:val="clear" w:color="auto" w:fill="FFFFFF"/>
             <w:tcBorders>
               <w:top w:val="single" w:sz="4" w:space="0" w:color="CCCCCC"/>
@@ -6902,14 +8421,83 @@
               <w:rPr>
                 <w:sz w:val="20"/>
               </w:rPr>
-              <w:t>All 7 platforms</w:t>
-            </w:r>
-          </w:p>
-        </w:tc>
-        <w:tc>
-          <w:tcPr>
-            <w:tcW w:type="dxa" w:w="2340"/>
-            <w:tcW w:w="1440" w:type="dxa"/>
+              <w:t>System knows what to process</w:t>
+            </w:r>
+          </w:p>
+        </w:tc>
+      </w:tr>
+      <w:tr>
+        <w:tc>
+          <w:tcPr>
+            <w:tcW w:type="dxa" w:w="3120"/>
+            <w:tcW w:w="1728" w:type="dxa"/>
+            <w:shd w:val="clear" w:color="auto" w:fill="F0F4FF"/>
+            <w:tcBorders>
+              <w:top w:val="single" w:sz="4" w:space="0" w:color="CCCCCC"/>
+              <w:left w:val="single" w:sz="4" w:space="0" w:color="CCCCCC"/>
+              <w:bottom w:val="single" w:sz="4" w:space="0" w:color="CCCCCC"/>
+              <w:right w:val="single" w:sz="4" w:space="0" w:color="CCCCCC"/>
+            </w:tcBorders>
+          </w:tcPr>
+          <w:p>
+            <w:r>
+              <w:rPr>
+                <w:sz w:val="20"/>
+              </w:rPr>
+              <w:t>Phase 4</w:t>
+              <w:br/>
+              <w:t>Processor</w:t>
+            </w:r>
+          </w:p>
+        </w:tc>
+        <w:tc>
+          <w:tcPr>
+            <w:tcW w:type="dxa" w:w="3120"/>
+            <w:tcW w:w="6192" w:type="dxa"/>
+            <w:shd w:val="clear" w:color="auto" w:fill="F0F4FF"/>
+            <w:tcBorders>
+              <w:top w:val="single" w:sz="4" w:space="0" w:color="CCCCCC"/>
+              <w:left w:val="single" w:sz="4" w:space="0" w:color="CCCCCC"/>
+              <w:bottom w:val="single" w:sz="4" w:space="0" w:color="CCCCCC"/>
+              <w:right w:val="single" w:sz="4" w:space="0" w:color="CCCCCC"/>
+            </w:tcBorders>
+          </w:tcPr>
+          <w:p>
+            <w:r>
+              <w:rPr>
+                <w:sz w:val="20"/>
+              </w:rPr>
+              <w:t>processor.py — clean_caption (Unicode hashtag strip), format_date, set_content_type</w:t>
+            </w:r>
+          </w:p>
+        </w:tc>
+        <w:tc>
+          <w:tcPr>
+            <w:tcW w:type="dxa" w:w="3120"/>
+            <w:tcW w:w="2880" w:type="dxa"/>
+            <w:shd w:val="clear" w:color="auto" w:fill="F0F4FF"/>
+            <w:tcBorders>
+              <w:top w:val="single" w:sz="4" w:space="0" w:color="CCCCCC"/>
+              <w:left w:val="single" w:sz="4" w:space="0" w:color="CCCCCC"/>
+              <w:bottom w:val="single" w:sz="4" w:space="0" w:color="CCCCCC"/>
+              <w:right w:val="single" w:sz="4" w:space="0" w:color="CCCCCC"/>
+            </w:tcBorders>
+          </w:tcPr>
+          <w:p>
+            <w:r>
+              <w:rPr>
+                <w:sz w:val="20"/>
+              </w:rPr>
+              <w:t>Clean data ready to write</w:t>
+            </w:r>
+          </w:p>
+        </w:tc>
+      </w:tr>
+      <w:tr>
+        <w:tc>
+          <w:tcPr>
+            <w:tcW w:type="dxa" w:w="3120"/>
+            <w:tcW w:w="1728" w:type="dxa"/>
             <w:shd w:val="clear" w:color="auto" w:fill="FFFFFF"/>
             <w:tcBorders>
               <w:top w:val="single" w:sz="4" w:space="0" w:color="CCCCCC"/>
@@ -6923,7 +8511,252 @@
               <w:rPr>
                 <w:sz w:val="20"/>
               </w:rPr>
-              <w:t>Day 5</w:t>
+              <w:t>Phase 5</w:t>
+              <w:br/>
+              <w:t>Browser</w:t>
+            </w:r>
+          </w:p>
+        </w:tc>
+        <w:tc>
+          <w:tcPr>
+            <w:tcW w:type="dxa" w:w="3120"/>
+            <w:tcW w:w="6192" w:type="dxa"/>
+            <w:shd w:val="clear" w:color="auto" w:fill="FFFFFF"/>
+            <w:tcBorders>
+              <w:top w:val="single" w:sz="4" w:space="0" w:color="CCCCCC"/>
+              <w:left w:val="single" w:sz="4" w:space="0" w:color="CCCCCC"/>
+              <w:bottom w:val="single" w:sz="4" w:space="0" w:color="CCCCCC"/>
+              <w:right w:val="single" w:sz="4" w:space="0" w:color="CCCCCC"/>
+            </w:tcBorders>
+          </w:tcPr>
+          <w:p>
+            <w:r>
+              <w:rPr>
+                <w:sz w:val="20"/>
+              </w:rPr>
+              <w:t>browser_reader.py — Playwright with persistent Chrome profile</w:t>
+            </w:r>
+          </w:p>
+        </w:tc>
+        <w:tc>
+          <w:tcPr>
+            <w:tcW w:type="dxa" w:w="3120"/>
+            <w:tcW w:w="2880" w:type="dxa"/>
+            <w:shd w:val="clear" w:color="auto" w:fill="FFFFFF"/>
+            <w:tcBorders>
+              <w:top w:val="single" w:sz="4" w:space="0" w:color="CCCCCC"/>
+              <w:left w:val="single" w:sz="4" w:space="0" w:color="CCCCCC"/>
+              <w:bottom w:val="single" w:sz="4" w:space="0" w:color="CCCCCC"/>
+              <w:right w:val="single" w:sz="4" w:space="0" w:color="CCCCCC"/>
+            </w:tcBorders>
+          </w:tcPr>
+          <w:p>
+            <w:r>
+              <w:rPr>
+                <w:sz w:val="20"/>
+              </w:rPr>
+              <w:t>Browser opens video pages automatically</w:t>
+            </w:r>
+          </w:p>
+        </w:tc>
+      </w:tr>
+      <w:tr>
+        <w:tc>
+          <w:tcPr>
+            <w:tcW w:type="dxa" w:w="3120"/>
+            <w:tcW w:w="1728" w:type="dxa"/>
+            <w:shd w:val="clear" w:color="auto" w:fill="F0F4FF"/>
+            <w:tcBorders>
+              <w:top w:val="single" w:sz="4" w:space="0" w:color="CCCCCC"/>
+              <w:left w:val="single" w:sz="4" w:space="0" w:color="CCCCCC"/>
+              <w:bottom w:val="single" w:sz="4" w:space="0" w:color="CCCCCC"/>
+              <w:right w:val="single" w:sz="4" w:space="0" w:color="CCCCCC"/>
+            </w:tcBorders>
+          </w:tcPr>
+          <w:p>
+            <w:r>
+              <w:rPr>
+                <w:sz w:val="20"/>
+              </w:rPr>
+              <w:t>Phase 6</w:t>
+              <w:br/>
+              <w:t>Vision</w:t>
+            </w:r>
+          </w:p>
+        </w:tc>
+        <w:tc>
+          <w:tcPr>
+            <w:tcW w:type="dxa" w:w="3120"/>
+            <w:tcW w:w="6192" w:type="dxa"/>
+            <w:shd w:val="clear" w:color="auto" w:fill="F0F4FF"/>
+            <w:tcBorders>
+              <w:top w:val="single" w:sz="4" w:space="0" w:color="CCCCCC"/>
+              <w:left w:val="single" w:sz="4" w:space="0" w:color="CCCCCC"/>
+              <w:bottom w:val="single" w:sz="4" w:space="0" w:color="CCCCCC"/>
+              <w:right w:val="single" w:sz="4" w:space="0" w:color="CCCCCC"/>
+            </w:tcBorders>
+          </w:tcPr>
+          <w:p>
+            <w:r>
+              <w:rPr>
+                <w:sz w:val="20"/>
+              </w:rPr>
+              <w:t>vision_extract.py — screenshot to Claude Haiku Vision to JSON</w:t>
+            </w:r>
+          </w:p>
+        </w:tc>
+        <w:tc>
+          <w:tcPr>
+            <w:tcW w:type="dxa" w:w="3120"/>
+            <w:tcW w:w="2880" w:type="dxa"/>
+            <w:shd w:val="clear" w:color="auto" w:fill="F0F4FF"/>
+            <w:tcBorders>
+              <w:top w:val="single" w:sz="4" w:space="0" w:color="CCCCCC"/>
+              <w:left w:val="single" w:sz="4" w:space="0" w:color="CCCCCC"/>
+              <w:bottom w:val="single" w:sz="4" w:space="0" w:color="CCCCCC"/>
+              <w:right w:val="single" w:sz="4" w:space="0" w:color="CCCCCC"/>
+            </w:tcBorders>
+          </w:tcPr>
+          <w:p>
+            <w:r>
+              <w:rPr>
+                <w:sz w:val="20"/>
+              </w:rPr>
+              <w:t>AI extracts posted_date, caption, view_count</w:t>
+            </w:r>
+          </w:p>
+        </w:tc>
+      </w:tr>
+      <w:tr>
+        <w:tc>
+          <w:tcPr>
+            <w:tcW w:type="dxa" w:w="3120"/>
+            <w:tcW w:w="1728" w:type="dxa"/>
+            <w:shd w:val="clear" w:color="auto" w:fill="FFFFFF"/>
+            <w:tcBorders>
+              <w:top w:val="single" w:sz="4" w:space="0" w:color="CCCCCC"/>
+              <w:left w:val="single" w:sz="4" w:space="0" w:color="CCCCCC"/>
+              <w:bottom w:val="single" w:sz="4" w:space="0" w:color="CCCCCC"/>
+              <w:right w:val="single" w:sz="4" w:space="0" w:color="CCCCCC"/>
+            </w:tcBorders>
+          </w:tcPr>
+          <w:p>
+            <w:r>
+              <w:rPr>
+                <w:sz w:val="20"/>
+              </w:rPr>
+              <w:t>Phase 7</w:t>
+              <w:br/>
+              <w:t>Wiring</w:t>
+            </w:r>
+          </w:p>
+        </w:tc>
+        <w:tc>
+          <w:tcPr>
+            <w:tcW w:type="dxa" w:w="3120"/>
+            <w:tcW w:w="6192" w:type="dxa"/>
+            <w:shd w:val="clear" w:color="auto" w:fill="FFFFFF"/>
+            <w:tcBorders>
+              <w:top w:val="single" w:sz="4" w:space="0" w:color="CCCCCC"/>
+              <w:left w:val="single" w:sz="4" w:space="0" w:color="CCCCCC"/>
+              <w:bottom w:val="single" w:sz="4" w:space="0" w:color="CCCCCC"/>
+              <w:right w:val="single" w:sz="4" w:space="0" w:color="CCCCCC"/>
+            </w:tcBorders>
+          </w:tcPr>
+          <w:p>
+            <w:r>
+              <w:rPr>
+                <w:sz w:val="20"/>
+              </w:rPr>
+              <w:t>run.py + reporter.py — wire everything together + run summary</w:t>
+            </w:r>
+          </w:p>
+        </w:tc>
+        <w:tc>
+          <w:tcPr>
+            <w:tcW w:type="dxa" w:w="3120"/>
+            <w:tcW w:w="2880" w:type="dxa"/>
+            <w:shd w:val="clear" w:color="auto" w:fill="FFFFFF"/>
+            <w:tcBorders>
+              <w:top w:val="single" w:sz="4" w:space="0" w:color="CCCCCC"/>
+              <w:left w:val="single" w:sz="4" w:space="0" w:color="CCCCCC"/>
+              <w:bottom w:val="single" w:sz="4" w:space="0" w:color="CCCCCC"/>
+              <w:right w:val="single" w:sz="4" w:space="0" w:color="CCCCCC"/>
+            </w:tcBorders>
+          </w:tcPr>
+          <w:p>
+            <w:r>
+              <w:rPr>
+                <w:sz w:val="20"/>
+              </w:rPr>
+              <w:t>Single command runs full system</w:t>
+            </w:r>
+          </w:p>
+        </w:tc>
+      </w:tr>
+      <w:tr>
+        <w:tc>
+          <w:tcPr>
+            <w:tcW w:type="dxa" w:w="3120"/>
+            <w:tcW w:w="1728" w:type="dxa"/>
+            <w:shd w:val="clear" w:color="auto" w:fill="F0F4FF"/>
+            <w:tcBorders>
+              <w:top w:val="single" w:sz="4" w:space="0" w:color="CCCCCC"/>
+              <w:left w:val="single" w:sz="4" w:space="0" w:color="CCCCCC"/>
+              <w:bottom w:val="single" w:sz="4" w:space="0" w:color="CCCCCC"/>
+              <w:right w:val="single" w:sz="4" w:space="0" w:color="CCCCCC"/>
+            </w:tcBorders>
+          </w:tcPr>
+          <w:p>
+            <w:r>
+              <w:rPr>
+                <w:sz w:val="20"/>
+              </w:rPr>
+              <w:t>Phase 8</w:t>
+              <w:br/>
+              <w:t>Testing</w:t>
+            </w:r>
+          </w:p>
+        </w:tc>
+        <w:tc>
+          <w:tcPr>
+            <w:tcW w:type="dxa" w:w="3120"/>
+            <w:tcW w:w="6192" w:type="dxa"/>
+            <w:shd w:val="clear" w:color="auto" w:fill="F0F4FF"/>
+            <w:tcBorders>
+              <w:top w:val="single" w:sz="4" w:space="0" w:color="CCCCCC"/>
+              <w:left w:val="single" w:sz="4" w:space="0" w:color="CCCCCC"/>
+              <w:bottom w:val="single" w:sz="4" w:space="0" w:color="CCCCCC"/>
+              <w:right w:val="single" w:sz="4" w:space="0" w:color="CCCCCC"/>
+            </w:tcBorders>
+          </w:tcPr>
+          <w:p>
+            <w:r>
+              <w:rPr>
+                <w:sz w:val="20"/>
+              </w:rPr>
+              <w:t>End-to-end test on 3 real YouTube URLs</w:t>
+            </w:r>
+          </w:p>
+        </w:tc>
+        <w:tc>
+          <w:tcPr>
+            <w:tcW w:type="dxa" w:w="3120"/>
+            <w:tcW w:w="2880" w:type="dxa"/>
+            <w:shd w:val="clear" w:color="auto" w:fill="F0F4FF"/>
+            <w:tcBorders>
+              <w:top w:val="single" w:sz="4" w:space="0" w:color="CCCCCC"/>
+              <w:left w:val="single" w:sz="4" w:space="0" w:color="CCCCCC"/>
+              <w:bottom w:val="single" w:sz="4" w:space="0" w:color="CCCCCC"/>
+              <w:right w:val="single" w:sz="4" w:space="0" w:color="CCCCCC"/>
+            </w:tcBorders>
+          </w:tcPr>
+          <w:p>
+            <w:r>
+              <w:rPr>
+                <w:sz w:val="20"/>
+              </w:rPr>
+              <w:t>Proven working system</w:t>
             </w:r>
           </w:p>
         </w:tc>
@@ -6935,7 +8768,7 @@
         <w:pStyle w:val="Heading1"/>
       </w:pPr>
       <w:r>
-        <w:t>12. Success Criteria</w:t>
+        <w:t>14. Success Criteria</w:t>
       </w:r>
     </w:p>
     <w:tbl>
@@ -7035,7 +8868,7 @@
               <w:rPr>
                 <w:sz w:val="20"/>
               </w:rPr>
-              <w:t>At least 80% reduction vs current manual process</w:t>
+              <w:t>At least 80% reduction</w:t>
             </w:r>
           </w:p>
         </w:tc>
@@ -7058,7 +8891,7 @@
               <w:rPr>
                 <w:sz w:val="20"/>
               </w:rPr>
-              <w:t>Manual data entry required</w:t>
+              <w:t>Columns B, C, F, H protection</w:t>
             </w:r>
           </w:p>
         </w:tc>
@@ -7079,7 +8912,7 @@
               <w:rPr>
                 <w:sz w:val="20"/>
               </w:rPr>
-              <w:t>Zero — system fills Columns A, D, E, F, G automatically</w:t>
+              <w:t>100% — exception raised if write attempted</w:t>
             </w:r>
           </w:p>
         </w:tc>
@@ -7102,7 +8935,7 @@
               <w:rPr>
                 <w:sz w:val="20"/>
               </w:rPr>
-              <w:t>Columns B, C, H protection</w:t>
+              <w:t>Column F (user URL)</w:t>
             </w:r>
           </w:p>
         </w:tc>
@@ -7123,7 +8956,7 @@
               <w:rPr>
                 <w:sz w:val="20"/>
               </w:rPr>
-              <w:t>100% — system never writes to these columns</w:t>
+              <w:t>Never overwritten — always preserved</w:t>
             </w:r>
           </w:p>
         </w:tc>
@@ -7167,7 +9000,7 @@
               <w:rPr>
                 <w:sz w:val="20"/>
               </w:rPr>
-              <w:t>99% match with figures shown on each platform</w:t>
+              <w:t>99% match with what is shown on the video page</w:t>
             </w:r>
           </w:p>
         </w:tc>
@@ -7211,7 +9044,7 @@
               <w:rPr>
                 <w:sz w:val="20"/>
               </w:rPr>
-              <w:t>Correct caption extracted with zero hashtags remaining</w:t>
+              <w:t>Correct caption with zero hashtags remaining</w:t>
             </w:r>
           </w:p>
         </w:tc>
@@ -7278,7 +9111,7 @@
               <w:rPr>
                 <w:sz w:val="20"/>
               </w:rPr>
-              <w:t>AI recommendations</w:t>
+              <w:t>pytest tests</w:t>
             </w:r>
           </w:p>
         </w:tc>
@@ -7299,7 +9132,51 @@
               <w:rPr>
                 <w:sz w:val="20"/>
               </w:rPr>
-              <w:t>At least 3 actionable video content suggestions per reporting cycle</w:t>
+              <w:t>All green — B/C/F/H write tests must pass</w:t>
+            </w:r>
+          </w:p>
+        </w:tc>
+      </w:tr>
+      <w:tr>
+        <w:tc>
+          <w:tcPr>
+            <w:tcW w:type="dxa" w:w="4680"/>
+            <w:tcW w:w="5040" w:type="dxa"/>
+            <w:shd w:val="clear" w:color="auto" w:fill="F0F4FF"/>
+            <w:tcBorders>
+              <w:top w:val="single" w:sz="4" w:space="0" w:color="CCCCCC"/>
+              <w:left w:val="single" w:sz="4" w:space="0" w:color="CCCCCC"/>
+              <w:bottom w:val="single" w:sz="4" w:space="0" w:color="CCCCCC"/>
+              <w:right w:val="single" w:sz="4" w:space="0" w:color="CCCCCC"/>
+            </w:tcBorders>
+          </w:tcPr>
+          <w:p>
+            <w:r>
+              <w:rPr>
+                <w:sz w:val="20"/>
+              </w:rPr>
+              <w:t>Trigger method</w:t>
+            </w:r>
+          </w:p>
+        </w:tc>
+        <w:tc>
+          <w:tcPr>
+            <w:tcW w:type="dxa" w:w="4680"/>
+            <w:tcW w:w="5760" w:type="dxa"/>
+            <w:shd w:val="clear" w:color="auto" w:fill="F0F4FF"/>
+            <w:tcBorders>
+              <w:top w:val="single" w:sz="4" w:space="0" w:color="CCCCCC"/>
+              <w:left w:val="single" w:sz="4" w:space="0" w:color="CCCCCC"/>
+              <w:bottom w:val="single" w:sz="4" w:space="0" w:color="CCCCCC"/>
+              <w:right w:val="single" w:sz="4" w:space="0" w:color="CCCCCC"/>
+            </w:tcBorders>
+          </w:tcPr>
+          <w:p>
+            <w:r>
+              <w:rPr>
+                <w:sz w:val="20"/>
+              </w:rPr>
+              <w:t>python run.py — single command, no UI needed</w:t>
             </w:r>
           </w:p>
         </w:tc>
@@ -7311,7 +9188,7 @@
         <w:pStyle w:val="Heading1"/>
       </w:pPr>
       <w:r>
-        <w:t>13. Glossary</w:t>
+        <w:t>15. Glossary</w:t>
       </w:r>
     </w:p>
     <w:tbl>
@@ -7390,7 +9267,7 @@
               <w:rPr>
                 <w:sz w:val="20"/>
               </w:rPr>
-              <w:t>Reach (Column G)</w:t>
+              <w:t>Playwright</w:t>
             </w:r>
           </w:p>
         </w:tc>
@@ -7411,7 +9288,7 @@
               <w:rPr>
                 <w:sz w:val="20"/>
               </w:rPr>
-              <w:t>The view count of a video as displayed on the platform profile page.</w:t>
+              <w:t>A Python library that controls a real Chrome browser automatically.</w:t>
             </w:r>
           </w:p>
         </w:tc>
@@ -7434,7 +9311,7 @@
               <w:rPr>
                 <w:sz w:val="20"/>
               </w:rPr>
-              <w:t>Caption</w:t>
+              <w:t>Claude Vision</w:t>
             </w:r>
           </w:p>
         </w:tc>
@@ -7455,7 +9332,7 @@
               <w:rPr>
                 <w:sz w:val="20"/>
               </w:rPr>
-              <w:t>The text description written with a video post. Hashtags are removed before saving.</w:t>
+              <w:t>Claude AI's ability to look at a screenshot and extract information from it.</w:t>
             </w:r>
           </w:p>
         </w:tc>
@@ -7478,7 +9355,7 @@
               <w:rPr>
                 <w:sz w:val="20"/>
               </w:rPr>
-              <w:t>Hashtag</w:t>
+              <w:t>Persistent Chrome Profile</w:t>
             </w:r>
           </w:p>
         </w:tc>
@@ -7499,7 +9376,7 @@
               <w:rPr>
                 <w:sz w:val="20"/>
               </w:rPr>
-              <w:t>Words starting with # used for discoverability on social media. Always removed from Column D.</w:t>
+              <w:t>A saved browser session that remembers your logins across runs.</w:t>
             </w:r>
           </w:p>
         </w:tc>
@@ -7522,7 +9399,7 @@
               <w:rPr>
                 <w:sz w:val="20"/>
               </w:rPr>
-              <w:t>Lark Sheet</w:t>
+              <w:t>Hard Allowlist</w:t>
             </w:r>
           </w:p>
         </w:tc>
@@ -7543,7 +9420,7 @@
               <w:rPr>
                 <w:sz w:val="20"/>
               </w:rPr>
-              <w:t>The spreadsheet tool inside Lark (Feishu) where the user tracks video performance.</w:t>
+              <w:t>A strict list of allowed columns in code — any other column raises an exception immediately.</w:t>
             </w:r>
           </w:p>
         </w:tc>
@@ -7566,7 +9443,7 @@
               <w:rPr>
                 <w:sz w:val="20"/>
               </w:rPr>
-              <w:t>PIC</w:t>
+              <w:t>Unicode-aware Regex</w:t>
             </w:r>
           </w:p>
         </w:tc>
@@ -7587,7 +9464,7 @@
               <w:rPr>
                 <w:sz w:val="20"/>
               </w:rPr>
-              <w:t>Person In Charge — filled manually by the user in Column C.</w:t>
+              <w:t>A pattern that matches hashtags in any language, including Chinese, Arabic, and emoji-based tags.</w:t>
             </w:r>
           </w:p>
         </w:tc>
@@ -7610,7 +9487,7 @@
               <w:rPr>
                 <w:sz w:val="20"/>
               </w:rPr>
-              <w:t>Content Casual</w:t>
+              <w:t>run.py</w:t>
             </w:r>
           </w:p>
         </w:tc>
@@ -7631,7 +9508,7 @@
               <w:rPr>
                 <w:sz w:val="20"/>
               </w:rPr>
-              <w:t>The default content type category auto-filled in Column E for all videos.</w:t>
+              <w:t>The single Python file the user runs to trigger the entire system.</w:t>
             </w:r>
           </w:p>
         </w:tc>
@@ -7654,7 +9531,7 @@
               <w:rPr>
                 <w:sz w:val="20"/>
               </w:rPr>
-              <w:t>Final Reach</w:t>
+              <w:t>lark_writer.py</w:t>
             </w:r>
           </w:p>
         </w:tc>
@@ -7675,7 +9552,7 @@
               <w:rPr>
                 <w:sz w:val="20"/>
               </w:rPr>
-              <w:t>A manually calculated field in Column H — the system never touches this column.</w:t>
+              <w:t>The module that writes data to Lark Sheet — enforces the column allowlist.</w:t>
             </w:r>
           </w:p>
         </w:tc>
@@ -7698,7 +9575,7 @@
               <w:rPr>
                 <w:sz w:val="20"/>
               </w:rPr>
-              <w:t>RedNote</w:t>
+              <w:t>lark_reader.py</w:t>
             </w:r>
           </w:p>
         </w:tc>
@@ -7719,7 +9596,7 @@
               <w:rPr>
                 <w:sz w:val="20"/>
               </w:rPr>
-              <w:t>Also known as Xiaohongshu — a Chinese social media and lifestyle platform.</w:t>
+              <w:t>The module that reads the Lark Sheet to find rows needing processing.</w:t>
             </w:r>
           </w:p>
         </w:tc>
@@ -7742,7 +9619,7 @@
               <w:rPr>
                 <w:sz w:val="20"/>
               </w:rPr>
-              <w:t>MoSCoW</w:t>
+              <w:t>vision_extract.py</w:t>
             </w:r>
           </w:p>
         </w:tc>
@@ -7763,7 +9640,95 @@
               <w:rPr>
                 <w:sz w:val="20"/>
               </w:rPr>
-              <w:t>Prioritisation method: Must Have, Should Have, Could Have, Would not Have this time.</w:t>
+              <w:t>The module that sends screenshots to Claude Vision and returns structured data.</w:t>
+            </w:r>
+          </w:p>
+        </w:tc>
+      </w:tr>
+      <w:tr>
+        <w:tc>
+          <w:tcPr>
+            <w:tcW w:type="dxa" w:w="4680"/>
+            <w:tcW w:w="2880" w:type="dxa"/>
+            <w:shd w:val="clear" w:color="auto" w:fill="F0F4FF"/>
+            <w:tcBorders>
+              <w:top w:val="single" w:sz="4" w:space="0" w:color="CCCCCC"/>
+              <w:left w:val="single" w:sz="4" w:space="0" w:color="CCCCCC"/>
+              <w:bottom w:val="single" w:sz="4" w:space="0" w:color="CCCCCC"/>
+              <w:right w:val="single" w:sz="4" w:space="0" w:color="CCCCCC"/>
+            </w:tcBorders>
+          </w:tcPr>
+          <w:p>
+            <w:r>
+              <w:rPr>
+                <w:sz w:val="20"/>
+              </w:rPr>
+              <w:t>Content Casual</w:t>
+            </w:r>
+          </w:p>
+        </w:tc>
+        <w:tc>
+          <w:tcPr>
+            <w:tcW w:type="dxa" w:w="4680"/>
+            <w:tcW w:w="7920" w:type="dxa"/>
+            <w:shd w:val="clear" w:color="auto" w:fill="F0F4FF"/>
+            <w:tcBorders>
+              <w:top w:val="single" w:sz="4" w:space="0" w:color="CCCCCC"/>
+              <w:left w:val="single" w:sz="4" w:space="0" w:color="CCCCCC"/>
+              <w:bottom w:val="single" w:sz="4" w:space="0" w:color="CCCCCC"/>
+              <w:right w:val="single" w:sz="4" w:space="0" w:color="CCCCCC"/>
+            </w:tcBorders>
+          </w:tcPr>
+          <w:p>
+            <w:r>
+              <w:rPr>
+                <w:sz w:val="20"/>
+              </w:rPr>
+              <w:t>The hardcoded default value always written to Column E.</w:t>
+            </w:r>
+          </w:p>
+        </w:tc>
+      </w:tr>
+      <w:tr>
+        <w:tc>
+          <w:tcPr>
+            <w:tcW w:type="dxa" w:w="4680"/>
+            <w:tcW w:w="2880" w:type="dxa"/>
+            <w:shd w:val="clear" w:color="auto" w:fill="FFFFFF"/>
+            <w:tcBorders>
+              <w:top w:val="single" w:sz="4" w:space="0" w:color="CCCCCC"/>
+              <w:left w:val="single" w:sz="4" w:space="0" w:color="CCCCCC"/>
+              <w:bottom w:val="single" w:sz="4" w:space="0" w:color="CCCCCC"/>
+              <w:right w:val="single" w:sz="4" w:space="0" w:color="CCCCCC"/>
+            </w:tcBorders>
+          </w:tcPr>
+          <w:p>
+            <w:r>
+              <w:rPr>
+                <w:sz w:val="20"/>
+              </w:rPr>
+              <w:t>Final Reach</w:t>
+            </w:r>
+          </w:p>
+        </w:tc>
+        <w:tc>
+          <w:tcPr>
+            <w:tcW w:type="dxa" w:w="4680"/>
+            <w:tcW w:w="7920" w:type="dxa"/>
+            <w:shd w:val="clear" w:color="auto" w:fill="FFFFFF"/>
+            <w:tcBorders>
+              <w:top w:val="single" w:sz="4" w:space="0" w:color="CCCCCC"/>
+              <w:left w:val="single" w:sz="4" w:space="0" w:color="CCCCCC"/>
+              <w:bottom w:val="single" w:sz="4" w:space="0" w:color="CCCCCC"/>
+              <w:right w:val="single" w:sz="4" w:space="0" w:color="CCCCCC"/>
+            </w:tcBorders>
+          </w:tcPr>
+          <w:p>
+            <w:r>
+              <w:rPr>
+                <w:sz w:val="20"/>
+              </w:rPr>
+              <w:t>Column H — manually calculated by the user. System never touches this.</w:t>
             </w:r>
           </w:p>
         </w:tc>
@@ -7776,7 +9741,7 @@
         <w:pStyle w:val="Heading1"/>
       </w:pPr>
       <w:r>
-        <w:t>14. Sign-Off &amp; Approval</w:t>
+        <w:t>16. Sign-Off &amp; Approval</w:t>
       </w:r>
     </w:p>
     <w:p>
@@ -8160,7 +10125,7 @@
           <w:color w:val="595959"/>
           <w:sz w:val="18"/>
         </w:rPr>
-        <w:t>— End of Document — Version 3.0 —</w:t>
+        <w:t>— End of Document — Version 4.0 —</w:t>
       </w:r>
     </w:p>
     <w:sectPr>

</xml_diff>

<commit_message>
BRD v5.3: update Instagram extraction description, watcher to 3 min
Co-Authored-By: Claude Sonnet 4.6 <noreply@anthropic.com>
</commit_message>
<xml_diff>
--- a/BRD_Auto_Count_Social_Media_Reach.docx
+++ b/BRD_Auto_Count_Social_Media_Reach.docx
@@ -96,7 +96,7 @@
               <w:rPr>
                 <w:sz w:val="20"/>
               </w:rPr>
-              <w:t>5.2</w:t>
+              <w:t>5.3</w:t>
             </w:r>
           </w:p>
         </w:tc>
@@ -949,7 +949,7 @@
               <w:rPr>
                 <w:sz w:val="20"/>
               </w:rPr>
-              <w:t>14 May 2026</w:t>
+              <w:t>13 May 2026</w:t>
             </w:r>
           </w:p>
         </w:tc>
@@ -992,6 +992,92 @@
                 <w:sz w:val="20"/>
               </w:rPr>
               <w:t>Feedback fixes: clarified Phase 1 vs Phase 2 platform scope, reconciled baseline metric (40 min/week), aligned AC-03 and NFR-02 accuracy thresholds</w:t>
+            </w:r>
+          </w:p>
+        </w:tc>
+      </w:tr>
+      <w:tr>
+        <w:tc>
+          <w:tcPr>
+            <w:tcW w:type="dxa" w:w="2340"/>
+            <w:tcW w:w="1007" w:type="dxa"/>
+            <w:shd w:val="clear" w:color="auto" w:fill="F0F4FF"/>
+            <w:tcBorders>
+              <w:top w:val="single" w:sz="4" w:space="0" w:color="CCCCCC"/>
+              <w:left w:val="single" w:sz="4" w:space="0" w:color="CCCCCC"/>
+              <w:bottom w:val="single" w:sz="4" w:space="0" w:color="CCCCCC"/>
+              <w:right w:val="single" w:sz="4" w:space="0" w:color="CCCCCC"/>
+            </w:tcBorders>
+          </w:tcPr>
+          <w:p>
+            <w:r>
+              <w:rPr>
+                <w:sz w:val="20"/>
+              </w:rPr>
+              <w:t>5.3</w:t>
+            </w:r>
+          </w:p>
+        </w:tc>
+        <w:tc>
+          <w:tcPr>
+            <w:tcW w:type="dxa" w:w="2340"/>
+            <w:tcW w:w="2160" w:type="dxa"/>
+            <w:shd w:val="clear" w:color="auto" w:fill="F0F4FF"/>
+            <w:tcBorders>
+              <w:top w:val="single" w:sz="4" w:space="0" w:color="CCCCCC"/>
+              <w:left w:val="single" w:sz="4" w:space="0" w:color="CCCCCC"/>
+              <w:bottom w:val="single" w:sz="4" w:space="0" w:color="CCCCCC"/>
+              <w:right w:val="single" w:sz="4" w:space="0" w:color="CCCCCC"/>
+            </w:tcBorders>
+          </w:tcPr>
+          <w:p>
+            <w:r>
+              <w:rPr>
+                <w:sz w:val="20"/>
+              </w:rPr>
+              <w:t>14 May 2026</w:t>
+            </w:r>
+          </w:p>
+        </w:tc>
+        <w:tc>
+          <w:tcPr>
+            <w:tcW w:type="dxa" w:w="2340"/>
+            <w:tcW w:w="2160" w:type="dxa"/>
+            <w:shd w:val="clear" w:color="auto" w:fill="F0F4FF"/>
+            <w:tcBorders>
+              <w:top w:val="single" w:sz="4" w:space="0" w:color="CCCCCC"/>
+              <w:left w:val="single" w:sz="4" w:space="0" w:color="CCCCCC"/>
+              <w:bottom w:val="single" w:sz="4" w:space="0" w:color="CCCCCC"/>
+              <w:right w:val="single" w:sz="4" w:space="0" w:color="CCCCCC"/>
+            </w:tcBorders>
+          </w:tcPr>
+          <w:p>
+            <w:r>
+              <w:rPr>
+                <w:sz w:val="20"/>
+              </w:rPr>
+              <w:t>jingyi-rere</w:t>
+            </w:r>
+          </w:p>
+        </w:tc>
+        <w:tc>
+          <w:tcPr>
+            <w:tcW w:type="dxa" w:w="2340"/>
+            <w:tcW w:w="5472" w:type="dxa"/>
+            <w:shd w:val="clear" w:color="auto" w:fill="F0F4FF"/>
+            <w:tcBorders>
+              <w:top w:val="single" w:sz="4" w:space="0" w:color="CCCCCC"/>
+              <w:left w:val="single" w:sz="4" w:space="0" w:color="CCCCCC"/>
+              <w:bottom w:val="single" w:sz="4" w:space="0" w:color="CCCCCC"/>
+              <w:right w:val="single" w:sz="4" w:space="0" w:color="CCCCCC"/>
+            </w:tcBorders>
+          </w:tcPr>
+          <w:p>
+            <w:r>
+              <w:rPr>
+                <w:sz w:val="20"/>
+              </w:rPr>
+              <w:t>Instagram view count fix: now extracted from reel page screenshot (taken before Escape key) — guarantees correct reel. Watcher interval reduced to 3 minutes. Grid navigation retained for caption/date only.</w:t>
             </w:r>
           </w:p>
         </w:tc>
@@ -1022,7 +1108,7 @@
         <w:t xml:space="preserve">A video content creator at ricebowlmy spends approximately 40 minutes every week manually collecting performance data (posted date, caption, view count) from 4 social media platforms (Instagram, YouTube, TikTok, RedNote) and typing it into a Lark Bitable tracking sheet. This is pure manual data entry — repetitive, error-prone, and done at the end of an already busy week. </w:t>
         <w:br/>
         <w:br/>
-        <w:t xml:space="preserve">This system eliminates that 40 minutes. The user pastes video URLs into Lark Column F. A background watcher detects new URLs within 5 minutes and fills in all data automatically: posted date (Column A), caption with hashtags removed (Column D), content type (Column E), and view count (Column G). </w:t>
+        <w:t xml:space="preserve">This system eliminates that 40 minutes. The user pastes video URLs into Lark Column F. A background watcher detects new URLs within 3 minutes and fills in all data automatically: posted date (Column A), caption with hashtags removed (Column D), content type (Column E), and view count (Column G). </w:t>
         <w:br/>
         <w:br/>
         <w:t xml:space="preserve">Claude AI Vision is required — not optional — because three of the four platforms (Instagram, TikTok, RedNote) have no public API available, block automated scrapers, and present data visually in ways that change with every UI update. Only AI vision can reliably read any screenshot regardless of platform, language, or UI version. </w:t>
@@ -3987,7 +4073,7 @@
               <w:rPr>
                 <w:sz w:val="20"/>
               </w:rPr>
-              <w:t>Within 5 minutes of URL paste</w:t>
+              <w:t>Within 3 minutes of URL paste</w:t>
             </w:r>
           </w:p>
         </w:tc>
@@ -4099,7 +4185,7 @@
         <w:rPr>
           <w:sz w:val="22"/>
         </w:rPr>
-        <w:t>Process new URLs within 5 minutes of being pasted — no batch end-of-week delay.</w:t>
+        <w:t>Process new URLs within 3 minutes of being pasted — no batch end-of-week delay.</w:t>
       </w:r>
     </w:p>
     <w:p>
@@ -4218,7 +4304,7 @@
               <w:rPr>
                 <w:sz w:val="20"/>
               </w:rPr>
-              <w:t>As a video content creator, I want to paste video URLs into Column F and have the system fill columns A, D, E, G automatically within 5 minutes — so I save the 40 minutes I currently spend on manual data entry every week.</w:t>
+              <w:t>As a video content creator, I want to paste video URLs into Column F and have the system fill columns A, D, E, G automatically within 3 minutes — so I save the 40 minutes I currently spend on manual data entry every week.</w:t>
             </w:r>
           </w:p>
         </w:tc>
@@ -5682,7 +5768,7 @@
               <w:rPr>
                 <w:sz w:val="20"/>
               </w:rPr>
-              <w:t>Watcher checks Lark every 5 minutes — finds rows where Column F has URL but A/D/E/G are empty</w:t>
+              <w:t>Watcher checks Lark every 3 minutes — finds rows where Column F has URL but A/D/E/G are empty</w:t>
             </w:r>
           </w:p>
         </w:tc>
@@ -7553,7 +7639,7 @@
               <w:rPr>
                 <w:sz w:val="20"/>
               </w:rPr>
-              <w:t>For Instagram: system takes two screenshots — reel page (caption + date) and profile grid (view count).</w:t>
+              <w:t>For Instagram: system takes two screenshots — reel page screenshot (view count, captured immediately before any navigation) and split-view screenshot (caption + date, from clicking the profile grid thumbnail).</w:t>
             </w:r>
           </w:p>
         </w:tc>
@@ -8223,7 +8309,7 @@
               <w:rPr>
                 <w:sz w:val="20"/>
               </w:rPr>
-              <w:t>System runs as a background watcher (watcher.py) — checks Lark every 5 minutes automatically.</w:t>
+              <w:t>System runs as a background watcher (watcher.py) — checks Lark every 3 minutes automatically.</w:t>
             </w:r>
           </w:p>
         </w:tc>
@@ -8782,7 +8868,7 @@
               <w:rPr>
                 <w:sz w:val="20"/>
               </w:rPr>
-              <w:t>Process up to 20 video URLs within 5 minutes.</w:t>
+              <w:t>Process up to 20 video URLs within 3 minutes.</w:t>
             </w:r>
           </w:p>
         </w:tc>
@@ -11645,7 +11731,7 @@
               <w:rPr>
                 <w:sz w:val="20"/>
               </w:rPr>
-              <w:t>Time from pasting URL to data appearing in Lark is under 5 minutes.</w:t>
+              <w:t>Time from pasting URL to data appearing in Lark is under 3 minutes.</w:t>
             </w:r>
           </w:p>
         </w:tc>
@@ -11687,7 +11773,7 @@
               <w:rPr>
                 <w:sz w:val="20"/>
               </w:rPr>
-              <w:t>PASS if data appears within 5 minutes.</w:t>
+              <w:t>PASS if data appears within 3 minutes.</w:t>
             </w:r>
           </w:p>
         </w:tc>

</xml_diff>

<commit_message>
Update BRD and TDD documents
</commit_message>
<xml_diff>
--- a/BRD_Auto_Count_Social_Media_Reach.docx
+++ b/BRD_Auto_Count_Social_Media_Reach.docx
@@ -140,7 +140,7 @@
               <w:rPr>
                 <w:sz w:val="20"/>
               </w:rPr>
-              <w:t>14 May 2026</w:t>
+              <w:t>18 May 2026</w:t>
             </w:r>
           </w:p>
         </w:tc>
@@ -1035,7 +1035,7 @@
               <w:rPr>
                 <w:sz w:val="20"/>
               </w:rPr>
-              <w:t>14 May 2026</w:t>
+              <w:t>18 May 2026</w:t>
             </w:r>
           </w:p>
         </w:tc>

</xml_diff>

<commit_message>
Update BRD v5.4 and TDD v3.4 — address boss feedback
BRD v5.4:
- Remove defensive baseline note; state 4 min x 10 videos = 40 min/week upfront
- Move Phase 2 platforms (Facebook, X, Threads) to Appendix A (Future Scope)

TDD v3.4:
- Add reason for 3-min watcher interval (Vision takes 2-4 min, 5-min was too close)
- Clarify 283 tests updated to match Instagram before-Escape architecture
- Replace vague SLA note with concrete batch estimate (5 Instagram URLs = 15-20 min)
</commit_message>
<xml_diff>
--- a/BRD_Auto_Count_Social_Media_Reach.docx
+++ b/BRD_Auto_Count_Social_Media_Reach.docx
@@ -96,7 +96,7 @@
               <w:rPr>
                 <w:sz w:val="20"/>
               </w:rPr>
-              <w:t>5.3</w:t>
+              <w:t>5.4</w:t>
             </w:r>
           </w:p>
         </w:tc>
@@ -1078,6 +1078,92 @@
                 <w:sz w:val="20"/>
               </w:rPr>
               <w:t>Instagram view count fix: now extracted from reel page screenshot (taken before Escape key) — guarantees correct reel. Watcher interval reduced to 3 minutes. Grid navigation retained for caption/date only.</w:t>
+            </w:r>
+          </w:p>
+        </w:tc>
+      </w:tr>
+      <w:tr>
+        <w:tc>
+          <w:tcPr>
+            <w:tcW w:type="dxa" w:w="2340"/>
+            <w:tcW w:w="1007" w:type="dxa"/>
+            <w:shd w:val="clear" w:color="auto" w:fill="FFFFFF"/>
+            <w:tcBorders>
+              <w:top w:val="single" w:sz="4" w:space="0" w:color="CCCCCC"/>
+              <w:left w:val="single" w:sz="4" w:space="0" w:color="CCCCCC"/>
+              <w:bottom w:val="single" w:sz="4" w:space="0" w:color="CCCCCC"/>
+              <w:right w:val="single" w:sz="4" w:space="0" w:color="CCCCCC"/>
+            </w:tcBorders>
+          </w:tcPr>
+          <w:p>
+            <w:r>
+              <w:rPr>
+                <w:sz w:val="20"/>
+              </w:rPr>
+              <w:t>5.4</w:t>
+            </w:r>
+          </w:p>
+        </w:tc>
+        <w:tc>
+          <w:tcPr>
+            <w:tcW w:type="dxa" w:w="2340"/>
+            <w:tcW w:w="2160" w:type="dxa"/>
+            <w:shd w:val="clear" w:color="auto" w:fill="FFFFFF"/>
+            <w:tcBorders>
+              <w:top w:val="single" w:sz="4" w:space="0" w:color="CCCCCC"/>
+              <w:left w:val="single" w:sz="4" w:space="0" w:color="CCCCCC"/>
+              <w:bottom w:val="single" w:sz="4" w:space="0" w:color="CCCCCC"/>
+              <w:right w:val="single" w:sz="4" w:space="0" w:color="CCCCCC"/>
+            </w:tcBorders>
+          </w:tcPr>
+          <w:p>
+            <w:r>
+              <w:rPr>
+                <w:sz w:val="20"/>
+              </w:rPr>
+              <w:t>18 May 2026</w:t>
+            </w:r>
+          </w:p>
+        </w:tc>
+        <w:tc>
+          <w:tcPr>
+            <w:tcW w:type="dxa" w:w="2340"/>
+            <w:tcW w:w="2160" w:type="dxa"/>
+            <w:shd w:val="clear" w:color="auto" w:fill="FFFFFF"/>
+            <w:tcBorders>
+              <w:top w:val="single" w:sz="4" w:space="0" w:color="CCCCCC"/>
+              <w:left w:val="single" w:sz="4" w:space="0" w:color="CCCCCC"/>
+              <w:bottom w:val="single" w:sz="4" w:space="0" w:color="CCCCCC"/>
+              <w:right w:val="single" w:sz="4" w:space="0" w:color="CCCCCC"/>
+            </w:tcBorders>
+          </w:tcPr>
+          <w:p>
+            <w:r>
+              <w:rPr>
+                <w:sz w:val="20"/>
+              </w:rPr>
+              <w:t>jingyi-rere</w:t>
+            </w:r>
+          </w:p>
+        </w:tc>
+        <w:tc>
+          <w:tcPr>
+            <w:tcW w:type="dxa" w:w="2340"/>
+            <w:tcW w:w="5472" w:type="dxa"/>
+            <w:shd w:val="clear" w:color="auto" w:fill="FFFFFF"/>
+            <w:tcBorders>
+              <w:top w:val="single" w:sz="4" w:space="0" w:color="CCCCCC"/>
+              <w:left w:val="single" w:sz="4" w:space="0" w:color="CCCCCC"/>
+              <w:bottom w:val="single" w:sz="4" w:space="0" w:color="CCCCCC"/>
+              <w:right w:val="single" w:sz="4" w:space="0" w:color="CCCCCC"/>
+            </w:tcBorders>
+          </w:tcPr>
+          <w:p>
+            <w:r>
+              <w:rPr>
+                <w:sz w:val="20"/>
+              </w:rPr>
+              <w:t>Feedback fixes: removed defensive baseline note — stated upfront as 4 min/video × 10 videos. Phase 2 platforms moved to Appendix A (Future Scope) to keep main doc focused on current build.</w:t>
             </w:r>
           </w:p>
         </w:tc>
@@ -2016,7 +2102,7 @@
           <w:color w:val="595959"/>
           <w:sz w:val="22"/>
         </w:rPr>
-        <w:t>Note on baseline measurement: An earlier estimate cited "10 minutes per day" of data collection work. That figure included time spent switching between apps, re-checking previous entries, and searching for older posts — overhead that is hard to time precisely. The 40 minutes/week figure above is based on timed measurement of individual tasks per video (4 minutes × 10 videos), which is the repeatable, verifiable baseline used for all calculations in this document.</w:t>
+        <w:t>Baseline: 4 minutes per video × 10 videos = 40 minutes per week. Each task above was timed individually — this is the repeatable, verifiable figure used for all calculations in this document.</w:t>
       </w:r>
     </w:p>
     <w:p>
@@ -6191,7 +6277,7 @@
         <w:pStyle w:val="Heading1"/>
       </w:pPr>
       <w:r>
-        <w:t>10. Supported Platforms</w:t>
+        <w:t>10. Supported Platforms (Current Scope)</w:t>
       </w:r>
     </w:p>
     <w:p>
@@ -6203,7 +6289,7 @@
           <w:color w:val="595959"/>
           <w:sz w:val="22"/>
         </w:rPr>
-        <w:t>Phase 1 (active, fully built and tested): 4 platforms. Phase 2 (future, planned but not yet built): 3 additional platforms. This is an intentional phased approach — not scope creep. The 4 Phase 1 platforms cover 100% of current posting activity. Phase 2 platforms will be added only if the user expands to those platforms.</w:t>
+        <w:t>The following 4 platforms are fully built, tested, and active. They cover 100% of current posting activity.</w:t>
       </w:r>
     </w:p>
     <w:p/>
@@ -6214,18 +6300,17 @@
         <w:tblLook w:firstColumn="1" w:firstRow="1" w:lastColumn="0" w:lastRow="0" w:noHBand="0" w:noVBand="1" w:val="04A0"/>
       </w:tblPr>
       <w:tblGrid>
-        <w:gridCol w:w="1560"/>
-        <w:gridCol w:w="1560"/>
-        <w:gridCol w:w="1560"/>
-        <w:gridCol w:w="1560"/>
-        <w:gridCol w:w="1560"/>
-        <w:gridCol w:w="1560"/>
+        <w:gridCol w:w="1872"/>
+        <w:gridCol w:w="1872"/>
+        <w:gridCol w:w="1872"/>
+        <w:gridCol w:w="1872"/>
+        <w:gridCol w:w="1872"/>
       </w:tblGrid>
       <w:tr>
         <w:tc>
           <w:tcPr>
-            <w:tcW w:type="dxa" w:w="1560"/>
-            <w:tcW w:w="1152" w:type="dxa"/>
+            <w:tcW w:type="dxa" w:w="1872"/>
+            <w:tcW w:w="1728" w:type="dxa"/>
             <w:shd w:val="clear" w:color="auto" w:fill="1F497D"/>
             <w:tcBorders>
               <w:top w:val="single" w:sz="4" w:space="0" w:color="1F497D"/>
@@ -6241,14 +6326,14 @@
                 <w:color w:val="FFFFFF"/>
                 <w:sz w:val="20"/>
               </w:rPr>
-              <w:t>Phase</w:t>
-            </w:r>
-          </w:p>
-        </w:tc>
-        <w:tc>
-          <w:tcPr>
-            <w:tcW w:type="dxa" w:w="1560"/>
-            <w:tcW w:w="1728" w:type="dxa"/>
+              <w:t>Platform</w:t>
+            </w:r>
+          </w:p>
+        </w:tc>
+        <w:tc>
+          <w:tcPr>
+            <w:tcW w:type="dxa" w:w="1872"/>
+            <w:tcW w:w="1440" w:type="dxa"/>
             <w:shd w:val="clear" w:color="auto" w:fill="1F497D"/>
             <w:tcBorders>
               <w:top w:val="single" w:sz="4" w:space="0" w:color="1F497D"/>
@@ -6264,14 +6349,14 @@
                 <w:color w:val="FFFFFF"/>
                 <w:sz w:val="20"/>
               </w:rPr>
-              <w:t>Platform</w:t>
-            </w:r>
-          </w:p>
-        </w:tc>
-        <w:tc>
-          <w:tcPr>
-            <w:tcW w:type="dxa" w:w="1560"/>
-            <w:tcW w:w="1440" w:type="dxa"/>
+              <w:t>Video Format</w:t>
+            </w:r>
+          </w:p>
+        </w:tc>
+        <w:tc>
+          <w:tcPr>
+            <w:tcW w:type="dxa" w:w="1872"/>
+            <w:tcW w:w="1728" w:type="dxa"/>
             <w:shd w:val="clear" w:color="auto" w:fill="1F497D"/>
             <w:tcBorders>
               <w:top w:val="single" w:sz="4" w:space="0" w:color="1F497D"/>
@@ -6287,14 +6372,14 @@
                 <w:color w:val="FFFFFF"/>
                 <w:sz w:val="20"/>
               </w:rPr>
-              <w:t>Video Format</w:t>
-            </w:r>
-          </w:p>
-        </w:tc>
-        <w:tc>
-          <w:tcPr>
-            <w:tcW w:type="dxa" w:w="1560"/>
-            <w:tcW w:w="1728" w:type="dxa"/>
+              <w:t>Column G (Views)</w:t>
+            </w:r>
+          </w:p>
+        </w:tc>
+        <w:tc>
+          <w:tcPr>
+            <w:tcW w:type="dxa" w:w="1872"/>
+            <w:tcW w:w="2592" w:type="dxa"/>
             <w:shd w:val="clear" w:color="auto" w:fill="1F497D"/>
             <w:tcBorders>
               <w:top w:val="single" w:sz="4" w:space="0" w:color="1F497D"/>
@@ -6310,14 +6395,14 @@
                 <w:color w:val="FFFFFF"/>
                 <w:sz w:val="20"/>
               </w:rPr>
-              <w:t>Column G (Views)</w:t>
-            </w:r>
-          </w:p>
-        </w:tc>
-        <w:tc>
-          <w:tcPr>
-            <w:tcW w:type="dxa" w:w="1560"/>
-            <w:tcW w:w="2592" w:type="dxa"/>
+              <w:t>Column D (Caption)</w:t>
+            </w:r>
+          </w:p>
+        </w:tc>
+        <w:tc>
+          <w:tcPr>
+            <w:tcW w:type="dxa" w:w="1872"/>
+            <w:tcW w:w="2160" w:type="dxa"/>
             <w:shd w:val="clear" w:color="auto" w:fill="1F497D"/>
             <w:tcBorders>
               <w:top w:val="single" w:sz="4" w:space="0" w:color="1F497D"/>
@@ -6333,14 +6418,480 @@
                 <w:color w:val="FFFFFF"/>
                 <w:sz w:val="20"/>
               </w:rPr>
-              <w:t>Column D (Caption)</w:t>
-            </w:r>
-          </w:p>
-        </w:tc>
-        <w:tc>
-          <w:tcPr>
-            <w:tcW w:type="dxa" w:w="1560"/>
+              <w:t>Data Source</w:t>
+            </w:r>
+          </w:p>
+        </w:tc>
+      </w:tr>
+      <w:tr>
+        <w:tc>
+          <w:tcPr>
+            <w:tcW w:type="dxa" w:w="1872"/>
+            <w:tcW w:w="1728" w:type="dxa"/>
+            <w:shd w:val="clear" w:color="auto" w:fill="FFFFFF"/>
+            <w:tcBorders>
+              <w:top w:val="single" w:sz="4" w:space="0" w:color="CCCCCC"/>
+              <w:left w:val="single" w:sz="4" w:space="0" w:color="CCCCCC"/>
+              <w:bottom w:val="single" w:sz="4" w:space="0" w:color="CCCCCC"/>
+              <w:right w:val="single" w:sz="4" w:space="0" w:color="CCCCCC"/>
+            </w:tcBorders>
+          </w:tcPr>
+          <w:p>
+            <w:r>
+              <w:rPr>
+                <w:sz w:val="20"/>
+              </w:rPr>
+              <w:t>YouTube</w:t>
+            </w:r>
+          </w:p>
+        </w:tc>
+        <w:tc>
+          <w:tcPr>
+            <w:tcW w:type="dxa" w:w="1872"/>
+            <w:tcW w:w="1440" w:type="dxa"/>
+            <w:shd w:val="clear" w:color="auto" w:fill="FFFFFF"/>
+            <w:tcBorders>
+              <w:top w:val="single" w:sz="4" w:space="0" w:color="CCCCCC"/>
+              <w:left w:val="single" w:sz="4" w:space="0" w:color="CCCCCC"/>
+              <w:bottom w:val="single" w:sz="4" w:space="0" w:color="CCCCCC"/>
+              <w:right w:val="single" w:sz="4" w:space="0" w:color="CCCCCC"/>
+            </w:tcBorders>
+          </w:tcPr>
+          <w:p>
+            <w:r>
+              <w:rPr>
+                <w:sz w:val="20"/>
+              </w:rPr>
+              <w:t>Video / Shorts</w:t>
+            </w:r>
+          </w:p>
+        </w:tc>
+        <w:tc>
+          <w:tcPr>
+            <w:tcW w:type="dxa" w:w="1872"/>
+            <w:tcW w:w="1728" w:type="dxa"/>
+            <w:shd w:val="clear" w:color="auto" w:fill="FFFFFF"/>
+            <w:tcBorders>
+              <w:top w:val="single" w:sz="4" w:space="0" w:color="CCCCCC"/>
+              <w:left w:val="single" w:sz="4" w:space="0" w:color="CCCCCC"/>
+              <w:bottom w:val="single" w:sz="4" w:space="0" w:color="CCCCCC"/>
+              <w:right w:val="single" w:sz="4" w:space="0" w:color="CCCCCC"/>
+            </w:tcBorders>
+          </w:tcPr>
+          <w:p>
+            <w:r>
+              <w:rPr>
+                <w:sz w:val="20"/>
+              </w:rPr>
+              <w:t>Total video views</w:t>
+            </w:r>
+          </w:p>
+        </w:tc>
+        <w:tc>
+          <w:tcPr>
+            <w:tcW w:type="dxa" w:w="1872"/>
+            <w:tcW w:w="2592" w:type="dxa"/>
+            <w:shd w:val="clear" w:color="auto" w:fill="FFFFFF"/>
+            <w:tcBorders>
+              <w:top w:val="single" w:sz="4" w:space="0" w:color="CCCCCC"/>
+              <w:left w:val="single" w:sz="4" w:space="0" w:color="CCCCCC"/>
+              <w:bottom w:val="single" w:sz="4" w:space="0" w:color="CCCCCC"/>
+              <w:right w:val="single" w:sz="4" w:space="0" w:color="CCCCCC"/>
+            </w:tcBorders>
+          </w:tcPr>
+          <w:p>
+            <w:r>
+              <w:rPr>
+                <w:sz w:val="20"/>
+              </w:rPr>
+              <w:t>Video title</w:t>
+            </w:r>
+          </w:p>
+        </w:tc>
+        <w:tc>
+          <w:tcPr>
+            <w:tcW w:type="dxa" w:w="1872"/>
             <w:tcW w:w="2160" w:type="dxa"/>
+            <w:shd w:val="clear" w:color="auto" w:fill="FFFFFF"/>
+            <w:tcBorders>
+              <w:top w:val="single" w:sz="4" w:space="0" w:color="CCCCCC"/>
+              <w:left w:val="single" w:sz="4" w:space="0" w:color="CCCCCC"/>
+              <w:bottom w:val="single" w:sz="4" w:space="0" w:color="CCCCCC"/>
+              <w:right w:val="single" w:sz="4" w:space="0" w:color="CCCCCC"/>
+            </w:tcBorders>
+          </w:tcPr>
+          <w:p>
+            <w:r>
+              <w:rPr>
+                <w:sz w:val="20"/>
+              </w:rPr>
+              <w:t>yt-dlp (no browser needed — fast &amp; exact)</w:t>
+            </w:r>
+          </w:p>
+        </w:tc>
+      </w:tr>
+      <w:tr>
+        <w:tc>
+          <w:tcPr>
+            <w:tcW w:type="dxa" w:w="1872"/>
+            <w:tcW w:w="1728" w:type="dxa"/>
+            <w:shd w:val="clear" w:color="auto" w:fill="F0F4FF"/>
+            <w:tcBorders>
+              <w:top w:val="single" w:sz="4" w:space="0" w:color="CCCCCC"/>
+              <w:left w:val="single" w:sz="4" w:space="0" w:color="CCCCCC"/>
+              <w:bottom w:val="single" w:sz="4" w:space="0" w:color="CCCCCC"/>
+              <w:right w:val="single" w:sz="4" w:space="0" w:color="CCCCCC"/>
+            </w:tcBorders>
+          </w:tcPr>
+          <w:p>
+            <w:r>
+              <w:rPr>
+                <w:sz w:val="20"/>
+              </w:rPr>
+              <w:t>TikTok</w:t>
+            </w:r>
+          </w:p>
+        </w:tc>
+        <w:tc>
+          <w:tcPr>
+            <w:tcW w:type="dxa" w:w="1872"/>
+            <w:tcW w:w="1440" w:type="dxa"/>
+            <w:shd w:val="clear" w:color="auto" w:fill="F0F4FF"/>
+            <w:tcBorders>
+              <w:top w:val="single" w:sz="4" w:space="0" w:color="CCCCCC"/>
+              <w:left w:val="single" w:sz="4" w:space="0" w:color="CCCCCC"/>
+              <w:bottom w:val="single" w:sz="4" w:space="0" w:color="CCCCCC"/>
+              <w:right w:val="single" w:sz="4" w:space="0" w:color="CCCCCC"/>
+            </w:tcBorders>
+          </w:tcPr>
+          <w:p>
+            <w:r>
+              <w:rPr>
+                <w:sz w:val="20"/>
+              </w:rPr>
+              <w:t>Video</w:t>
+            </w:r>
+          </w:p>
+        </w:tc>
+        <w:tc>
+          <w:tcPr>
+            <w:tcW w:type="dxa" w:w="1872"/>
+            <w:tcW w:w="1728" w:type="dxa"/>
+            <w:shd w:val="clear" w:color="auto" w:fill="F0F4FF"/>
+            <w:tcBorders>
+              <w:top w:val="single" w:sz="4" w:space="0" w:color="CCCCCC"/>
+              <w:left w:val="single" w:sz="4" w:space="0" w:color="CCCCCC"/>
+              <w:bottom w:val="single" w:sz="4" w:space="0" w:color="CCCCCC"/>
+              <w:right w:val="single" w:sz="4" w:space="0" w:color="CCCCCC"/>
+            </w:tcBorders>
+          </w:tcPr>
+          <w:p>
+            <w:r>
+              <w:rPr>
+                <w:sz w:val="20"/>
+              </w:rPr>
+              <w:t>Total video views</w:t>
+            </w:r>
+          </w:p>
+        </w:tc>
+        <w:tc>
+          <w:tcPr>
+            <w:tcW w:type="dxa" w:w="1872"/>
+            <w:tcW w:w="2592" w:type="dxa"/>
+            <w:shd w:val="clear" w:color="auto" w:fill="F0F4FF"/>
+            <w:tcBorders>
+              <w:top w:val="single" w:sz="4" w:space="0" w:color="CCCCCC"/>
+              <w:left w:val="single" w:sz="4" w:space="0" w:color="CCCCCC"/>
+              <w:bottom w:val="single" w:sz="4" w:space="0" w:color="CCCCCC"/>
+              <w:right w:val="single" w:sz="4" w:space="0" w:color="CCCCCC"/>
+            </w:tcBorders>
+          </w:tcPr>
+          <w:p>
+            <w:r>
+              <w:rPr>
+                <w:sz w:val="20"/>
+              </w:rPr>
+              <w:t>Video description — hashtags removed</w:t>
+            </w:r>
+          </w:p>
+        </w:tc>
+        <w:tc>
+          <w:tcPr>
+            <w:tcW w:type="dxa" w:w="1872"/>
+            <w:tcW w:w="2160" w:type="dxa"/>
+            <w:shd w:val="clear" w:color="auto" w:fill="F0F4FF"/>
+            <w:tcBorders>
+              <w:top w:val="single" w:sz="4" w:space="0" w:color="CCCCCC"/>
+              <w:left w:val="single" w:sz="4" w:space="0" w:color="CCCCCC"/>
+              <w:bottom w:val="single" w:sz="4" w:space="0" w:color="CCCCCC"/>
+              <w:right w:val="single" w:sz="4" w:space="0" w:color="CCCCCC"/>
+            </w:tcBorders>
+          </w:tcPr>
+          <w:p>
+            <w:r>
+              <w:rPr>
+                <w:sz w:val="20"/>
+              </w:rPr>
+              <w:t>yt-dlp (no browser needed — fast &amp; exact)</w:t>
+            </w:r>
+          </w:p>
+        </w:tc>
+      </w:tr>
+      <w:tr>
+        <w:tc>
+          <w:tcPr>
+            <w:tcW w:type="dxa" w:w="1872"/>
+            <w:tcW w:w="1728" w:type="dxa"/>
+            <w:shd w:val="clear" w:color="auto" w:fill="FFFFFF"/>
+            <w:tcBorders>
+              <w:top w:val="single" w:sz="4" w:space="0" w:color="CCCCCC"/>
+              <w:left w:val="single" w:sz="4" w:space="0" w:color="CCCCCC"/>
+              <w:bottom w:val="single" w:sz="4" w:space="0" w:color="CCCCCC"/>
+              <w:right w:val="single" w:sz="4" w:space="0" w:color="CCCCCC"/>
+            </w:tcBorders>
+          </w:tcPr>
+          <w:p>
+            <w:r>
+              <w:rPr>
+                <w:sz w:val="20"/>
+              </w:rPr>
+              <w:t>Instagram</w:t>
+            </w:r>
+          </w:p>
+        </w:tc>
+        <w:tc>
+          <w:tcPr>
+            <w:tcW w:type="dxa" w:w="1872"/>
+            <w:tcW w:w="1440" w:type="dxa"/>
+            <w:shd w:val="clear" w:color="auto" w:fill="FFFFFF"/>
+            <w:tcBorders>
+              <w:top w:val="single" w:sz="4" w:space="0" w:color="CCCCCC"/>
+              <w:left w:val="single" w:sz="4" w:space="0" w:color="CCCCCC"/>
+              <w:bottom w:val="single" w:sz="4" w:space="0" w:color="CCCCCC"/>
+              <w:right w:val="single" w:sz="4" w:space="0" w:color="CCCCCC"/>
+            </w:tcBorders>
+          </w:tcPr>
+          <w:p>
+            <w:r>
+              <w:rPr>
+                <w:sz w:val="20"/>
+              </w:rPr>
+              <w:t>Reels</w:t>
+            </w:r>
+          </w:p>
+        </w:tc>
+        <w:tc>
+          <w:tcPr>
+            <w:tcW w:type="dxa" w:w="1872"/>
+            <w:tcW w:w="1728" w:type="dxa"/>
+            <w:shd w:val="clear" w:color="auto" w:fill="FFFFFF"/>
+            <w:tcBorders>
+              <w:top w:val="single" w:sz="4" w:space="0" w:color="CCCCCC"/>
+              <w:left w:val="single" w:sz="4" w:space="0" w:color="CCCCCC"/>
+              <w:bottom w:val="single" w:sz="4" w:space="0" w:color="CCCCCC"/>
+              <w:right w:val="single" w:sz="4" w:space="0" w:color="CCCCCC"/>
+            </w:tcBorders>
+          </w:tcPr>
+          <w:p>
+            <w:r>
+              <w:rPr>
+                <w:sz w:val="20"/>
+              </w:rPr>
+              <w:t>Reels view count</w:t>
+            </w:r>
+          </w:p>
+        </w:tc>
+        <w:tc>
+          <w:tcPr>
+            <w:tcW w:type="dxa" w:w="1872"/>
+            <w:tcW w:w="2592" w:type="dxa"/>
+            <w:shd w:val="clear" w:color="auto" w:fill="FFFFFF"/>
+            <w:tcBorders>
+              <w:top w:val="single" w:sz="4" w:space="0" w:color="CCCCCC"/>
+              <w:left w:val="single" w:sz="4" w:space="0" w:color="CCCCCC"/>
+              <w:bottom w:val="single" w:sz="4" w:space="0" w:color="CCCCCC"/>
+              <w:right w:val="single" w:sz="4" w:space="0" w:color="CCCCCC"/>
+            </w:tcBorders>
+          </w:tcPr>
+          <w:p>
+            <w:r>
+              <w:rPr>
+                <w:sz w:val="20"/>
+              </w:rPr>
+              <w:t>Post caption — hashtags removed</w:t>
+            </w:r>
+          </w:p>
+        </w:tc>
+        <w:tc>
+          <w:tcPr>
+            <w:tcW w:type="dxa" w:w="1872"/>
+            <w:tcW w:w="2160" w:type="dxa"/>
+            <w:shd w:val="clear" w:color="auto" w:fill="FFFFFF"/>
+            <w:tcBorders>
+              <w:top w:val="single" w:sz="4" w:space="0" w:color="CCCCCC"/>
+              <w:left w:val="single" w:sz="4" w:space="0" w:color="CCCCCC"/>
+              <w:bottom w:val="single" w:sz="4" w:space="0" w:color="CCCCCC"/>
+              <w:right w:val="single" w:sz="4" w:space="0" w:color="CCCCCC"/>
+            </w:tcBorders>
+          </w:tcPr>
+          <w:p>
+            <w:r>
+              <w:rPr>
+                <w:sz w:val="20"/>
+              </w:rPr>
+              <w:t>Firefox + Claude Vision (2-screenshot approach)</w:t>
+            </w:r>
+          </w:p>
+        </w:tc>
+      </w:tr>
+      <w:tr>
+        <w:tc>
+          <w:tcPr>
+            <w:tcW w:type="dxa" w:w="1872"/>
+            <w:tcW w:w="1728" w:type="dxa"/>
+            <w:shd w:val="clear" w:color="auto" w:fill="F0F4FF"/>
+            <w:tcBorders>
+              <w:top w:val="single" w:sz="4" w:space="0" w:color="CCCCCC"/>
+              <w:left w:val="single" w:sz="4" w:space="0" w:color="CCCCCC"/>
+              <w:bottom w:val="single" w:sz="4" w:space="0" w:color="CCCCCC"/>
+              <w:right w:val="single" w:sz="4" w:space="0" w:color="CCCCCC"/>
+            </w:tcBorders>
+          </w:tcPr>
+          <w:p>
+            <w:r>
+              <w:rPr>
+                <w:sz w:val="20"/>
+              </w:rPr>
+              <w:t>RedNote (小红书)</w:t>
+            </w:r>
+          </w:p>
+        </w:tc>
+        <w:tc>
+          <w:tcPr>
+            <w:tcW w:type="dxa" w:w="1872"/>
+            <w:tcW w:w="1440" w:type="dxa"/>
+            <w:shd w:val="clear" w:color="auto" w:fill="F0F4FF"/>
+            <w:tcBorders>
+              <w:top w:val="single" w:sz="4" w:space="0" w:color="CCCCCC"/>
+              <w:left w:val="single" w:sz="4" w:space="0" w:color="CCCCCC"/>
+              <w:bottom w:val="single" w:sz="4" w:space="0" w:color="CCCCCC"/>
+              <w:right w:val="single" w:sz="4" w:space="0" w:color="CCCCCC"/>
+            </w:tcBorders>
+          </w:tcPr>
+          <w:p>
+            <w:r>
+              <w:rPr>
+                <w:sz w:val="20"/>
+              </w:rPr>
+              <w:t>Video</w:t>
+            </w:r>
+          </w:p>
+        </w:tc>
+        <w:tc>
+          <w:tcPr>
+            <w:tcW w:type="dxa" w:w="1872"/>
+            <w:tcW w:w="1728" w:type="dxa"/>
+            <w:shd w:val="clear" w:color="auto" w:fill="F0F4FF"/>
+            <w:tcBorders>
+              <w:top w:val="single" w:sz="4" w:space="0" w:color="CCCCCC"/>
+              <w:left w:val="single" w:sz="4" w:space="0" w:color="CCCCCC"/>
+              <w:bottom w:val="single" w:sz="4" w:space="0" w:color="CCCCCC"/>
+              <w:right w:val="single" w:sz="4" w:space="0" w:color="CCCCCC"/>
+            </w:tcBorders>
+          </w:tcPr>
+          <w:p>
+            <w:r>
+              <w:rPr>
+                <w:sz w:val="20"/>
+              </w:rPr>
+              <w:t>Video views</w:t>
+            </w:r>
+          </w:p>
+        </w:tc>
+        <w:tc>
+          <w:tcPr>
+            <w:tcW w:type="dxa" w:w="1872"/>
+            <w:tcW w:w="2592" w:type="dxa"/>
+            <w:shd w:val="clear" w:color="auto" w:fill="F0F4FF"/>
+            <w:tcBorders>
+              <w:top w:val="single" w:sz="4" w:space="0" w:color="CCCCCC"/>
+              <w:left w:val="single" w:sz="4" w:space="0" w:color="CCCCCC"/>
+              <w:bottom w:val="single" w:sz="4" w:space="0" w:color="CCCCCC"/>
+              <w:right w:val="single" w:sz="4" w:space="0" w:color="CCCCCC"/>
+            </w:tcBorders>
+          </w:tcPr>
+          <w:p>
+            <w:r>
+              <w:rPr>
+                <w:sz w:val="20"/>
+              </w:rPr>
+              <w:t>Post caption — hashtags removed</w:t>
+            </w:r>
+          </w:p>
+        </w:tc>
+        <w:tc>
+          <w:tcPr>
+            <w:tcW w:type="dxa" w:w="1872"/>
+            <w:tcW w:w="2160" w:type="dxa"/>
+            <w:shd w:val="clear" w:color="auto" w:fill="F0F4FF"/>
+            <w:tcBorders>
+              <w:top w:val="single" w:sz="4" w:space="0" w:color="CCCCCC"/>
+              <w:left w:val="single" w:sz="4" w:space="0" w:color="CCCCCC"/>
+              <w:bottom w:val="single" w:sz="4" w:space="0" w:color="CCCCCC"/>
+              <w:right w:val="single" w:sz="4" w:space="0" w:color="CCCCCC"/>
+            </w:tcBorders>
+          </w:tcPr>
+          <w:p>
+            <w:r>
+              <w:rPr>
+                <w:sz w:val="20"/>
+              </w:rPr>
+              <w:t>Firefox + Claude Vision</w:t>
+            </w:r>
+          </w:p>
+        </w:tc>
+      </w:tr>
+    </w:tbl>
+    <w:p/>
+    <w:p/>
+    <w:p>
+      <w:pPr>
+        <w:pStyle w:val="Heading1"/>
+      </w:pPr>
+      <w:r>
+        <w:t>Appendix A: Future Scope (Not Built)</w:t>
+      </w:r>
+    </w:p>
+    <w:p>
+      <w:pPr/>
+      <w:r>
+        <w:rPr>
+          <w:b w:val="0"/>
+          <w:i/>
+          <w:color w:val="595959"/>
+          <w:sz w:val="22"/>
+        </w:rPr>
+        <w:t>The following platforms are out of scope for the current build. They will only be considered if the user expands posting activity to these platforms.</w:t>
+      </w:r>
+    </w:p>
+    <w:p/>
+    <w:tbl>
+      <w:tblPr>
+        <w:tblW w:type="auto" w:w="0"/>
+        <w:jc w:val="left"/>
+        <w:tblLook w:firstColumn="1" w:firstRow="1" w:lastColumn="0" w:lastRow="0" w:noHBand="0" w:noVBand="1" w:val="04A0"/>
+      </w:tblPr>
+      <w:tblGrid>
+        <w:gridCol w:w="2340"/>
+        <w:gridCol w:w="2340"/>
+        <w:gridCol w:w="2340"/>
+        <w:gridCol w:w="2340"/>
+      </w:tblGrid>
+      <w:tr>
+        <w:tc>
+          <w:tcPr>
+            <w:tcW w:type="dxa" w:w="2340"/>
+            <w:tcW w:w="1728" w:type="dxa"/>
             <w:shd w:val="clear" w:color="auto" w:fill="1F497D"/>
             <w:tcBorders>
               <w:top w:val="single" w:sz="4" w:space="0" w:color="1F497D"/>
@@ -6356,7 +6907,76 @@
                 <w:color w:val="FFFFFF"/>
                 <w:sz w:val="20"/>
               </w:rPr>
-              <w:t>Data Source</w:t>
+              <w:t>Platform</w:t>
+            </w:r>
+          </w:p>
+        </w:tc>
+        <w:tc>
+          <w:tcPr>
+            <w:tcW w:type="dxa" w:w="2340"/>
+            <w:tcW w:w="1440" w:type="dxa"/>
+            <w:shd w:val="clear" w:color="auto" w:fill="1F497D"/>
+            <w:tcBorders>
+              <w:top w:val="single" w:sz="4" w:space="0" w:color="1F497D"/>
+              <w:left w:val="single" w:sz="4" w:space="0" w:color="1F497D"/>
+              <w:bottom w:val="single" w:sz="4" w:space="0" w:color="1F497D"/>
+              <w:right w:val="single" w:sz="4" w:space="0" w:color="1F497D"/>
+            </w:tcBorders>
+          </w:tcPr>
+          <w:p>
+            <w:r>
+              <w:rPr>
+                <w:b/>
+                <w:color w:val="FFFFFF"/>
+                <w:sz w:val="20"/>
+              </w:rPr>
+              <w:t>Video Format</w:t>
+            </w:r>
+          </w:p>
+        </w:tc>
+        <w:tc>
+          <w:tcPr>
+            <w:tcW w:type="dxa" w:w="2340"/>
+            <w:tcW w:w="2592" w:type="dxa"/>
+            <w:shd w:val="clear" w:color="auto" w:fill="1F497D"/>
+            <w:tcBorders>
+              <w:top w:val="single" w:sz="4" w:space="0" w:color="1F497D"/>
+              <w:left w:val="single" w:sz="4" w:space="0" w:color="1F497D"/>
+              <w:bottom w:val="single" w:sz="4" w:space="0" w:color="1F497D"/>
+              <w:right w:val="single" w:sz="4" w:space="0" w:color="1F497D"/>
+            </w:tcBorders>
+          </w:tcPr>
+          <w:p>
+            <w:r>
+              <w:rPr>
+                <w:b/>
+                <w:color w:val="FFFFFF"/>
+                <w:sz w:val="20"/>
+              </w:rPr>
+              <w:t>Planned Data Source</w:t>
+            </w:r>
+          </w:p>
+        </w:tc>
+        <w:tc>
+          <w:tcPr>
+            <w:tcW w:type="dxa" w:w="2340"/>
+            <w:tcW w:w="3600" w:type="dxa"/>
+            <w:shd w:val="clear" w:color="auto" w:fill="1F497D"/>
+            <w:tcBorders>
+              <w:top w:val="single" w:sz="4" w:space="0" w:color="1F497D"/>
+              <w:left w:val="single" w:sz="4" w:space="0" w:color="1F497D"/>
+              <w:bottom w:val="single" w:sz="4" w:space="0" w:color="1F497D"/>
+              <w:right w:val="single" w:sz="4" w:space="0" w:color="1F497D"/>
+            </w:tcBorders>
+          </w:tcPr>
+          <w:p>
+            <w:r>
+              <w:rPr>
+                <w:b/>
+                <w:color w:val="FFFFFF"/>
+                <w:sz w:val="20"/>
+              </w:rPr>
+              <w:t>Blocker</w:t>
             </w:r>
           </w:p>
         </w:tc>
@@ -6364,30 +6984,7 @@
       <w:tr>
         <w:tc>
           <w:tcPr>
-            <w:tcW w:type="dxa" w:w="1560"/>
-            <w:tcW w:w="1152" w:type="dxa"/>
-            <w:shd w:val="clear" w:color="auto" w:fill="FFFFFF"/>
-            <w:tcBorders>
-              <w:top w:val="single" w:sz="4" w:space="0" w:color="CCCCCC"/>
-              <w:left w:val="single" w:sz="4" w:space="0" w:color="CCCCCC"/>
-              <w:bottom w:val="single" w:sz="4" w:space="0" w:color="CCCCCC"/>
-              <w:right w:val="single" w:sz="4" w:space="0" w:color="CCCCCC"/>
-            </w:tcBorders>
-          </w:tcPr>
-          <w:p>
-            <w:r>
-              <w:rPr>
-                <w:b/>
-                <w:color w:val="007000"/>
-                <w:sz w:val="20"/>
-              </w:rPr>
-              <w:t>Phase 1</w:t>
-            </w:r>
-          </w:p>
-        </w:tc>
-        <w:tc>
-          <w:tcPr>
-            <w:tcW w:type="dxa" w:w="1560"/>
+            <w:tcW w:type="dxa" w:w="2340"/>
             <w:tcW w:w="1728" w:type="dxa"/>
             <w:shd w:val="clear" w:color="auto" w:fill="FFFFFF"/>
             <w:tcBorders>
@@ -6402,13 +6999,13 @@
               <w:rPr>
                 <w:sz w:val="20"/>
               </w:rPr>
-              <w:t>YouTube</w:t>
-            </w:r>
-          </w:p>
-        </w:tc>
-        <w:tc>
-          <w:tcPr>
-            <w:tcW w:type="dxa" w:w="1560"/>
+              <w:t>Facebook</w:t>
+            </w:r>
+          </w:p>
+        </w:tc>
+        <w:tc>
+          <w:tcPr>
+            <w:tcW w:type="dxa" w:w="2340"/>
             <w:tcW w:w="1440" w:type="dxa"/>
             <w:shd w:val="clear" w:color="auto" w:fill="FFFFFF"/>
             <w:tcBorders>
@@ -6423,13 +7020,143 @@
               <w:rPr>
                 <w:sz w:val="20"/>
               </w:rPr>
-              <w:t>Video / Shorts</w:t>
-            </w:r>
-          </w:p>
-        </w:tc>
-        <w:tc>
-          <w:tcPr>
-            <w:tcW w:type="dxa" w:w="1560"/>
+              <w:t>Video / Reels</w:t>
+            </w:r>
+          </w:p>
+        </w:tc>
+        <w:tc>
+          <w:tcPr>
+            <w:tcW w:type="dxa" w:w="2340"/>
+            <w:tcW w:w="2592" w:type="dxa"/>
+            <w:shd w:val="clear" w:color="auto" w:fill="FFFFFF"/>
+            <w:tcBorders>
+              <w:top w:val="single" w:sz="4" w:space="0" w:color="CCCCCC"/>
+              <w:left w:val="single" w:sz="4" w:space="0" w:color="CCCCCC"/>
+              <w:bottom w:val="single" w:sz="4" w:space="0" w:color="CCCCCC"/>
+              <w:right w:val="single" w:sz="4" w:space="0" w:color="CCCCCC"/>
+            </w:tcBorders>
+          </w:tcPr>
+          <w:p>
+            <w:r>
+              <w:rPr>
+                <w:sz w:val="20"/>
+              </w:rPr>
+              <w:t>Firefox + Claude Vision</w:t>
+            </w:r>
+          </w:p>
+        </w:tc>
+        <w:tc>
+          <w:tcPr>
+            <w:tcW w:type="dxa" w:w="2340"/>
+            <w:tcW w:w="3600" w:type="dxa"/>
+            <w:shd w:val="clear" w:color="auto" w:fill="FFFFFF"/>
+            <w:tcBorders>
+              <w:top w:val="single" w:sz="4" w:space="0" w:color="CCCCCC"/>
+              <w:left w:val="single" w:sz="4" w:space="0" w:color="CCCCCC"/>
+              <w:bottom w:val="single" w:sz="4" w:space="0" w:color="CCCCCC"/>
+              <w:right w:val="single" w:sz="4" w:space="0" w:color="CCCCCC"/>
+            </w:tcBorders>
+          </w:tcPr>
+          <w:p>
+            <w:r>
+              <w:rPr>
+                <w:sz w:val="20"/>
+              </w:rPr>
+              <w:t>Requires Facebook Business account for API; UI scraping feasible but untested</w:t>
+            </w:r>
+          </w:p>
+        </w:tc>
+      </w:tr>
+      <w:tr>
+        <w:tc>
+          <w:tcPr>
+            <w:tcW w:type="dxa" w:w="2340"/>
+            <w:tcW w:w="1728" w:type="dxa"/>
+            <w:shd w:val="clear" w:color="auto" w:fill="F0F4FF"/>
+            <w:tcBorders>
+              <w:top w:val="single" w:sz="4" w:space="0" w:color="CCCCCC"/>
+              <w:left w:val="single" w:sz="4" w:space="0" w:color="CCCCCC"/>
+              <w:bottom w:val="single" w:sz="4" w:space="0" w:color="CCCCCC"/>
+              <w:right w:val="single" w:sz="4" w:space="0" w:color="CCCCCC"/>
+            </w:tcBorders>
+          </w:tcPr>
+          <w:p>
+            <w:r>
+              <w:rPr>
+                <w:sz w:val="20"/>
+              </w:rPr>
+              <w:t>X (Twitter)</w:t>
+            </w:r>
+          </w:p>
+        </w:tc>
+        <w:tc>
+          <w:tcPr>
+            <w:tcW w:type="dxa" w:w="2340"/>
+            <w:tcW w:w="1440" w:type="dxa"/>
+            <w:shd w:val="clear" w:color="auto" w:fill="F0F4FF"/>
+            <w:tcBorders>
+              <w:top w:val="single" w:sz="4" w:space="0" w:color="CCCCCC"/>
+              <w:left w:val="single" w:sz="4" w:space="0" w:color="CCCCCC"/>
+              <w:bottom w:val="single" w:sz="4" w:space="0" w:color="CCCCCC"/>
+              <w:right w:val="single" w:sz="4" w:space="0" w:color="CCCCCC"/>
+            </w:tcBorders>
+          </w:tcPr>
+          <w:p>
+            <w:r>
+              <w:rPr>
+                <w:sz w:val="20"/>
+              </w:rPr>
+              <w:t>Video post</w:t>
+            </w:r>
+          </w:p>
+        </w:tc>
+        <w:tc>
+          <w:tcPr>
+            <w:tcW w:type="dxa" w:w="2340"/>
+            <w:tcW w:w="2592" w:type="dxa"/>
+            <w:shd w:val="clear" w:color="auto" w:fill="F0F4FF"/>
+            <w:tcBorders>
+              <w:top w:val="single" w:sz="4" w:space="0" w:color="CCCCCC"/>
+              <w:left w:val="single" w:sz="4" w:space="0" w:color="CCCCCC"/>
+              <w:bottom w:val="single" w:sz="4" w:space="0" w:color="CCCCCC"/>
+              <w:right w:val="single" w:sz="4" w:space="0" w:color="CCCCCC"/>
+            </w:tcBorders>
+          </w:tcPr>
+          <w:p>
+            <w:r>
+              <w:rPr>
+                <w:sz w:val="20"/>
+              </w:rPr>
+              <w:t>Firefox + Claude Vision</w:t>
+            </w:r>
+          </w:p>
+        </w:tc>
+        <w:tc>
+          <w:tcPr>
+            <w:tcW w:type="dxa" w:w="2340"/>
+            <w:tcW w:w="3600" w:type="dxa"/>
+            <w:shd w:val="clear" w:color="auto" w:fill="F0F4FF"/>
+            <w:tcBorders>
+              <w:top w:val="single" w:sz="4" w:space="0" w:color="CCCCCC"/>
+              <w:left w:val="single" w:sz="4" w:space="0" w:color="CCCCCC"/>
+              <w:bottom w:val="single" w:sz="4" w:space="0" w:color="CCCCCC"/>
+              <w:right w:val="single" w:sz="4" w:space="0" w:color="CCCCCC"/>
+            </w:tcBorders>
+          </w:tcPr>
+          <w:p>
+            <w:r>
+              <w:rPr>
+                <w:sz w:val="20"/>
+              </w:rPr>
+              <w:t>X aggressively blocks automation; login required for all content</w:t>
+            </w:r>
+          </w:p>
+        </w:tc>
+      </w:tr>
+      <w:tr>
+        <w:tc>
+          <w:tcPr>
+            <w:tcW w:type="dxa" w:w="2340"/>
             <w:tcW w:w="1728" w:type="dxa"/>
             <w:shd w:val="clear" w:color="auto" w:fill="FFFFFF"/>
             <w:tcBorders>
@@ -6444,13 +7171,34 @@
               <w:rPr>
                 <w:sz w:val="20"/>
               </w:rPr>
-              <w:t>Total video views</w:t>
-            </w:r>
-          </w:p>
-        </w:tc>
-        <w:tc>
-          <w:tcPr>
-            <w:tcW w:type="dxa" w:w="1560"/>
+              <w:t>Threads</w:t>
+            </w:r>
+          </w:p>
+        </w:tc>
+        <w:tc>
+          <w:tcPr>
+            <w:tcW w:type="dxa" w:w="2340"/>
+            <w:tcW w:w="1440" w:type="dxa"/>
+            <w:shd w:val="clear" w:color="auto" w:fill="FFFFFF"/>
+            <w:tcBorders>
+              <w:top w:val="single" w:sz="4" w:space="0" w:color="CCCCCC"/>
+              <w:left w:val="single" w:sz="4" w:space="0" w:color="CCCCCC"/>
+              <w:bottom w:val="single" w:sz="4" w:space="0" w:color="CCCCCC"/>
+              <w:right w:val="single" w:sz="4" w:space="0" w:color="CCCCCC"/>
+            </w:tcBorders>
+          </w:tcPr>
+          <w:p>
+            <w:r>
+              <w:rPr>
+                <w:sz w:val="20"/>
+              </w:rPr>
+              <w:t>Video post</w:t>
+            </w:r>
+          </w:p>
+        </w:tc>
+        <w:tc>
+          <w:tcPr>
+            <w:tcW w:type="dxa" w:w="2340"/>
             <w:tcW w:w="2592" w:type="dxa"/>
             <w:shd w:val="clear" w:color="auto" w:fill="FFFFFF"/>
             <w:tcBorders>
@@ -6465,14 +7213,14 @@
               <w:rPr>
                 <w:sz w:val="20"/>
               </w:rPr>
-              <w:t>Video title</w:t>
-            </w:r>
-          </w:p>
-        </w:tc>
-        <w:tc>
-          <w:tcPr>
-            <w:tcW w:type="dxa" w:w="1560"/>
-            <w:tcW w:w="2160" w:type="dxa"/>
+              <w:t>Firefox + Claude Vision</w:t>
+            </w:r>
+          </w:p>
+        </w:tc>
+        <w:tc>
+          <w:tcPr>
+            <w:tcW w:type="dxa" w:w="2340"/>
+            <w:tcW w:w="3600" w:type="dxa"/>
             <w:shd w:val="clear" w:color="auto" w:fill="FFFFFF"/>
             <w:tcBorders>
               <w:top w:val="single" w:sz="4" w:space="0" w:color="CCCCCC"/>
@@ -6486,787 +7234,7 @@
               <w:rPr>
                 <w:sz w:val="20"/>
               </w:rPr>
-              <w:t>yt-dlp (no browser needed — fast &amp; exact)</w:t>
-            </w:r>
-          </w:p>
-        </w:tc>
-      </w:tr>
-      <w:tr>
-        <w:tc>
-          <w:tcPr>
-            <w:tcW w:type="dxa" w:w="1560"/>
-            <w:tcW w:w="1152" w:type="dxa"/>
-            <w:shd w:val="clear" w:color="auto" w:fill="F0F4FF"/>
-            <w:tcBorders>
-              <w:top w:val="single" w:sz="4" w:space="0" w:color="CCCCCC"/>
-              <w:left w:val="single" w:sz="4" w:space="0" w:color="CCCCCC"/>
-              <w:bottom w:val="single" w:sz="4" w:space="0" w:color="CCCCCC"/>
-              <w:right w:val="single" w:sz="4" w:space="0" w:color="CCCCCC"/>
-            </w:tcBorders>
-          </w:tcPr>
-          <w:p>
-            <w:r>
-              <w:rPr>
-                <w:b/>
-                <w:color w:val="007000"/>
-                <w:sz w:val="20"/>
-              </w:rPr>
-              <w:t>Phase 1</w:t>
-            </w:r>
-          </w:p>
-        </w:tc>
-        <w:tc>
-          <w:tcPr>
-            <w:tcW w:type="dxa" w:w="1560"/>
-            <w:tcW w:w="1728" w:type="dxa"/>
-            <w:shd w:val="clear" w:color="auto" w:fill="F0F4FF"/>
-            <w:tcBorders>
-              <w:top w:val="single" w:sz="4" w:space="0" w:color="CCCCCC"/>
-              <w:left w:val="single" w:sz="4" w:space="0" w:color="CCCCCC"/>
-              <w:bottom w:val="single" w:sz="4" w:space="0" w:color="CCCCCC"/>
-              <w:right w:val="single" w:sz="4" w:space="0" w:color="CCCCCC"/>
-            </w:tcBorders>
-          </w:tcPr>
-          <w:p>
-            <w:r>
-              <w:rPr>
-                <w:sz w:val="20"/>
-              </w:rPr>
-              <w:t>TikTok</w:t>
-            </w:r>
-          </w:p>
-        </w:tc>
-        <w:tc>
-          <w:tcPr>
-            <w:tcW w:type="dxa" w:w="1560"/>
-            <w:tcW w:w="1440" w:type="dxa"/>
-            <w:shd w:val="clear" w:color="auto" w:fill="F0F4FF"/>
-            <w:tcBorders>
-              <w:top w:val="single" w:sz="4" w:space="0" w:color="CCCCCC"/>
-              <w:left w:val="single" w:sz="4" w:space="0" w:color="CCCCCC"/>
-              <w:bottom w:val="single" w:sz="4" w:space="0" w:color="CCCCCC"/>
-              <w:right w:val="single" w:sz="4" w:space="0" w:color="CCCCCC"/>
-            </w:tcBorders>
-          </w:tcPr>
-          <w:p>
-            <w:r>
-              <w:rPr>
-                <w:sz w:val="20"/>
-              </w:rPr>
-              <w:t>Video</w:t>
-            </w:r>
-          </w:p>
-        </w:tc>
-        <w:tc>
-          <w:tcPr>
-            <w:tcW w:type="dxa" w:w="1560"/>
-            <w:tcW w:w="1728" w:type="dxa"/>
-            <w:shd w:val="clear" w:color="auto" w:fill="F0F4FF"/>
-            <w:tcBorders>
-              <w:top w:val="single" w:sz="4" w:space="0" w:color="CCCCCC"/>
-              <w:left w:val="single" w:sz="4" w:space="0" w:color="CCCCCC"/>
-              <w:bottom w:val="single" w:sz="4" w:space="0" w:color="CCCCCC"/>
-              <w:right w:val="single" w:sz="4" w:space="0" w:color="CCCCCC"/>
-            </w:tcBorders>
-          </w:tcPr>
-          <w:p>
-            <w:r>
-              <w:rPr>
-                <w:sz w:val="20"/>
-              </w:rPr>
-              <w:t>Total video views</w:t>
-            </w:r>
-          </w:p>
-        </w:tc>
-        <w:tc>
-          <w:tcPr>
-            <w:tcW w:type="dxa" w:w="1560"/>
-            <w:tcW w:w="2592" w:type="dxa"/>
-            <w:shd w:val="clear" w:color="auto" w:fill="F0F4FF"/>
-            <w:tcBorders>
-              <w:top w:val="single" w:sz="4" w:space="0" w:color="CCCCCC"/>
-              <w:left w:val="single" w:sz="4" w:space="0" w:color="CCCCCC"/>
-              <w:bottom w:val="single" w:sz="4" w:space="0" w:color="CCCCCC"/>
-              <w:right w:val="single" w:sz="4" w:space="0" w:color="CCCCCC"/>
-            </w:tcBorders>
-          </w:tcPr>
-          <w:p>
-            <w:r>
-              <w:rPr>
-                <w:sz w:val="20"/>
-              </w:rPr>
-              <w:t>Video description — hashtags removed</w:t>
-            </w:r>
-          </w:p>
-        </w:tc>
-        <w:tc>
-          <w:tcPr>
-            <w:tcW w:type="dxa" w:w="1560"/>
-            <w:tcW w:w="2160" w:type="dxa"/>
-            <w:shd w:val="clear" w:color="auto" w:fill="F0F4FF"/>
-            <w:tcBorders>
-              <w:top w:val="single" w:sz="4" w:space="0" w:color="CCCCCC"/>
-              <w:left w:val="single" w:sz="4" w:space="0" w:color="CCCCCC"/>
-              <w:bottom w:val="single" w:sz="4" w:space="0" w:color="CCCCCC"/>
-              <w:right w:val="single" w:sz="4" w:space="0" w:color="CCCCCC"/>
-            </w:tcBorders>
-          </w:tcPr>
-          <w:p>
-            <w:r>
-              <w:rPr>
-                <w:sz w:val="20"/>
-              </w:rPr>
-              <w:t>yt-dlp (no browser needed — fast &amp; exact)</w:t>
-            </w:r>
-          </w:p>
-        </w:tc>
-      </w:tr>
-      <w:tr>
-        <w:tc>
-          <w:tcPr>
-            <w:tcW w:type="dxa" w:w="1560"/>
-            <w:tcW w:w="1152" w:type="dxa"/>
-            <w:shd w:val="clear" w:color="auto" w:fill="FFFFFF"/>
-            <w:tcBorders>
-              <w:top w:val="single" w:sz="4" w:space="0" w:color="CCCCCC"/>
-              <w:left w:val="single" w:sz="4" w:space="0" w:color="CCCCCC"/>
-              <w:bottom w:val="single" w:sz="4" w:space="0" w:color="CCCCCC"/>
-              <w:right w:val="single" w:sz="4" w:space="0" w:color="CCCCCC"/>
-            </w:tcBorders>
-          </w:tcPr>
-          <w:p>
-            <w:r>
-              <w:rPr>
-                <w:b/>
-                <w:color w:val="007000"/>
-                <w:sz w:val="20"/>
-              </w:rPr>
-              <w:t>Phase 1</w:t>
-            </w:r>
-          </w:p>
-        </w:tc>
-        <w:tc>
-          <w:tcPr>
-            <w:tcW w:type="dxa" w:w="1560"/>
-            <w:tcW w:w="1728" w:type="dxa"/>
-            <w:shd w:val="clear" w:color="auto" w:fill="FFFFFF"/>
-            <w:tcBorders>
-              <w:top w:val="single" w:sz="4" w:space="0" w:color="CCCCCC"/>
-              <w:left w:val="single" w:sz="4" w:space="0" w:color="CCCCCC"/>
-              <w:bottom w:val="single" w:sz="4" w:space="0" w:color="CCCCCC"/>
-              <w:right w:val="single" w:sz="4" w:space="0" w:color="CCCCCC"/>
-            </w:tcBorders>
-          </w:tcPr>
-          <w:p>
-            <w:r>
-              <w:rPr>
-                <w:sz w:val="20"/>
-              </w:rPr>
-              <w:t>Instagram</w:t>
-            </w:r>
-          </w:p>
-        </w:tc>
-        <w:tc>
-          <w:tcPr>
-            <w:tcW w:type="dxa" w:w="1560"/>
-            <w:tcW w:w="1440" w:type="dxa"/>
-            <w:shd w:val="clear" w:color="auto" w:fill="FFFFFF"/>
-            <w:tcBorders>
-              <w:top w:val="single" w:sz="4" w:space="0" w:color="CCCCCC"/>
-              <w:left w:val="single" w:sz="4" w:space="0" w:color="CCCCCC"/>
-              <w:bottom w:val="single" w:sz="4" w:space="0" w:color="CCCCCC"/>
-              <w:right w:val="single" w:sz="4" w:space="0" w:color="CCCCCC"/>
-            </w:tcBorders>
-          </w:tcPr>
-          <w:p>
-            <w:r>
-              <w:rPr>
-                <w:sz w:val="20"/>
-              </w:rPr>
-              <w:t>Reels</w:t>
-            </w:r>
-          </w:p>
-        </w:tc>
-        <w:tc>
-          <w:tcPr>
-            <w:tcW w:type="dxa" w:w="1560"/>
-            <w:tcW w:w="1728" w:type="dxa"/>
-            <w:shd w:val="clear" w:color="auto" w:fill="FFFFFF"/>
-            <w:tcBorders>
-              <w:top w:val="single" w:sz="4" w:space="0" w:color="CCCCCC"/>
-              <w:left w:val="single" w:sz="4" w:space="0" w:color="CCCCCC"/>
-              <w:bottom w:val="single" w:sz="4" w:space="0" w:color="CCCCCC"/>
-              <w:right w:val="single" w:sz="4" w:space="0" w:color="CCCCCC"/>
-            </w:tcBorders>
-          </w:tcPr>
-          <w:p>
-            <w:r>
-              <w:rPr>
-                <w:sz w:val="20"/>
-              </w:rPr>
-              <w:t>Reels view count</w:t>
-            </w:r>
-          </w:p>
-        </w:tc>
-        <w:tc>
-          <w:tcPr>
-            <w:tcW w:type="dxa" w:w="1560"/>
-            <w:tcW w:w="2592" w:type="dxa"/>
-            <w:shd w:val="clear" w:color="auto" w:fill="FFFFFF"/>
-            <w:tcBorders>
-              <w:top w:val="single" w:sz="4" w:space="0" w:color="CCCCCC"/>
-              <w:left w:val="single" w:sz="4" w:space="0" w:color="CCCCCC"/>
-              <w:bottom w:val="single" w:sz="4" w:space="0" w:color="CCCCCC"/>
-              <w:right w:val="single" w:sz="4" w:space="0" w:color="CCCCCC"/>
-            </w:tcBorders>
-          </w:tcPr>
-          <w:p>
-            <w:r>
-              <w:rPr>
-                <w:sz w:val="20"/>
-              </w:rPr>
-              <w:t>Post caption — hashtags removed</w:t>
-            </w:r>
-          </w:p>
-        </w:tc>
-        <w:tc>
-          <w:tcPr>
-            <w:tcW w:type="dxa" w:w="1560"/>
-            <w:tcW w:w="2160" w:type="dxa"/>
-            <w:shd w:val="clear" w:color="auto" w:fill="FFFFFF"/>
-            <w:tcBorders>
-              <w:top w:val="single" w:sz="4" w:space="0" w:color="CCCCCC"/>
-              <w:left w:val="single" w:sz="4" w:space="0" w:color="CCCCCC"/>
-              <w:bottom w:val="single" w:sz="4" w:space="0" w:color="CCCCCC"/>
-              <w:right w:val="single" w:sz="4" w:space="0" w:color="CCCCCC"/>
-            </w:tcBorders>
-          </w:tcPr>
-          <w:p>
-            <w:r>
-              <w:rPr>
-                <w:sz w:val="20"/>
-              </w:rPr>
-              <w:t>Firefox + Claude Vision (2-screenshot approach)</w:t>
-            </w:r>
-          </w:p>
-        </w:tc>
-      </w:tr>
-      <w:tr>
-        <w:tc>
-          <w:tcPr>
-            <w:tcW w:type="dxa" w:w="1560"/>
-            <w:tcW w:w="1152" w:type="dxa"/>
-            <w:shd w:val="clear" w:color="auto" w:fill="F0F4FF"/>
-            <w:tcBorders>
-              <w:top w:val="single" w:sz="4" w:space="0" w:color="CCCCCC"/>
-              <w:left w:val="single" w:sz="4" w:space="0" w:color="CCCCCC"/>
-              <w:bottom w:val="single" w:sz="4" w:space="0" w:color="CCCCCC"/>
-              <w:right w:val="single" w:sz="4" w:space="0" w:color="CCCCCC"/>
-            </w:tcBorders>
-          </w:tcPr>
-          <w:p>
-            <w:r>
-              <w:rPr>
-                <w:b/>
-                <w:color w:val="007000"/>
-                <w:sz w:val="20"/>
-              </w:rPr>
-              <w:t>Phase 1</w:t>
-            </w:r>
-          </w:p>
-        </w:tc>
-        <w:tc>
-          <w:tcPr>
-            <w:tcW w:type="dxa" w:w="1560"/>
-            <w:tcW w:w="1728" w:type="dxa"/>
-            <w:shd w:val="clear" w:color="auto" w:fill="F0F4FF"/>
-            <w:tcBorders>
-              <w:top w:val="single" w:sz="4" w:space="0" w:color="CCCCCC"/>
-              <w:left w:val="single" w:sz="4" w:space="0" w:color="CCCCCC"/>
-              <w:bottom w:val="single" w:sz="4" w:space="0" w:color="CCCCCC"/>
-              <w:right w:val="single" w:sz="4" w:space="0" w:color="CCCCCC"/>
-            </w:tcBorders>
-          </w:tcPr>
-          <w:p>
-            <w:r>
-              <w:rPr>
-                <w:sz w:val="20"/>
-              </w:rPr>
-              <w:t>RedNote (小红书)</w:t>
-            </w:r>
-          </w:p>
-        </w:tc>
-        <w:tc>
-          <w:tcPr>
-            <w:tcW w:type="dxa" w:w="1560"/>
-            <w:tcW w:w="1440" w:type="dxa"/>
-            <w:shd w:val="clear" w:color="auto" w:fill="F0F4FF"/>
-            <w:tcBorders>
-              <w:top w:val="single" w:sz="4" w:space="0" w:color="CCCCCC"/>
-              <w:left w:val="single" w:sz="4" w:space="0" w:color="CCCCCC"/>
-              <w:bottom w:val="single" w:sz="4" w:space="0" w:color="CCCCCC"/>
-              <w:right w:val="single" w:sz="4" w:space="0" w:color="CCCCCC"/>
-            </w:tcBorders>
-          </w:tcPr>
-          <w:p>
-            <w:r>
-              <w:rPr>
-                <w:sz w:val="20"/>
-              </w:rPr>
-              <w:t>Video</w:t>
-            </w:r>
-          </w:p>
-        </w:tc>
-        <w:tc>
-          <w:tcPr>
-            <w:tcW w:type="dxa" w:w="1560"/>
-            <w:tcW w:w="1728" w:type="dxa"/>
-            <w:shd w:val="clear" w:color="auto" w:fill="F0F4FF"/>
-            <w:tcBorders>
-              <w:top w:val="single" w:sz="4" w:space="0" w:color="CCCCCC"/>
-              <w:left w:val="single" w:sz="4" w:space="0" w:color="CCCCCC"/>
-              <w:bottom w:val="single" w:sz="4" w:space="0" w:color="CCCCCC"/>
-              <w:right w:val="single" w:sz="4" w:space="0" w:color="CCCCCC"/>
-            </w:tcBorders>
-          </w:tcPr>
-          <w:p>
-            <w:r>
-              <w:rPr>
-                <w:sz w:val="20"/>
-              </w:rPr>
-              <w:t>Video views</w:t>
-            </w:r>
-          </w:p>
-        </w:tc>
-        <w:tc>
-          <w:tcPr>
-            <w:tcW w:type="dxa" w:w="1560"/>
-            <w:tcW w:w="2592" w:type="dxa"/>
-            <w:shd w:val="clear" w:color="auto" w:fill="F0F4FF"/>
-            <w:tcBorders>
-              <w:top w:val="single" w:sz="4" w:space="0" w:color="CCCCCC"/>
-              <w:left w:val="single" w:sz="4" w:space="0" w:color="CCCCCC"/>
-              <w:bottom w:val="single" w:sz="4" w:space="0" w:color="CCCCCC"/>
-              <w:right w:val="single" w:sz="4" w:space="0" w:color="CCCCCC"/>
-            </w:tcBorders>
-          </w:tcPr>
-          <w:p>
-            <w:r>
-              <w:rPr>
-                <w:sz w:val="20"/>
-              </w:rPr>
-              <w:t>Post caption — hashtags removed</w:t>
-            </w:r>
-          </w:p>
-        </w:tc>
-        <w:tc>
-          <w:tcPr>
-            <w:tcW w:type="dxa" w:w="1560"/>
-            <w:tcW w:w="2160" w:type="dxa"/>
-            <w:shd w:val="clear" w:color="auto" w:fill="F0F4FF"/>
-            <w:tcBorders>
-              <w:top w:val="single" w:sz="4" w:space="0" w:color="CCCCCC"/>
-              <w:left w:val="single" w:sz="4" w:space="0" w:color="CCCCCC"/>
-              <w:bottom w:val="single" w:sz="4" w:space="0" w:color="CCCCCC"/>
-              <w:right w:val="single" w:sz="4" w:space="0" w:color="CCCCCC"/>
-            </w:tcBorders>
-          </w:tcPr>
-          <w:p>
-            <w:r>
-              <w:rPr>
-                <w:sz w:val="20"/>
-              </w:rPr>
-              <w:t>Firefox + Claude Vision</w:t>
-            </w:r>
-          </w:p>
-        </w:tc>
-      </w:tr>
-      <w:tr>
-        <w:tc>
-          <w:tcPr>
-            <w:tcW w:type="dxa" w:w="1560"/>
-            <w:tcW w:w="1152" w:type="dxa"/>
-            <w:shd w:val="clear" w:color="auto" w:fill="FFFFFF"/>
-            <w:tcBorders>
-              <w:top w:val="single" w:sz="4" w:space="0" w:color="CCCCCC"/>
-              <w:left w:val="single" w:sz="4" w:space="0" w:color="CCCCCC"/>
-              <w:bottom w:val="single" w:sz="4" w:space="0" w:color="CCCCCC"/>
-              <w:right w:val="single" w:sz="4" w:space="0" w:color="CCCCCC"/>
-            </w:tcBorders>
-          </w:tcPr>
-          <w:p>
-            <w:r>
-              <w:rPr>
-                <w:b/>
-                <w:color w:val="C55A11"/>
-                <w:sz w:val="20"/>
-              </w:rPr>
-              <w:t>Phase 2</w:t>
-            </w:r>
-          </w:p>
-        </w:tc>
-        <w:tc>
-          <w:tcPr>
-            <w:tcW w:type="dxa" w:w="1560"/>
-            <w:tcW w:w="1728" w:type="dxa"/>
-            <w:shd w:val="clear" w:color="auto" w:fill="FFFFFF"/>
-            <w:tcBorders>
-              <w:top w:val="single" w:sz="4" w:space="0" w:color="CCCCCC"/>
-              <w:left w:val="single" w:sz="4" w:space="0" w:color="CCCCCC"/>
-              <w:bottom w:val="single" w:sz="4" w:space="0" w:color="CCCCCC"/>
-              <w:right w:val="single" w:sz="4" w:space="0" w:color="CCCCCC"/>
-            </w:tcBorders>
-          </w:tcPr>
-          <w:p>
-            <w:r>
-              <w:rPr>
-                <w:sz w:val="20"/>
-              </w:rPr>
-              <w:t>Facebook</w:t>
-            </w:r>
-          </w:p>
-        </w:tc>
-        <w:tc>
-          <w:tcPr>
-            <w:tcW w:type="dxa" w:w="1560"/>
-            <w:tcW w:w="1440" w:type="dxa"/>
-            <w:shd w:val="clear" w:color="auto" w:fill="FFFFFF"/>
-            <w:tcBorders>
-              <w:top w:val="single" w:sz="4" w:space="0" w:color="CCCCCC"/>
-              <w:left w:val="single" w:sz="4" w:space="0" w:color="CCCCCC"/>
-              <w:bottom w:val="single" w:sz="4" w:space="0" w:color="CCCCCC"/>
-              <w:right w:val="single" w:sz="4" w:space="0" w:color="CCCCCC"/>
-            </w:tcBorders>
-          </w:tcPr>
-          <w:p>
-            <w:r>
-              <w:rPr>
-                <w:sz w:val="20"/>
-              </w:rPr>
-              <w:t>Video / Reels</w:t>
-            </w:r>
-          </w:p>
-        </w:tc>
-        <w:tc>
-          <w:tcPr>
-            <w:tcW w:type="dxa" w:w="1560"/>
-            <w:tcW w:w="1728" w:type="dxa"/>
-            <w:shd w:val="clear" w:color="auto" w:fill="FFFFFF"/>
-            <w:tcBorders>
-              <w:top w:val="single" w:sz="4" w:space="0" w:color="CCCCCC"/>
-              <w:left w:val="single" w:sz="4" w:space="0" w:color="CCCCCC"/>
-              <w:bottom w:val="single" w:sz="4" w:space="0" w:color="CCCCCC"/>
-              <w:right w:val="single" w:sz="4" w:space="0" w:color="CCCCCC"/>
-            </w:tcBorders>
-          </w:tcPr>
-          <w:p>
-            <w:r>
-              <w:rPr>
-                <w:sz w:val="20"/>
-              </w:rPr>
-              <w:t>Video views</w:t>
-            </w:r>
-          </w:p>
-        </w:tc>
-        <w:tc>
-          <w:tcPr>
-            <w:tcW w:type="dxa" w:w="1560"/>
-            <w:tcW w:w="2592" w:type="dxa"/>
-            <w:shd w:val="clear" w:color="auto" w:fill="FFFFFF"/>
-            <w:tcBorders>
-              <w:top w:val="single" w:sz="4" w:space="0" w:color="CCCCCC"/>
-              <w:left w:val="single" w:sz="4" w:space="0" w:color="CCCCCC"/>
-              <w:bottom w:val="single" w:sz="4" w:space="0" w:color="CCCCCC"/>
-              <w:right w:val="single" w:sz="4" w:space="0" w:color="CCCCCC"/>
-            </w:tcBorders>
-          </w:tcPr>
-          <w:p>
-            <w:r>
-              <w:rPr>
-                <w:sz w:val="20"/>
-              </w:rPr>
-              <w:t>Post caption — hashtags removed</w:t>
-            </w:r>
-          </w:p>
-        </w:tc>
-        <w:tc>
-          <w:tcPr>
-            <w:tcW w:type="dxa" w:w="1560"/>
-            <w:tcW w:w="2160" w:type="dxa"/>
-            <w:shd w:val="clear" w:color="auto" w:fill="FFFFFF"/>
-            <w:tcBorders>
-              <w:top w:val="single" w:sz="4" w:space="0" w:color="CCCCCC"/>
-              <w:left w:val="single" w:sz="4" w:space="0" w:color="CCCCCC"/>
-              <w:bottom w:val="single" w:sz="4" w:space="0" w:color="CCCCCC"/>
-              <w:right w:val="single" w:sz="4" w:space="0" w:color="CCCCCC"/>
-            </w:tcBorders>
-          </w:tcPr>
-          <w:p>
-            <w:r>
-              <w:rPr>
-                <w:sz w:val="20"/>
-              </w:rPr>
-              <w:t>Firefox + Claude Vision (planned)</w:t>
-            </w:r>
-          </w:p>
-        </w:tc>
-      </w:tr>
-      <w:tr>
-        <w:tc>
-          <w:tcPr>
-            <w:tcW w:type="dxa" w:w="1560"/>
-            <w:tcW w:w="1152" w:type="dxa"/>
-            <w:shd w:val="clear" w:color="auto" w:fill="F0F4FF"/>
-            <w:tcBorders>
-              <w:top w:val="single" w:sz="4" w:space="0" w:color="CCCCCC"/>
-              <w:left w:val="single" w:sz="4" w:space="0" w:color="CCCCCC"/>
-              <w:bottom w:val="single" w:sz="4" w:space="0" w:color="CCCCCC"/>
-              <w:right w:val="single" w:sz="4" w:space="0" w:color="CCCCCC"/>
-            </w:tcBorders>
-          </w:tcPr>
-          <w:p>
-            <w:r>
-              <w:rPr>
-                <w:b/>
-                <w:color w:val="C55A11"/>
-                <w:sz w:val="20"/>
-              </w:rPr>
-              <w:t>Phase 2</w:t>
-            </w:r>
-          </w:p>
-        </w:tc>
-        <w:tc>
-          <w:tcPr>
-            <w:tcW w:type="dxa" w:w="1560"/>
-            <w:tcW w:w="1728" w:type="dxa"/>
-            <w:shd w:val="clear" w:color="auto" w:fill="F0F4FF"/>
-            <w:tcBorders>
-              <w:top w:val="single" w:sz="4" w:space="0" w:color="CCCCCC"/>
-              <w:left w:val="single" w:sz="4" w:space="0" w:color="CCCCCC"/>
-              <w:bottom w:val="single" w:sz="4" w:space="0" w:color="CCCCCC"/>
-              <w:right w:val="single" w:sz="4" w:space="0" w:color="CCCCCC"/>
-            </w:tcBorders>
-          </w:tcPr>
-          <w:p>
-            <w:r>
-              <w:rPr>
-                <w:sz w:val="20"/>
-              </w:rPr>
-              <w:t>X (Twitter)</w:t>
-            </w:r>
-          </w:p>
-        </w:tc>
-        <w:tc>
-          <w:tcPr>
-            <w:tcW w:type="dxa" w:w="1560"/>
-            <w:tcW w:w="1440" w:type="dxa"/>
-            <w:shd w:val="clear" w:color="auto" w:fill="F0F4FF"/>
-            <w:tcBorders>
-              <w:top w:val="single" w:sz="4" w:space="0" w:color="CCCCCC"/>
-              <w:left w:val="single" w:sz="4" w:space="0" w:color="CCCCCC"/>
-              <w:bottom w:val="single" w:sz="4" w:space="0" w:color="CCCCCC"/>
-              <w:right w:val="single" w:sz="4" w:space="0" w:color="CCCCCC"/>
-            </w:tcBorders>
-          </w:tcPr>
-          <w:p>
-            <w:r>
-              <w:rPr>
-                <w:sz w:val="20"/>
-              </w:rPr>
-              <w:t>Video post</w:t>
-            </w:r>
-          </w:p>
-        </w:tc>
-        <w:tc>
-          <w:tcPr>
-            <w:tcW w:type="dxa" w:w="1560"/>
-            <w:tcW w:w="1728" w:type="dxa"/>
-            <w:shd w:val="clear" w:color="auto" w:fill="F0F4FF"/>
-            <w:tcBorders>
-              <w:top w:val="single" w:sz="4" w:space="0" w:color="CCCCCC"/>
-              <w:left w:val="single" w:sz="4" w:space="0" w:color="CCCCCC"/>
-              <w:bottom w:val="single" w:sz="4" w:space="0" w:color="CCCCCC"/>
-              <w:right w:val="single" w:sz="4" w:space="0" w:color="CCCCCC"/>
-            </w:tcBorders>
-          </w:tcPr>
-          <w:p>
-            <w:r>
-              <w:rPr>
-                <w:sz w:val="20"/>
-              </w:rPr>
-              <w:t>Video views</w:t>
-            </w:r>
-          </w:p>
-        </w:tc>
-        <w:tc>
-          <w:tcPr>
-            <w:tcW w:type="dxa" w:w="1560"/>
-            <w:tcW w:w="2592" w:type="dxa"/>
-            <w:shd w:val="clear" w:color="auto" w:fill="F0F4FF"/>
-            <w:tcBorders>
-              <w:top w:val="single" w:sz="4" w:space="0" w:color="CCCCCC"/>
-              <w:left w:val="single" w:sz="4" w:space="0" w:color="CCCCCC"/>
-              <w:bottom w:val="single" w:sz="4" w:space="0" w:color="CCCCCC"/>
-              <w:right w:val="single" w:sz="4" w:space="0" w:color="CCCCCC"/>
-            </w:tcBorders>
-          </w:tcPr>
-          <w:p>
-            <w:r>
-              <w:rPr>
-                <w:sz w:val="20"/>
-              </w:rPr>
-              <w:t>Tweet text — hashtags removed</w:t>
-            </w:r>
-          </w:p>
-        </w:tc>
-        <w:tc>
-          <w:tcPr>
-            <w:tcW w:type="dxa" w:w="1560"/>
-            <w:tcW w:w="2160" w:type="dxa"/>
-            <w:shd w:val="clear" w:color="auto" w:fill="F0F4FF"/>
-            <w:tcBorders>
-              <w:top w:val="single" w:sz="4" w:space="0" w:color="CCCCCC"/>
-              <w:left w:val="single" w:sz="4" w:space="0" w:color="CCCCCC"/>
-              <w:bottom w:val="single" w:sz="4" w:space="0" w:color="CCCCCC"/>
-              <w:right w:val="single" w:sz="4" w:space="0" w:color="CCCCCC"/>
-            </w:tcBorders>
-          </w:tcPr>
-          <w:p>
-            <w:r>
-              <w:rPr>
-                <w:sz w:val="20"/>
-              </w:rPr>
-              <w:t>Firefox + Claude Vision (planned)</w:t>
-            </w:r>
-          </w:p>
-        </w:tc>
-      </w:tr>
-      <w:tr>
-        <w:tc>
-          <w:tcPr>
-            <w:tcW w:type="dxa" w:w="1560"/>
-            <w:tcW w:w="1152" w:type="dxa"/>
-            <w:shd w:val="clear" w:color="auto" w:fill="FFFFFF"/>
-            <w:tcBorders>
-              <w:top w:val="single" w:sz="4" w:space="0" w:color="CCCCCC"/>
-              <w:left w:val="single" w:sz="4" w:space="0" w:color="CCCCCC"/>
-              <w:bottom w:val="single" w:sz="4" w:space="0" w:color="CCCCCC"/>
-              <w:right w:val="single" w:sz="4" w:space="0" w:color="CCCCCC"/>
-            </w:tcBorders>
-          </w:tcPr>
-          <w:p>
-            <w:r>
-              <w:rPr>
-                <w:b/>
-                <w:color w:val="C55A11"/>
-                <w:sz w:val="20"/>
-              </w:rPr>
-              <w:t>Phase 2</w:t>
-            </w:r>
-          </w:p>
-        </w:tc>
-        <w:tc>
-          <w:tcPr>
-            <w:tcW w:type="dxa" w:w="1560"/>
-            <w:tcW w:w="1728" w:type="dxa"/>
-            <w:shd w:val="clear" w:color="auto" w:fill="FFFFFF"/>
-            <w:tcBorders>
-              <w:top w:val="single" w:sz="4" w:space="0" w:color="CCCCCC"/>
-              <w:left w:val="single" w:sz="4" w:space="0" w:color="CCCCCC"/>
-              <w:bottom w:val="single" w:sz="4" w:space="0" w:color="CCCCCC"/>
-              <w:right w:val="single" w:sz="4" w:space="0" w:color="CCCCCC"/>
-            </w:tcBorders>
-          </w:tcPr>
-          <w:p>
-            <w:r>
-              <w:rPr>
-                <w:sz w:val="20"/>
-              </w:rPr>
-              <w:t>Threads</w:t>
-            </w:r>
-          </w:p>
-        </w:tc>
-        <w:tc>
-          <w:tcPr>
-            <w:tcW w:type="dxa" w:w="1560"/>
-            <w:tcW w:w="1440" w:type="dxa"/>
-            <w:shd w:val="clear" w:color="auto" w:fill="FFFFFF"/>
-            <w:tcBorders>
-              <w:top w:val="single" w:sz="4" w:space="0" w:color="CCCCCC"/>
-              <w:left w:val="single" w:sz="4" w:space="0" w:color="CCCCCC"/>
-              <w:bottom w:val="single" w:sz="4" w:space="0" w:color="CCCCCC"/>
-              <w:right w:val="single" w:sz="4" w:space="0" w:color="CCCCCC"/>
-            </w:tcBorders>
-          </w:tcPr>
-          <w:p>
-            <w:r>
-              <w:rPr>
-                <w:sz w:val="20"/>
-              </w:rPr>
-              <w:t>Video post</w:t>
-            </w:r>
-          </w:p>
-        </w:tc>
-        <w:tc>
-          <w:tcPr>
-            <w:tcW w:type="dxa" w:w="1560"/>
-            <w:tcW w:w="1728" w:type="dxa"/>
-            <w:shd w:val="clear" w:color="auto" w:fill="FFFFFF"/>
-            <w:tcBorders>
-              <w:top w:val="single" w:sz="4" w:space="0" w:color="CCCCCC"/>
-              <w:left w:val="single" w:sz="4" w:space="0" w:color="CCCCCC"/>
-              <w:bottom w:val="single" w:sz="4" w:space="0" w:color="CCCCCC"/>
-              <w:right w:val="single" w:sz="4" w:space="0" w:color="CCCCCC"/>
-            </w:tcBorders>
-          </w:tcPr>
-          <w:p>
-            <w:r>
-              <w:rPr>
-                <w:sz w:val="20"/>
-              </w:rPr>
-              <w:t>Video views</w:t>
-            </w:r>
-          </w:p>
-        </w:tc>
-        <w:tc>
-          <w:tcPr>
-            <w:tcW w:type="dxa" w:w="1560"/>
-            <w:tcW w:w="2592" w:type="dxa"/>
-            <w:shd w:val="clear" w:color="auto" w:fill="FFFFFF"/>
-            <w:tcBorders>
-              <w:top w:val="single" w:sz="4" w:space="0" w:color="CCCCCC"/>
-              <w:left w:val="single" w:sz="4" w:space="0" w:color="CCCCCC"/>
-              <w:bottom w:val="single" w:sz="4" w:space="0" w:color="CCCCCC"/>
-              <w:right w:val="single" w:sz="4" w:space="0" w:color="CCCCCC"/>
-            </w:tcBorders>
-          </w:tcPr>
-          <w:p>
-            <w:r>
-              <w:rPr>
-                <w:sz w:val="20"/>
-              </w:rPr>
-              <w:t>Post caption — hashtags removed</w:t>
-            </w:r>
-          </w:p>
-        </w:tc>
-        <w:tc>
-          <w:tcPr>
-            <w:tcW w:type="dxa" w:w="1560"/>
-            <w:tcW w:w="2160" w:type="dxa"/>
-            <w:shd w:val="clear" w:color="auto" w:fill="FFFFFF"/>
-            <w:tcBorders>
-              <w:top w:val="single" w:sz="4" w:space="0" w:color="CCCCCC"/>
-              <w:left w:val="single" w:sz="4" w:space="0" w:color="CCCCCC"/>
-              <w:bottom w:val="single" w:sz="4" w:space="0" w:color="CCCCCC"/>
-              <w:right w:val="single" w:sz="4" w:space="0" w:color="CCCCCC"/>
-            </w:tcBorders>
-          </w:tcPr>
-          <w:p>
-            <w:r>
-              <w:rPr>
-                <w:sz w:val="20"/>
-              </w:rPr>
-              <w:t>Firefox + Claude Vision (planned)</w:t>
+              <w:t>No API; UI scraping feasible but not yet implemented</w:t>
             </w:r>
           </w:p>
         </w:tc>

</xml_diff>

<commit_message>
Generate updated .docx files; restore corrected .md (v5.5/3.5)
Generator scripts regenerated .docx from hardcoded content (useful for Word output)
but overwrote the corrected .md files. Restored .md to v5.5/3.5 which includes:
TikTok→Firefox+DOM, X added, watcher threading fix, Phase 4 rollback, live demo evidence.

Generator scripts need updating separately to stay in sync.

Co-Authored-By: Claude Sonnet 4.6 <noreply@anthropic.com>
</commit_message>
<xml_diff>
--- a/BRD_Auto_Count_Social_Media_Reach.docx
+++ b/BRD_Auto_Count_Social_Media_Reach.docx
@@ -140,7 +140,7 @@
               <w:rPr>
                 <w:sz w:val="20"/>
               </w:rPr>
-              <w:t>18 May 2026</w:t>
+              <w:t>21 May 2026</w:t>
             </w:r>
           </w:p>
         </w:tc>
@@ -1121,7 +1121,7 @@
               <w:rPr>
                 <w:sz w:val="20"/>
               </w:rPr>
-              <w:t>18 May 2026</w:t>
+              <w:t>21 May 2026</w:t>
             </w:r>
           </w:p>
         </w:tc>

</xml_diff>

<commit_message>
Update generator scripts to v5.5/v3.5 with TikTok DOM, X (Twitter), Phase 4 rollback
Co-Authored-By: Claude Sonnet 4.6 <noreply@anthropic.com>
</commit_message>
<xml_diff>
--- a/BRD_Auto_Count_Social_Media_Reach.docx
+++ b/BRD_Auto_Count_Social_Media_Reach.docx
@@ -96,7 +96,7 @@
               <w:rPr>
                 <w:sz w:val="20"/>
               </w:rPr>
-              <w:t>5.4</w:t>
+              <w:t>5.5</w:t>
             </w:r>
           </w:p>
         </w:tc>
@@ -1121,7 +1121,7 @@
               <w:rPr>
                 <w:sz w:val="20"/>
               </w:rPr>
-              <w:t>21 May 2026</w:t>
+              <w:t>18 May 2026</w:t>
             </w:r>
           </w:p>
         </w:tc>
@@ -1164,6 +1164,92 @@
                 <w:sz w:val="20"/>
               </w:rPr>
               <w:t>Feedback fixes: removed defensive baseline note — stated upfront as 4 min/video × 10 videos. Phase 2 platforms moved to Appendix A (Future Scope) to keep main doc focused on current build.</w:t>
+            </w:r>
+          </w:p>
+        </w:tc>
+      </w:tr>
+      <w:tr>
+        <w:tc>
+          <w:tcPr>
+            <w:tcW w:type="dxa" w:w="2340"/>
+            <w:tcW w:w="1007" w:type="dxa"/>
+            <w:shd w:val="clear" w:color="auto" w:fill="F0F4FF"/>
+            <w:tcBorders>
+              <w:top w:val="single" w:sz="4" w:space="0" w:color="CCCCCC"/>
+              <w:left w:val="single" w:sz="4" w:space="0" w:color="CCCCCC"/>
+              <w:bottom w:val="single" w:sz="4" w:space="0" w:color="CCCCCC"/>
+              <w:right w:val="single" w:sz="4" w:space="0" w:color="CCCCCC"/>
+            </w:tcBorders>
+          </w:tcPr>
+          <w:p>
+            <w:r>
+              <w:rPr>
+                <w:sz w:val="20"/>
+              </w:rPr>
+              <w:t>5.5</w:t>
+            </w:r>
+          </w:p>
+        </w:tc>
+        <w:tc>
+          <w:tcPr>
+            <w:tcW w:type="dxa" w:w="2340"/>
+            <w:tcW w:w="2160" w:type="dxa"/>
+            <w:shd w:val="clear" w:color="auto" w:fill="F0F4FF"/>
+            <w:tcBorders>
+              <w:top w:val="single" w:sz="4" w:space="0" w:color="CCCCCC"/>
+              <w:left w:val="single" w:sz="4" w:space="0" w:color="CCCCCC"/>
+              <w:bottom w:val="single" w:sz="4" w:space="0" w:color="CCCCCC"/>
+              <w:right w:val="single" w:sz="4" w:space="0" w:color="CCCCCC"/>
+            </w:tcBorders>
+          </w:tcPr>
+          <w:p>
+            <w:r>
+              <w:rPr>
+                <w:sz w:val="20"/>
+              </w:rPr>
+              <w:t>21 May 2026</w:t>
+            </w:r>
+          </w:p>
+        </w:tc>
+        <w:tc>
+          <w:tcPr>
+            <w:tcW w:type="dxa" w:w="2340"/>
+            <w:tcW w:w="2160" w:type="dxa"/>
+            <w:shd w:val="clear" w:color="auto" w:fill="F0F4FF"/>
+            <w:tcBorders>
+              <w:top w:val="single" w:sz="4" w:space="0" w:color="CCCCCC"/>
+              <w:left w:val="single" w:sz="4" w:space="0" w:color="CCCCCC"/>
+              <w:bottom w:val="single" w:sz="4" w:space="0" w:color="CCCCCC"/>
+              <w:right w:val="single" w:sz="4" w:space="0" w:color="CCCCCC"/>
+            </w:tcBorders>
+          </w:tcPr>
+          <w:p>
+            <w:r>
+              <w:rPr>
+                <w:sz w:val="20"/>
+              </w:rPr>
+              <w:t>jingyi-rere</w:t>
+            </w:r>
+          </w:p>
+        </w:tc>
+        <w:tc>
+          <w:tcPr>
+            <w:tcW w:type="dxa" w:w="2340"/>
+            <w:tcW w:w="5472" w:type="dxa"/>
+            <w:shd w:val="clear" w:color="auto" w:fill="F0F4FF"/>
+            <w:tcBorders>
+              <w:top w:val="single" w:sz="4" w:space="0" w:color="CCCCCC"/>
+              <w:left w:val="single" w:sz="4" w:space="0" w:color="CCCCCC"/>
+              <w:bottom w:val="single" w:sz="4" w:space="0" w:color="CCCCCC"/>
+              <w:right w:val="single" w:sz="4" w:space="0" w:color="CCCCCC"/>
+            </w:tcBorders>
+          </w:tcPr>
+          <w:p>
+            <w:r>
+              <w:rPr>
+                <w:sz w:val="20"/>
+              </w:rPr>
+              <w:t>TikTok → Firefox+DOM (not yt-dlp); X (Twitter) added as 5th platform; live 5-platform test confirmed.</w:t>
             </w:r>
           </w:p>
         </w:tc>
@@ -6289,7 +6375,7 @@
           <w:color w:val="595959"/>
           <w:sz w:val="22"/>
         </w:rPr>
-        <w:t>The following 4 platforms are fully built, tested, and active. They cover 100% of current posting activity.</w:t>
+        <w:t>The following 5 platforms are fully built, tested, and active. They cover 100% of current posting activity.</w:t>
       </w:r>
     </w:p>
     <w:p/>
@@ -6632,7 +6718,7 @@
               <w:rPr>
                 <w:sz w:val="20"/>
               </w:rPr>
-              <w:t>yt-dlp (no browser needed — fast &amp; exact)</w:t>
+              <w:t>Firefox + DOM (caption/date from DOM; view count from embedded page JSON)</w:t>
             </w:r>
           </w:p>
         </w:tc>
@@ -6655,7 +6741,7 @@
               <w:rPr>
                 <w:sz w:val="20"/>
               </w:rPr>
-              <w:t>Instagram</w:t>
+              <w:t>X (Twitter)</w:t>
             </w:r>
           </w:p>
         </w:tc>
@@ -6676,7 +6762,7 @@
               <w:rPr>
                 <w:sz w:val="20"/>
               </w:rPr>
-              <w:t>Reels</w:t>
+              <w:t>Video post</w:t>
             </w:r>
           </w:p>
         </w:tc>
@@ -6697,7 +6783,7 @@
               <w:rPr>
                 <w:sz w:val="20"/>
               </w:rPr>
-              <w:t>Reels view count</w:t>
+              <w:t>Total video views</w:t>
             </w:r>
           </w:p>
         </w:tc>
@@ -6718,7 +6804,7 @@
               <w:rPr>
                 <w:sz w:val="20"/>
               </w:rPr>
-              <w:t>Post caption — hashtags removed</w:t>
+              <w:t>Tweet text — hashtags removed</w:t>
             </w:r>
           </w:p>
         </w:tc>
@@ -6739,7 +6825,7 @@
               <w:rPr>
                 <w:sz w:val="20"/>
               </w:rPr>
-              <w:t>Firefox + Claude Vision (2-screenshot approach)</w:t>
+              <w:t>Firefox + DOM (caption from tweetText; date from &lt;time&gt;; view count from post page)</w:t>
             </w:r>
           </w:p>
         </w:tc>
@@ -6762,7 +6848,7 @@
               <w:rPr>
                 <w:sz w:val="20"/>
               </w:rPr>
-              <w:t>RedNote (小红书)</w:t>
+              <w:t>Instagram</w:t>
             </w:r>
           </w:p>
         </w:tc>
@@ -6783,7 +6869,7 @@
               <w:rPr>
                 <w:sz w:val="20"/>
               </w:rPr>
-              <w:t>Video</w:t>
+              <w:t>Reels</w:t>
             </w:r>
           </w:p>
         </w:tc>
@@ -6804,7 +6890,7 @@
               <w:rPr>
                 <w:sz w:val="20"/>
               </w:rPr>
-              <w:t>Video views</w:t>
+              <w:t>Reels view count</w:t>
             </w:r>
           </w:p>
         </w:tc>
@@ -6834,6 +6920,113 @@
             <w:tcW w:type="dxa" w:w="1872"/>
             <w:tcW w:w="2160" w:type="dxa"/>
             <w:shd w:val="clear" w:color="auto" w:fill="F0F4FF"/>
+            <w:tcBorders>
+              <w:top w:val="single" w:sz="4" w:space="0" w:color="CCCCCC"/>
+              <w:left w:val="single" w:sz="4" w:space="0" w:color="CCCCCC"/>
+              <w:bottom w:val="single" w:sz="4" w:space="0" w:color="CCCCCC"/>
+              <w:right w:val="single" w:sz="4" w:space="0" w:color="CCCCCC"/>
+            </w:tcBorders>
+          </w:tcPr>
+          <w:p>
+            <w:r>
+              <w:rPr>
+                <w:sz w:val="20"/>
+              </w:rPr>
+              <w:t>Firefox + Claude Vision (2-screenshot approach)</w:t>
+            </w:r>
+          </w:p>
+        </w:tc>
+      </w:tr>
+      <w:tr>
+        <w:tc>
+          <w:tcPr>
+            <w:tcW w:type="dxa" w:w="1872"/>
+            <w:tcW w:w="1728" w:type="dxa"/>
+            <w:shd w:val="clear" w:color="auto" w:fill="FFFFFF"/>
+            <w:tcBorders>
+              <w:top w:val="single" w:sz="4" w:space="0" w:color="CCCCCC"/>
+              <w:left w:val="single" w:sz="4" w:space="0" w:color="CCCCCC"/>
+              <w:bottom w:val="single" w:sz="4" w:space="0" w:color="CCCCCC"/>
+              <w:right w:val="single" w:sz="4" w:space="0" w:color="CCCCCC"/>
+            </w:tcBorders>
+          </w:tcPr>
+          <w:p>
+            <w:r>
+              <w:rPr>
+                <w:sz w:val="20"/>
+              </w:rPr>
+              <w:t>RedNote (小红书)</w:t>
+            </w:r>
+          </w:p>
+        </w:tc>
+        <w:tc>
+          <w:tcPr>
+            <w:tcW w:type="dxa" w:w="1872"/>
+            <w:tcW w:w="1440" w:type="dxa"/>
+            <w:shd w:val="clear" w:color="auto" w:fill="FFFFFF"/>
+            <w:tcBorders>
+              <w:top w:val="single" w:sz="4" w:space="0" w:color="CCCCCC"/>
+              <w:left w:val="single" w:sz="4" w:space="0" w:color="CCCCCC"/>
+              <w:bottom w:val="single" w:sz="4" w:space="0" w:color="CCCCCC"/>
+              <w:right w:val="single" w:sz="4" w:space="0" w:color="CCCCCC"/>
+            </w:tcBorders>
+          </w:tcPr>
+          <w:p>
+            <w:r>
+              <w:rPr>
+                <w:sz w:val="20"/>
+              </w:rPr>
+              <w:t>Video</w:t>
+            </w:r>
+          </w:p>
+        </w:tc>
+        <w:tc>
+          <w:tcPr>
+            <w:tcW w:type="dxa" w:w="1872"/>
+            <w:tcW w:w="1728" w:type="dxa"/>
+            <w:shd w:val="clear" w:color="auto" w:fill="FFFFFF"/>
+            <w:tcBorders>
+              <w:top w:val="single" w:sz="4" w:space="0" w:color="CCCCCC"/>
+              <w:left w:val="single" w:sz="4" w:space="0" w:color="CCCCCC"/>
+              <w:bottom w:val="single" w:sz="4" w:space="0" w:color="CCCCCC"/>
+              <w:right w:val="single" w:sz="4" w:space="0" w:color="CCCCCC"/>
+            </w:tcBorders>
+          </w:tcPr>
+          <w:p>
+            <w:r>
+              <w:rPr>
+                <w:sz w:val="20"/>
+              </w:rPr>
+              <w:t>Video views</w:t>
+            </w:r>
+          </w:p>
+        </w:tc>
+        <w:tc>
+          <w:tcPr>
+            <w:tcW w:type="dxa" w:w="1872"/>
+            <w:tcW w:w="2592" w:type="dxa"/>
+            <w:shd w:val="clear" w:color="auto" w:fill="FFFFFF"/>
+            <w:tcBorders>
+              <w:top w:val="single" w:sz="4" w:space="0" w:color="CCCCCC"/>
+              <w:left w:val="single" w:sz="4" w:space="0" w:color="CCCCCC"/>
+              <w:bottom w:val="single" w:sz="4" w:space="0" w:color="CCCCCC"/>
+              <w:right w:val="single" w:sz="4" w:space="0" w:color="CCCCCC"/>
+            </w:tcBorders>
+          </w:tcPr>
+          <w:p>
+            <w:r>
+              <w:rPr>
+                <w:sz w:val="20"/>
+              </w:rPr>
+              <w:t>Post caption — hashtags removed</w:t>
+            </w:r>
+          </w:p>
+        </w:tc>
+        <w:tc>
+          <w:tcPr>
+            <w:tcW w:type="dxa" w:w="1872"/>
+            <w:tcW w:w="2160" w:type="dxa"/>
+            <w:shd w:val="clear" w:color="auto" w:fill="FFFFFF"/>
             <w:tcBorders>
               <w:top w:val="single" w:sz="4" w:space="0" w:color="CCCCCC"/>
               <w:left w:val="single" w:sz="4" w:space="0" w:color="CCCCCC"/>
@@ -7085,7 +7278,7 @@
               <w:rPr>
                 <w:sz w:val="20"/>
               </w:rPr>
-              <w:t>X (Twitter)</w:t>
+              <w:t>Threads</w:t>
             </w:r>
           </w:p>
         </w:tc>
@@ -7136,92 +7329,6 @@
             <w:tcW w:type="dxa" w:w="2340"/>
             <w:tcW w:w="3600" w:type="dxa"/>
             <w:shd w:val="clear" w:color="auto" w:fill="F0F4FF"/>
-            <w:tcBorders>
-              <w:top w:val="single" w:sz="4" w:space="0" w:color="CCCCCC"/>
-              <w:left w:val="single" w:sz="4" w:space="0" w:color="CCCCCC"/>
-              <w:bottom w:val="single" w:sz="4" w:space="0" w:color="CCCCCC"/>
-              <w:right w:val="single" w:sz="4" w:space="0" w:color="CCCCCC"/>
-            </w:tcBorders>
-          </w:tcPr>
-          <w:p>
-            <w:r>
-              <w:rPr>
-                <w:sz w:val="20"/>
-              </w:rPr>
-              <w:t>X aggressively blocks automation; login required for all content</w:t>
-            </w:r>
-          </w:p>
-        </w:tc>
-      </w:tr>
-      <w:tr>
-        <w:tc>
-          <w:tcPr>
-            <w:tcW w:type="dxa" w:w="2340"/>
-            <w:tcW w:w="1728" w:type="dxa"/>
-            <w:shd w:val="clear" w:color="auto" w:fill="FFFFFF"/>
-            <w:tcBorders>
-              <w:top w:val="single" w:sz="4" w:space="0" w:color="CCCCCC"/>
-              <w:left w:val="single" w:sz="4" w:space="0" w:color="CCCCCC"/>
-              <w:bottom w:val="single" w:sz="4" w:space="0" w:color="CCCCCC"/>
-              <w:right w:val="single" w:sz="4" w:space="0" w:color="CCCCCC"/>
-            </w:tcBorders>
-          </w:tcPr>
-          <w:p>
-            <w:r>
-              <w:rPr>
-                <w:sz w:val="20"/>
-              </w:rPr>
-              <w:t>Threads</w:t>
-            </w:r>
-          </w:p>
-        </w:tc>
-        <w:tc>
-          <w:tcPr>
-            <w:tcW w:type="dxa" w:w="2340"/>
-            <w:tcW w:w="1440" w:type="dxa"/>
-            <w:shd w:val="clear" w:color="auto" w:fill="FFFFFF"/>
-            <w:tcBorders>
-              <w:top w:val="single" w:sz="4" w:space="0" w:color="CCCCCC"/>
-              <w:left w:val="single" w:sz="4" w:space="0" w:color="CCCCCC"/>
-              <w:bottom w:val="single" w:sz="4" w:space="0" w:color="CCCCCC"/>
-              <w:right w:val="single" w:sz="4" w:space="0" w:color="CCCCCC"/>
-            </w:tcBorders>
-          </w:tcPr>
-          <w:p>
-            <w:r>
-              <w:rPr>
-                <w:sz w:val="20"/>
-              </w:rPr>
-              <w:t>Video post</w:t>
-            </w:r>
-          </w:p>
-        </w:tc>
-        <w:tc>
-          <w:tcPr>
-            <w:tcW w:type="dxa" w:w="2340"/>
-            <w:tcW w:w="2592" w:type="dxa"/>
-            <w:shd w:val="clear" w:color="auto" w:fill="FFFFFF"/>
-            <w:tcBorders>
-              <w:top w:val="single" w:sz="4" w:space="0" w:color="CCCCCC"/>
-              <w:left w:val="single" w:sz="4" w:space="0" w:color="CCCCCC"/>
-              <w:bottom w:val="single" w:sz="4" w:space="0" w:color="CCCCCC"/>
-              <w:right w:val="single" w:sz="4" w:space="0" w:color="CCCCCC"/>
-            </w:tcBorders>
-          </w:tcPr>
-          <w:p>
-            <w:r>
-              <w:rPr>
-                <w:sz w:val="20"/>
-              </w:rPr>
-              <w:t>Firefox + Claude Vision</w:t>
-            </w:r>
-          </w:p>
-        </w:tc>
-        <w:tc>
-          <w:tcPr>
-            <w:tcW w:type="dxa" w:w="2340"/>
-            <w:tcW w:w="3600" w:type="dxa"/>
-            <w:shd w:val="clear" w:color="auto" w:fill="FFFFFF"/>
             <w:tcBorders>
               <w:top w:val="single" w:sz="4" w:space="0" w:color="CCCCCC"/>
               <w:left w:val="single" w:sz="4" w:space="0" w:color="CCCCCC"/>
@@ -7473,7 +7580,7 @@
               <w:rPr>
                 <w:sz w:val="20"/>
               </w:rPr>
-              <w:t>System routes YouTube/TikTok URLs to yt-dlp for fast, exact metadata extraction (no browser).</w:t>
+              <w:t>System routes YouTube URLs to yt-dlp for fast, exact metadata extraction (no browser). Routes TikTok and X (Twitter) URLs to Firefox + DOM extraction.</w:t>
             </w:r>
           </w:p>
         </w:tc>
@@ -12948,7 +13055,7 @@
           <w:color w:val="595959"/>
           <w:sz w:val="18"/>
         </w:rPr>
-        <w:t>— End of Document — Version 5.2 —</w:t>
+        <w:t>— End of Document — Version 5.5 —</w:t>
       </w:r>
     </w:p>
     <w:sectPr>

</xml_diff>